<commit_message>
Implement BAP v5 virtual mapping feasibility audit tool
- Introduced `feasibility_v5.py` to perform structural feasibility tests on BAP virtual chunks.
- Added support for two profiles: `ideal_powers_of_two` and `x86_4k_2m`.
- Implemented functions for block decomposition, virtual eligibility checks, and aligned covers.
- Included a self-test function to validate the correctness of the implementation.
- Created a CSV output file `feasibility_summary_v5.csv` to store audit results for various configurations.
</commit_message>
<xml_diff>
--- a/Binary Adaptive Paging.docx
+++ b/Binary Adaptive Paging.docx
@@ -93,18 +93,12 @@
     </w:p>
     <w:p>
       <w:r>
-        <w:t>The paper presents the BAP model, a correctness argument for the XOR/MSB lookup rule, and a simulation-based evaluation. The evaluation compares fixed paging, a simple huge-page baseline, idealized and alignment-constrained multi-size mappings, and two BAP variants: a limited version constrained to the same maximum chunk size as the multi-size baselines and an unbounded upper-bound version. Results show that BAP limited matches strong multi-size baselines under fair maximum-size constraints while substantially reducing mapping count compared with fixed paging. The simulator also shows that BAP is stable under region-start alignment in the region-relative model, while alignment-constrained multi-size mappings require additional entries for unaligned regions. Workload-aware results show that large chunks can cause high fault amplification under sparse access and COW-like writes, but adaptive splitting can reduce this amplification at the cost of additional mapping entries. Overall, BAP is best understood as a design-space exploration between fixed-size paging and large-page mechanisms, rather than as a full replacement for conventional paging.</w:t>
-      </w:r>
-    </w:p>
-    <w:p>
-      <w:r>
-        <w:rPr>
-          <w:b/>
-        </w:rPr>
-        <w:t xml:space="preserve">Keywords: </w:t>
-      </w:r>
-      <w:r>
-        <w:t>virtual memory, paging, huge pages, TLB reach, address translation, power-of-two decomposition, operating systems</w:t>
+        <w:t>The paper establishes the BAP logical region model and the XOR/MSB chunk-identification rule, then evaluates structural chunk counts, synthetic workload effects, and sensitivity to chunk-size and split thresholds. Under equal maximum logical chunk sizes, BAP limited matches the idealized multi-size baseline for aligned starts. Earlier alignment experiments suggested fewer region-relative chunks for unaligned starts, but these logical counts are not equivalent to hardware-native translation entries. A supplementary v5 virtual-alignment audit evaluates two explicit page-size profiles: a hypothetical profile supporting every power-of-two size through 512 base pages and a 4 KiB/2 MiB x86 leaf-page profile. For a 10,000-page region starting at virtual page 1, the 21 original BAP limited chunks are not directly eligible native leaves in either profile. Aligned retiling requires 30 leaves in the hypothetical profile and 802 in the 4 KiB/2 MiB profile. These are structural, virtual-alignment counts, not measurements of physical feasibility, TLB misses, or runtime performance. BAP therefore remains a logical organization and address-lookup proposal whose practical translation path must be specified and evaluated before claiming hardware-level benefits.</w:t>
+      </w:r>
+    </w:p>
+    <w:p>
+      <w:r>
+        <w:t>Keywords: virtual memory, binary region decomposition, XOR/MSB lookup, virtual alignment, translation feasibility, large pages, simulation</w:t>
       </w:r>
     </w:p>
     <w:p>
@@ -245,12 +239,12 @@
     </w:p>
     <w:p>
       <w:r>
-        <w:t>This paper explores a different point in the design space. Instead of using one fixed page size for all mappings or relying only on conventional huge-page promotion, Binary Adaptive Paging decomposes each virtual memory region into descending power-of-two chunks. A region whose size is 13 base pages is represented as 8 + 4 + 1 pages. The interesting part of the design is not simply the use of variable-size chunks, because variable-size mappings already exist. The main idea is the compact lookup rule: for an address offset a inside a region of size S, the containing logical chunk is identified by MSB(a XOR S).</w:t>
-      </w:r>
-    </w:p>
-    <w:p>
-      <w:r>
-        <w:t>The goal of this work is not to claim that BAP is ready for production kernels. The goal is to formulate the scheme precisely, prove the lookup rule, and evaluate its tradeoffs using a design-space simulator. The simulator is intentionally simple enough to be understandable, but it includes structural experiments, workload-aware fault amplification, permission-boundary stress, and sensitivity analysis.</w:t>
+        <w:t>This paper explores a different point in the design space. Binary Adaptive Paging (BAP) organizes each virtual memory region into descending power-of-two logical chunks. A region of 13 base pages is represented as 8 + 4 + 1 pages, and for an address offset a in a region of size S the containing logical chunk is identified by MSB(a XOR S). Variable-size mappings already exist: BAP's candidate contribution is a compact region-relative representation and lookup rule, not the invention of large pages. In particular, a logical BAP chunk is not automatically a hardware-supported page mapping or one TLB entry.</w:t>
+      </w:r>
+    </w:p>
+    <w:p>
+      <w:r>
+        <w:t>This work formulates the logical scheme, provides a correctness argument for its lookup rule, and uses exploratory simulations to evaluate mapping-count tradeoffs, synthetic whole-chunk activation, permission-boundary refinement, and parameter sensitivity. A separate v5 audit tests the virtual-alignment and native-page-size eligibility of BAP's proposed chunks. No operating-system implementation or physical-memory translation mechanism is claimed.</w:t>
       </w:r>
     </w:p>
     <w:p>
@@ -266,7 +260,7 @@
         <w:pStyle w:val="ListNumber"/>
       </w:pPr>
       <w:r>
-        <w:t>A region-based virtual memory mapping scheme based on descending power-of-two decomposition.</w:t>
+        <w:t>A region-relative logical chunk representation based on descending power-of-two decomposition.</w:t>
       </w:r>
     </w:p>
     <w:p>
@@ -282,7 +276,7 @@
         <w:pStyle w:val="ListNumber"/>
       </w:pPr>
       <w:r>
-        <w:t>A fair comparison between fixed pages, simple huge-page mappings, multi-size mappings, and limited/unbounded BAP variants.</w:t>
+        <w:t>A comparison of logical chunk counts for fixed, huge-page-style, idealized multi-size, aligned multi-size, and limited/unbounded BAP models under stated assumptions.</w:t>
       </w:r>
     </w:p>
     <w:p>
@@ -290,7 +284,7 @@
         <w:pStyle w:val="ListNumber"/>
       </w:pPr>
       <w:r>
-        <w:t>A workload-aware simulation showing the tradeoff between mapping-count reduction and fault amplification under sparse access, COW-like writes, and permission-boundary stress.</w:t>
+        <w:t>A workload-aware synthetic model of whole-chunk activation, split pressure, and permission-boundary refinement (not measured OS page faults).</w:t>
       </w:r>
     </w:p>
     <w:p>
@@ -298,7 +292,7 @@
         <w:pStyle w:val="ListNumber"/>
       </w:pPr>
       <w:r>
-        <w:t>A sensitivity analysis showing how maximum chunk size and split threshold affect mapping count, fault amplification, and adaptive split overhead.</w:t>
+        <w:t>A parameter sensitivity study and a v5 audit of virtual alignment and native leaf-page eligibility that identify conditions under which logical BAP chunks cannot be treated as conventional hardware translations.</w:t>
       </w:r>
     </w:p>
     <w:p>
@@ -380,7 +374,7 @@
     </w:p>
     <w:p>
       <w:r>
-        <w:t>The advantage of large pages is clear: fewer mappings and greater TLB reach. The disadvantage is that large mappings are less flexible. If only a few small parts of a large region are accessed, a large mapping can create page-fault amplification. If different subranges require different permissions, a large mapping must be split. These issues motivate an adaptive design rather than a purely large-page design.</w:t>
+        <w:t>Large pages can reduce translation-entry counts, but their feasibility is constrained by supported page sizes, alignment, backing, and protection requirements. Whether touching part of a larger range triggers whole-range allocation or loading is operating-system and policy dependent. Accordingly, the synthetic 'fault amplification' measure later in this paper is a modeled whole-chunk-activation ratio, not a universal prediction of hardware page faults.</w:t>
       </w:r>
     </w:p>
     <w:p>
@@ -489,7 +483,7 @@
     </w:p>
     <w:p>
       <w:r>
-        <w:t>The evaluation distinguishes two BAP variants. The unbounded variant uses the exact binary decomposition of the region size and allows chunks as large as the most significant power of two in S. This is a theoretical upper-bound design. The limited variant caps the maximum physical mapping size. In the experiments, the cap is commonly set to 512 base pages, corresponding to 2 MB if the base page is 4 KB. The limited variant is important because it enables fair comparison with multi-size baselines that use the same maximum mapping size.</w:t>
+        <w:t>The evaluation distinguishes two logical BAP variants. Unbounded BAP represents the region using the set-bit decomposition of S without an imposed maximum. Limited BAP divides any larger logical chunk into subchunks capped at 512 base pages in the main experiments. Although 512 base pages equals 2 MiB for a 4 KiB base page, these are logical region-relative chunks: the cap by itself does not establish native hardware support, virtual/physical alignment, or contiguity. The cap makes logical-size comparisons meaningful; hardware realizability is examined separately in Section 7.3.1.</w:t>
       </w:r>
     </w:p>
     <w:p>
@@ -575,7 +569,7 @@
           </w:tcPr>
           <w:p>
             <w:r>
-              <w:t>Caps chunks at a maximum size such as 512 base pages</w:t>
+              <w:t>Caps region-relative logical chunks, e.g., at 512 base pages; not automatically native leaves</w:t>
             </w:r>
           </w:p>
         </w:tc>
@@ -586,7 +580,7 @@
           </w:tcPr>
           <w:p>
             <w:r>
-              <w:t>Fair comparison with multi-size mappings</w:t>
+              <w:t>Size-capped logical comparison; virtual-alignment eligibility audited in v5</w:t>
             </w:r>
           </w:p>
         </w:tc>
@@ -614,7 +608,7 @@
           </w:tcPr>
           <w:p>
             <w:r>
-              <w:t>Allows chunks larger than conventional huge-page sizes</w:t>
+              <w:t>Allows logical chunks larger than the common 512-base-page comparison cap</w:t>
             </w:r>
           </w:p>
         </w:tc>
@@ -642,7 +636,7 @@
     </w:p>
     <w:p>
       <w:r>
-        <w:t>A large chunk is useful when the region is accessed densely and has uniform permissions. It is harmful when only a small subset is touched, or when copy-on-write, permission boundaries, or swapping require fine-grained control. Therefore, BAP should not be understood as a static large-chunk mapping scheme. A practical version requires split and merge policies. The simulator models split pressure by comparing pages touched by workloads with pages that would be loaded if the whole mapping were activated.</w:t>
+        <w:t>A large logical chunk may be economical for a densely accessed uniform region, but a practical mapping design must handle sparse access, copy-on-write, permission boundaries, and updates. The v3 simulator approximates a policy that loads or activates an entire touched chunk and then counts segments produced by a simplified split rule. These figures describe pressure under that policy assumption; they are not measurements of real kernel splitting or hardware page-fault behavior.</w:t>
       </w:r>
     </w:p>
     <w:p>
@@ -911,173 +905,38 @@
             <w:shd w:val="clear" w:color="auto" w:fill="F2F2F2"/>
           </w:tcPr>
           <w:p>
-            <w:pPr>
-              <w:jc w:val="left"/>
-            </w:pPr>
-            <w:r>
-              <w:rPr>
-                <w:rFonts w:eastAsia="Consolas"/>
-              </w:rPr>
-              <w:t>translate(A, region):</w:t>
-            </w:r>
-            <w:r>
+            <w:r>
+              <w:t>locate_logical_chunk(A, region, max_chunk):</w:t>
               <w:br/>
-            </w:r>
-            <w:r>
-              <w:rPr>
-                <w:rFonts w:eastAsia="Consolas"/>
-              </w:rPr>
-              <w:t xml:space="preserve">    B, S = region.base, region.size</w:t>
-            </w:r>
-            <w:r>
+              <w:t xml:space="preserve">    B, S = region.base, region.size    # all quantities in base-page units</w:t>
               <w:br/>
-            </w:r>
-            <w:r>
-              <w:rPr>
-                <w:rFonts w:eastAsia="Consolas"/>
-              </w:rPr>
-              <w:t xml:space="preserve">    if A &lt; B or A &gt;= B + S:</w:t>
-            </w:r>
-            <w:r>
+              <w:t xml:space="preserve">    if A &lt; B or A &gt;= B + S: raise RegionMiss</w:t>
               <w:br/>
-            </w:r>
-            <w:r>
-              <w:rPr>
-                <w:rFonts w:eastAsia="Consolas"/>
-              </w:rPr>
-              <w:t xml:space="preserve">        fault</w:t>
-            </w:r>
-            <w:r>
+              <w:t xml:space="preserve">    a = A - B</w:t>
               <w:br/>
-            </w:r>
-            <w:r>
+              <w:t xml:space="preserve">    k = MSB_position(a XOR S)</w:t>
               <w:br/>
-            </w:r>
-            <w:r>
-              <w:rPr>
-                <w:rFonts w:eastAsia="Consolas"/>
-              </w:rPr>
-              <w:t xml:space="preserve">    a = A - B</w:t>
-            </w:r>
-            <w:r>
+              <w:t xml:space="preserve">    logical_base = S &amp; ~((1 &lt;&lt; (k + 1)) - 1)</w:t>
               <w:br/>
-            </w:r>
-            <w:r>
-              <w:rPr>
-                <w:rFonts w:eastAsia="Consolas"/>
-              </w:rPr>
-              <w:t xml:space="preserve">    x = a XOR S</w:t>
-            </w:r>
-            <w:r>
+              <w:t xml:space="preserve">    logical_size = 1 &lt;&lt; k</w:t>
               <w:br/>
-            </w:r>
-            <w:r>
-              <w:rPr>
-                <w:rFonts w:eastAsia="Consolas"/>
-              </w:rPr>
-              <w:t xml:space="preserve">    k = MSB_position(x)</w:t>
-            </w:r>
-            <w:r>
+              <w:t xml:space="preserve">    if logical_size &lt;= max_chunk:</w:t>
               <w:br/>
-            </w:r>
-            <w:r>
+              <w:t xml:space="preserve">        chunk_base, chunk_size = logical_base, logical_size</w:t>
               <w:br/>
-            </w:r>
-            <w:r>
-              <w:rPr>
-                <w:rFonts w:eastAsia="Consolas"/>
-              </w:rPr>
-              <w:t xml:space="preserve">    logical_size = 1 &lt;&lt; k</w:t>
-            </w:r>
-            <w:r>
+              <w:t xml:space="preserve">    else:</w:t>
               <w:br/>
-            </w:r>
-            <w:r>
-              <w:rPr>
-                <w:rFonts w:eastAsia="Consolas"/>
-              </w:rPr>
-              <w:t xml:space="preserve">    logical_base = S &amp; ~((1 &lt;&lt; (k + 1)) - 1)</w:t>
-            </w:r>
-            <w:r>
+              <w:t xml:space="preserve">        sub_index = (a - logical_base) // max_chunk</w:t>
               <w:br/>
-            </w:r>
-            <w:r>
+              <w:t xml:space="preserve">        chunk_base = logical_base + sub_index * max_chunk</w:t>
               <w:br/>
-            </w:r>
-            <w:r>
-              <w:rPr>
-                <w:rFonts w:eastAsia="Consolas"/>
-              </w:rPr>
-              <w:t xml:space="preserve">    if logical_size &lt;= max_chunk:</w:t>
-            </w:r>
-            <w:r>
+              <w:t xml:space="preserve">        chunk_size = max_chunk</w:t>
               <w:br/>
-            </w:r>
-            <w:r>
-              <w:rPr>
-                <w:rFonts w:eastAsia="Consolas"/>
-              </w:rPr>
-              <w:t xml:space="preserve">        physical_mapping_base = logical_base</w:t>
-            </w:r>
-            <w:r>
+              <w:t xml:space="preserve">    return (chunk_base, chunk_size, a - chunk_base)</w:t>
               <w:br/>
-            </w:r>
-            <w:r>
-              <w:rPr>
-                <w:rFonts w:eastAsia="Consolas"/>
-              </w:rPr>
-              <w:t xml:space="preserve">        mapping_size = logical_size</w:t>
-            </w:r>
-            <w:r>
+              <w:t># This identifies a LOGICAL chunk only.</w:t>
               <w:br/>
-            </w:r>
-            <w:r>
-              <w:rPr>
-                <w:rFonts w:eastAsia="Consolas"/>
-              </w:rPr>
-              <w:t xml:space="preserve">    else:</w:t>
-            </w:r>
-            <w:r>
-              <w:br/>
-            </w:r>
-            <w:r>
-              <w:rPr>
-                <w:rFonts w:eastAsia="Consolas"/>
-              </w:rPr>
-              <w:t xml:space="preserve">        sub_index = (a - logical_base) // max_chunk</w:t>
-            </w:r>
-            <w:r>
-              <w:br/>
-            </w:r>
-            <w:r>
-              <w:rPr>
-                <w:rFonts w:eastAsia="Consolas"/>
-              </w:rPr>
-              <w:t xml:space="preserve">        physical_mapping_base = logical_base + sub_index * max_chunk</w:t>
-            </w:r>
-            <w:r>
-              <w:br/>
-            </w:r>
-            <w:r>
-              <w:rPr>
-                <w:rFonts w:eastAsia="Consolas"/>
-              </w:rPr>
-              <w:t xml:space="preserve">        mapping_size = max_chunk</w:t>
-            </w:r>
-            <w:r>
-              <w:br/>
-            </w:r>
-            <w:r>
-              <w:br/>
-            </w:r>
-            <w:r>
-              <w:rPr>
-                <w:rFonts w:eastAsia="Consolas"/>
-              </w:rPr>
-              <w:t xml:space="preserve">    return mapping_table[physical_mapping_base] + (a - physical_mapping_base)</w:t>
-            </w:r>
-            <w:r>
-              <w:br/>
+              <w:t># Physical frame lookup, eligibility, permissions and TLB fill are unspecified.</w:t>
             </w:r>
           </w:p>
         </w:tc>
@@ -1085,6 +944,12 @@
     </w:tbl>
     <w:p/>
     <w:p>
+      <w:pPr/>
+      <w:r>
+        <w:t>The algorithm above locates a logical chunk and an intra-chunk offset; it is not a complete virtual-to-physical translation algorithm. Such a translation additionally needs a region-discovery mechanism, a mapping from each eligible chunk or base page to physical backing, appropriate permissions, and a defined TLB/page-walker interface. Section 7.3.1 tests the necessary virtual prerequisites under selected page-size profiles, while physical prerequisites remain open.</w:t>
+      </w:r>
+    </w:p>
+    <w:p>
       <w:pPr>
         <w:pStyle w:val="Heading1"/>
       </w:pPr>
@@ -1147,7 +1012,7 @@
     </w:p>
     <w:p>
       <w:r>
-        <w:t>The evaluation is a design-space simulation, not a kernel implementation. Its goal is to compare mapping-count behavior, estimated TLB reach, alignment sensitivity, page-fault amplification, permission-boundary refinement, and sensitivity to chunk-size and split-policy parameters. The simulator works in base-page units and uses synthetic memory regions and workloads.</w:t>
+        <w:t>The evaluation consists of two distinct types of evidence. Simulators v2–v4 estimate logical region chunk counts, an optimistic TLB-reach proxy based on choosing the largest chunks, and synthetic whole-chunk activation and splitting behavior. Simulator v5 checks virtual alignment and native page-size eligibility of the same logical chunks for two explicit hypothetical/conventional leaf-size profiles. Neither class of experiment measures real TLB hit rates, page-walk latency, physical contiguity, or end-to-end program performance.</w:t>
       </w:r>
     </w:p>
     <w:p>
@@ -1522,7 +1387,7 @@
           </w:tcPr>
           <w:p>
             <w:r>
-              <w:t>mapping_count</w:t>
+              <w:t>logical_mapping_count</w:t>
             </w:r>
           </w:p>
         </w:tc>
@@ -1533,7 +1398,7 @@
           </w:tcPr>
           <w:p>
             <w:r>
-              <w:t>Number of mapping entries required for a region</w:t>
+              <w:t>Number of region-relative logical chunks (not necessarily hardware leaf entries)</w:t>
             </w:r>
           </w:p>
         </w:tc>
@@ -1561,7 +1426,7 @@
           </w:tcPr>
           <w:p>
             <w:r>
-              <w:t>Total base pages covered by a fixed number of largest mappings</w:t>
+              <w:t>Optimistic largest-chunk coverage proxy; not simulated TLB hit rate</w:t>
             </w:r>
           </w:p>
         </w:tc>
@@ -1589,7 +1454,7 @@
           </w:tcPr>
           <w:p>
             <w:r>
-              <w:t>Extra mappings required when alignment constraints apply</w:t>
+              <w:t>Difference in logical counts when absolute virtual alignment is imposed</w:t>
             </w:r>
           </w:p>
         </w:tc>
@@ -1617,7 +1482,7 @@
           </w:tcPr>
           <w:p>
             <w:r>
-              <w:t>Loaded pages divided by touched pages</w:t>
+              <w:t>Modeled loaded/touched ratio under whole-chunk-activation assumption</w:t>
             </w:r>
           </w:p>
         </w:tc>
@@ -1944,7 +1809,7 @@
     </w:p>
     <w:p>
       <w:r>
-        <w:t>Unless stated otherwise, the base page is one simulation unit, the largest conventional page/chunk size is 512 base pages, and the estimated TLB reach uses 64 entries. The major structural experiments use region sizes from 1 to 10,000 base pages. Workload-aware experiments focus on region sizes 1,000, 4,096, and 10,000 pages. Sensitivity analysis varies maximum BAP chunk size over 128, 256, 512, 1,024, and 2,048 base pages, split-density threshold over 0.05, 0.10, 0.25, and 0.50, and random seeds over five runs.</w:t>
+        <w:t>Unless stated otherwise, one base page is the simulation unit and the principal cap is 512 base pages. The v2–v4 experiments use a 64-slot optimistic largest-chunk coverage proxy (not a TLB simulator); structural region sizes include 1–10,000 pages, and workload-aware runs focus on 1,000, 4,096, and 10,000 pages. Sensitivity runs vary BAP's cap among 128, 256, 512, 1,024, and 2,048 pages and the density threshold among 0.05, 0.10, 0.25, and 0.50, over five seeds. In v5, the cap is 512 pages, region sizes are 13, 19, 513, 1,000, 4,096, and 10,000, and starts are 0, 1, 7, 13, 64, and 255, for two leaf-size profiles (72 cases). v5 tests only virtual alignment and page-size membership, not physical backing or actual TLB behavior.</w:t>
       </w:r>
     </w:p>
     <w:p>
@@ -1966,7 +1831,7 @@
     </w:p>
     <w:p>
       <w:r>
-        <w:t>The first result compares the number of mapping entries required by each scheme when the region starts at page 0. This is the fair setting because BAP limited and the multi-size baselines use the same maximum mapping size.</w:t>
+        <w:t>The original structural experiment compares logical chunk counts when regions start at page 0. The BAP limited and idealized multi-size strategies share the same maximum logical block size. This controls the logical decomposition comparison, but does not establish equivalent native page-table support or TLB representation.</w:t>
       </w:r>
     </w:p>
     <w:p>
@@ -2664,13 +2529,7 @@
         <w:pStyle w:val="SmallNote"/>
       </w:pPr>
       <w:r>
-        <w:rPr>
-          <w:b/>
-        </w:rPr>
-        <w:t xml:space="preserve">Note. </w:t>
-      </w:r>
-      <w:r>
-        <w:t>BAP limited is capped at 512 base pages, matching the maximum page size of the multi-size baselines.</w:t>
+        <w:t>Note. Counts are logical chunk counts; a 512-page cap alone does not imply that every resulting block is a native 2 MiB translation.</w:t>
       </w:r>
     </w:p>
     <w:p/>
@@ -2727,11 +2586,7 @@
     <w:p/>
     <w:p>
       <w:r>
-        <w:t xml:space="preserve">The fair comparison shows that BAP limited substantially reduces mapping count compared with fixed paging. For a 10,000-page region, fixed paging requires 10,000 mappings while BAP limited requires 21. However, under the same maximum chunk-size constraint, BAP limited matches rather than exceeds the strong multi-size baselines. </w:t>
-      </w:r>
-      <w:r>
-        <w:lastRenderedPageBreak/>
-        <w:t>This is an important result because it prevents overclaiming: BAP is not simply better than all multi-size mapping schemes in raw mapping count. Its distinctive contribution is the region-relative binary decomposition and lookup rule.</w:t>
+        <w:t>In the logical decomposition model, a 10,000-page region uses 10,000 fixed-size chunks or 21 BAP limited chunks. For aligned starts and the same maximum chunk size, BAP limited matches the strong idealized multi-size models rather than improving their count. These counts should not be interpreted as actual page-table entries or hardware TLB entries without an implementation model and page-size/alignment eligibility checks.</w:t>
       </w:r>
     </w:p>
     <w:p>
@@ -3348,13 +3203,7 @@
         <w:pStyle w:val="SmallNote"/>
       </w:pPr>
       <w:r>
-        <w:rPr>
-          <w:b/>
-        </w:rPr>
-        <w:t xml:space="preserve">Note. </w:t>
-      </w:r>
-      <w:r>
-        <w:t>The unbounded variant permits large logical chunks beyond the conventional 512-page cap. It should be interpreted as a theoretical upper bound.</w:t>
+        <w:t>Note. Unbounded BAP is a logical decomposition upper bound, not a claim of support for an arbitrary hardware page size.</w:t>
       </w:r>
     </w:p>
     <w:p/>
@@ -3411,11 +3260,7 @@
     <w:p/>
     <w:p>
       <w:r>
-        <w:t xml:space="preserve">The unbounded variant shows the potential benefit of allowing larger region-relative chunks. For 4,096 pages, unbounded BAP needs one mapping instead of eight capped mappings. For 10,000 pages, it needs five mappings </w:t>
-      </w:r>
-      <w:r>
-        <w:lastRenderedPageBreak/>
-        <w:t>because 10,000 = 8,192 + 1,024 + 512 + 256 + 16. This result is useful as an upper bound, but it assumes support for mapping sizes larger than the conventional 2 MB huge page when the base page is 4 KB.</w:t>
+        <w:t>Unbounded BAP decomposes 4,096 pages into one logical chunk and 10,000 pages into five logical chunks (8,192 + 1,024 + 512 + 256 + 16). This is an upper bound on logical representation size only; it does not assume existing hardware can implement each chunk as an independent translation leaf.</w:t>
       </w:r>
     </w:p>
     <w:p>
@@ -3431,7 +3276,7 @@
         <w:pStyle w:val="Caption"/>
       </w:pPr>
       <w:r>
-        <w:t>Table 7. Alignment sensitivity for a 10,000-page region.</w:t>
+        <w:t>Table 7. Logical chunk counts under region-start offsets (abstract v2 model).</w:t>
       </w:r>
     </w:p>
     <w:tbl>
@@ -3960,13 +3805,7 @@
         <w:pStyle w:val="SmallNote"/>
       </w:pPr>
       <w:r>
-        <w:rPr>
-          <w:b/>
-        </w:rPr>
-        <w:t xml:space="preserve">Note. </w:t>
-      </w:r>
-      <w:r>
-        <w:t>Multi-size aligned mappings require extra entries when the region start is not naturally aligned. BAP is region-relative in the simulator, so its mapping count remains stable.</w:t>
+        <w:t>Note. BAP chunks are relative to the region base and are NOT necessarily legal native hardware page mappings. Section 7.3.1 audits the prerequisite alignment and size support.</w:t>
       </w:r>
     </w:p>
     <w:p/>
@@ -4017,13 +3856,679 @@
         <w:pStyle w:val="Caption"/>
       </w:pPr>
       <w:r>
-        <w:t>Figure 3. Alignment effect for a 10,000-page region.</w:t>
+        <w:t>Figure 3. Logical region-relative chunk counts versus aligned multi-size counts (not TLB results).</w:t>
       </w:r>
     </w:p>
     <w:p/>
     <w:p>
       <w:r>
-        <w:t>The alignment experiment shows a useful property of the region-relative model. When the 10,000-page region starts at page 1, 7, or 13, the alignment-constrained multi-size baseline increases from 21 to 30 mappings. BAP limited remains at 21 and unbounded BAP remains at 5. This result depends on the assumption that BAP mappings can be interpreted relative to the region base or otherwise supported by suitable translation metadata. It is therefore a design advantage in the model, not yet a measured property of existing hardware.</w:t>
+        <w:t>The original v2 model counts 21 BAP limited logical chunks for a 10,000-page region regardless of whether the region starts at page 0, 1, 7, or 13; the alignment-constrained multi-size model counts 21 for start 0 and 30 for starts 1, 7, or 13. This demonstrates an assumption of the region-relative representation, not 21 immediately realizable hardware translation leaves. A native large-page entry requires an allowed size and virtual alignment, with further physical and protection constraints. The feasibility check below tests these necessary virtual conditions rather than assuming them away.</w:t>
+      </w:r>
+    </w:p>
+    <w:p>
+      <w:pPr>
+        <w:pStyle w:val="Heading3"/>
+      </w:pPr>
+      <w:r>
+        <w:t>7.3.1 Virtual-alignment and page-size feasibility (v5)</w:t>
+      </w:r>
+    </w:p>
+    <w:p>
+      <w:pPr/>
+      <w:r>
+        <w:t>The v5 structural audit examines whether each original BAP limited block has an allowed native leaf size and begins at an absolutely aligned virtual address. It reports (i) original logical blocks, (ii) blocks individually eligible for a native leaf, (iii) legal aligned leaves obtained by splitting within original BAP block boundaries, and (iv) leaves obtained by realigning/retiling the entire region. Two explicit profiles are considered: 'ideal powers of two' (every native size 1, 2, 4, ..., 512 base pages, hypothetical) and 'x86 4 KiB/2 MiB' (native leaf sizes 1 and 512 base pages only; 1 GiB leaves are excluded by this 512-page cap). All counts assume adequate physical backing and do not model TLB operation.</w:t>
+      </w:r>
+    </w:p>
+    <w:p>
+      <w:pPr>
+        <w:pStyle w:val="Caption"/>
+      </w:pPr>
+      <w:r>
+        <w:t>Table 7a. Virtual eligibility and aligned retiling, S = 10,000 base pages (v5).</w:t>
+      </w:r>
+    </w:p>
+    <w:tbl>
+      <w:tblPr>
+        <w:tblStyle w:val="TableGrid"/>
+        <w:tblW w:type="auto" w:w="0"/>
+        <w:jc w:val="center"/>
+        <w:tblLook w:firstColumn="1" w:firstRow="1" w:lastColumn="0" w:lastRow="0" w:noHBand="0" w:noVBand="1" w:val="04A0"/>
+      </w:tblPr>
+      <w:tblGrid>
+        <w:gridCol w:w="1680"/>
+        <w:gridCol w:w="1680"/>
+        <w:gridCol w:w="1680"/>
+        <w:gridCol w:w="1680"/>
+        <w:gridCol w:w="1680"/>
+        <w:gridCol w:w="1680"/>
+      </w:tblGrid>
+      <w:tr>
+        <w:tc>
+          <w:tcPr>
+            <w:tcW w:type="dxa" w:w="1680"/>
+            <w:vAlign w:val="center"/>
+          </w:tcPr>
+          <w:p>
+            <w:r>
+              <w:rPr>
+                <w:b/>
+                <w:color w:val="1A415D"/>
+                <w:sz w:val="16"/>
+              </w:rPr>
+              <w:t>Profile</w:t>
+            </w:r>
+          </w:p>
+        </w:tc>
+        <w:tc>
+          <w:tcPr>
+            <w:tcW w:type="dxa" w:w="1680"/>
+            <w:vAlign w:val="center"/>
+          </w:tcPr>
+          <w:p>
+            <w:r>
+              <w:rPr>
+                <w:b/>
+                <w:color w:val="1A415D"/>
+                <w:sz w:val="16"/>
+              </w:rPr>
+              <w:t>Start page</w:t>
+            </w:r>
+          </w:p>
+        </w:tc>
+        <w:tc>
+          <w:tcPr>
+            <w:tcW w:type="dxa" w:w="1680"/>
+            <w:vAlign w:val="center"/>
+          </w:tcPr>
+          <w:p>
+            <w:r>
+              <w:rPr>
+                <w:b/>
+                <w:color w:val="1A415D"/>
+                <w:sz w:val="16"/>
+              </w:rPr>
+              <w:t>BAP logical chunks</w:t>
+            </w:r>
+          </w:p>
+        </w:tc>
+        <w:tc>
+          <w:tcPr>
+            <w:tcW w:type="dxa" w:w="1680"/>
+            <w:vAlign w:val="center"/>
+          </w:tcPr>
+          <w:p>
+            <w:r>
+              <w:rPr>
+                <w:b/>
+                <w:color w:val="1A415D"/>
+                <w:sz w:val="16"/>
+              </w:rPr>
+              <w:t>Directly eligible chunks</w:t>
+            </w:r>
+          </w:p>
+        </w:tc>
+        <w:tc>
+          <w:tcPr>
+            <w:tcW w:type="dxa" w:w="1680"/>
+            <w:vAlign w:val="center"/>
+          </w:tcPr>
+          <w:p>
+            <w:r>
+              <w:rPr>
+                <w:b/>
+                <w:color w:val="1A415D"/>
+                <w:sz w:val="16"/>
+              </w:rPr>
+              <w:t>Split only: legal leaves</w:t>
+            </w:r>
+          </w:p>
+        </w:tc>
+        <w:tc>
+          <w:tcPr>
+            <w:tcW w:type="dxa" w:w="1680"/>
+            <w:vAlign w:val="center"/>
+          </w:tcPr>
+          <w:p>
+            <w:r>
+              <w:rPr>
+                <w:b/>
+                <w:color w:val="1A415D"/>
+                <w:sz w:val="16"/>
+              </w:rPr>
+              <w:t>Retile: aligned leaves</w:t>
+            </w:r>
+          </w:p>
+        </w:tc>
+      </w:tr>
+      <w:tr>
+        <w:tc>
+          <w:tcPr>
+            <w:tcW w:type="dxa" w:w="1680"/>
+            <w:vAlign w:val="center"/>
+          </w:tcPr>
+          <w:p>
+            <w:r>
+              <w:rPr>
+                <w:sz w:val="16"/>
+              </w:rPr>
+              <w:t>Ideal powers of two</w:t>
+            </w:r>
+          </w:p>
+        </w:tc>
+        <w:tc>
+          <w:tcPr>
+            <w:tcW w:type="dxa" w:w="1680"/>
+            <w:vAlign w:val="center"/>
+          </w:tcPr>
+          <w:p>
+            <w:r>
+              <w:rPr>
+                <w:sz w:val="16"/>
+              </w:rPr>
+              <w:t>0</w:t>
+            </w:r>
+          </w:p>
+        </w:tc>
+        <w:tc>
+          <w:tcPr>
+            <w:tcW w:type="dxa" w:w="1680"/>
+            <w:vAlign w:val="center"/>
+          </w:tcPr>
+          <w:p>
+            <w:r>
+              <w:rPr>
+                <w:sz w:val="16"/>
+              </w:rPr>
+              <w:t>21</w:t>
+            </w:r>
+          </w:p>
+        </w:tc>
+        <w:tc>
+          <w:tcPr>
+            <w:tcW w:type="dxa" w:w="1680"/>
+            <w:vAlign w:val="center"/>
+          </w:tcPr>
+          <w:p>
+            <w:r>
+              <w:rPr>
+                <w:sz w:val="16"/>
+              </w:rPr>
+              <w:t>21</w:t>
+            </w:r>
+          </w:p>
+        </w:tc>
+        <w:tc>
+          <w:tcPr>
+            <w:tcW w:type="dxa" w:w="1680"/>
+            <w:vAlign w:val="center"/>
+          </w:tcPr>
+          <w:p>
+            <w:r>
+              <w:rPr>
+                <w:sz w:val="16"/>
+              </w:rPr>
+              <w:t>21</w:t>
+            </w:r>
+          </w:p>
+        </w:tc>
+        <w:tc>
+          <w:tcPr>
+            <w:tcW w:type="dxa" w:w="1680"/>
+            <w:vAlign w:val="center"/>
+          </w:tcPr>
+          <w:p>
+            <w:r>
+              <w:rPr>
+                <w:sz w:val="16"/>
+              </w:rPr>
+              <w:t>21</w:t>
+            </w:r>
+          </w:p>
+        </w:tc>
+      </w:tr>
+      <w:tr>
+        <w:tc>
+          <w:tcPr>
+            <w:tcW w:type="dxa" w:w="1680"/>
+            <w:vAlign w:val="center"/>
+          </w:tcPr>
+          <w:p>
+            <w:r>
+              <w:rPr>
+                <w:sz w:val="16"/>
+              </w:rPr>
+              <w:t>Ideal powers of two</w:t>
+            </w:r>
+          </w:p>
+        </w:tc>
+        <w:tc>
+          <w:tcPr>
+            <w:tcW w:type="dxa" w:w="1680"/>
+            <w:vAlign w:val="center"/>
+          </w:tcPr>
+          <w:p>
+            <w:r>
+              <w:rPr>
+                <w:sz w:val="16"/>
+              </w:rPr>
+              <w:t>1</w:t>
+            </w:r>
+          </w:p>
+        </w:tc>
+        <w:tc>
+          <w:tcPr>
+            <w:tcW w:type="dxa" w:w="1680"/>
+            <w:vAlign w:val="center"/>
+          </w:tcPr>
+          <w:p>
+            <w:r>
+              <w:rPr>
+                <w:sz w:val="16"/>
+              </w:rPr>
+              <w:t>21</w:t>
+            </w:r>
+          </w:p>
+        </w:tc>
+        <w:tc>
+          <w:tcPr>
+            <w:tcW w:type="dxa" w:w="1680"/>
+            <w:vAlign w:val="center"/>
+          </w:tcPr>
+          <w:p>
+            <w:r>
+              <w:rPr>
+                <w:sz w:val="16"/>
+              </w:rPr>
+              <w:t>0</w:t>
+            </w:r>
+          </w:p>
+        </w:tc>
+        <w:tc>
+          <w:tcPr>
+            <w:tcW w:type="dxa" w:w="1680"/>
+            <w:vAlign w:val="center"/>
+          </w:tcPr>
+          <w:p>
+            <w:r>
+              <w:rPr>
+                <w:sz w:val="16"/>
+              </w:rPr>
+              <w:t>204</w:t>
+            </w:r>
+          </w:p>
+        </w:tc>
+        <w:tc>
+          <w:tcPr>
+            <w:tcW w:type="dxa" w:w="1680"/>
+            <w:vAlign w:val="center"/>
+          </w:tcPr>
+          <w:p>
+            <w:r>
+              <w:rPr>
+                <w:sz w:val="16"/>
+              </w:rPr>
+              <w:t>30</w:t>
+            </w:r>
+          </w:p>
+        </w:tc>
+      </w:tr>
+      <w:tr>
+        <w:tc>
+          <w:tcPr>
+            <w:tcW w:type="dxa" w:w="1680"/>
+            <w:vAlign w:val="center"/>
+          </w:tcPr>
+          <w:p>
+            <w:r>
+              <w:rPr>
+                <w:sz w:val="16"/>
+              </w:rPr>
+              <w:t>Ideal powers of two</w:t>
+            </w:r>
+          </w:p>
+        </w:tc>
+        <w:tc>
+          <w:tcPr>
+            <w:tcW w:type="dxa" w:w="1680"/>
+            <w:vAlign w:val="center"/>
+          </w:tcPr>
+          <w:p>
+            <w:r>
+              <w:rPr>
+                <w:sz w:val="16"/>
+              </w:rPr>
+              <w:t>64</w:t>
+            </w:r>
+          </w:p>
+        </w:tc>
+        <w:tc>
+          <w:tcPr>
+            <w:tcW w:type="dxa" w:w="1680"/>
+            <w:vAlign w:val="center"/>
+          </w:tcPr>
+          <w:p>
+            <w:r>
+              <w:rPr>
+                <w:sz w:val="16"/>
+              </w:rPr>
+              <w:t>21</w:t>
+            </w:r>
+          </w:p>
+        </w:tc>
+        <w:tc>
+          <w:tcPr>
+            <w:tcW w:type="dxa" w:w="1680"/>
+            <w:vAlign w:val="center"/>
+          </w:tcPr>
+          <w:p>
+            <w:r>
+              <w:rPr>
+                <w:sz w:val="16"/>
+              </w:rPr>
+              <w:t>1</w:t>
+            </w:r>
+          </w:p>
+        </w:tc>
+        <w:tc>
+          <w:tcPr>
+            <w:tcW w:type="dxa" w:w="1680"/>
+            <w:vAlign w:val="center"/>
+          </w:tcPr>
+          <w:p>
+            <w:r>
+              <w:rPr>
+                <w:sz w:val="16"/>
+              </w:rPr>
+              <w:t>80</w:t>
+            </w:r>
+          </w:p>
+        </w:tc>
+        <w:tc>
+          <w:tcPr>
+            <w:tcW w:type="dxa" w:w="1680"/>
+            <w:vAlign w:val="center"/>
+          </w:tcPr>
+          <w:p>
+            <w:r>
+              <w:rPr>
+                <w:sz w:val="16"/>
+              </w:rPr>
+              <w:t>24</w:t>
+            </w:r>
+          </w:p>
+        </w:tc>
+      </w:tr>
+      <w:tr>
+        <w:tc>
+          <w:tcPr>
+            <w:tcW w:type="dxa" w:w="1680"/>
+            <w:vAlign w:val="center"/>
+          </w:tcPr>
+          <w:p>
+            <w:r>
+              <w:rPr>
+                <w:sz w:val="16"/>
+              </w:rPr>
+              <w:t>x86 4 KiB/2 MiB</w:t>
+            </w:r>
+          </w:p>
+        </w:tc>
+        <w:tc>
+          <w:tcPr>
+            <w:tcW w:type="dxa" w:w="1680"/>
+            <w:vAlign w:val="center"/>
+          </w:tcPr>
+          <w:p>
+            <w:r>
+              <w:rPr>
+                <w:sz w:val="16"/>
+              </w:rPr>
+              <w:t>0</w:t>
+            </w:r>
+          </w:p>
+        </w:tc>
+        <w:tc>
+          <w:tcPr>
+            <w:tcW w:type="dxa" w:w="1680"/>
+            <w:vAlign w:val="center"/>
+          </w:tcPr>
+          <w:p>
+            <w:r>
+              <w:rPr>
+                <w:sz w:val="16"/>
+              </w:rPr>
+              <w:t>21</w:t>
+            </w:r>
+          </w:p>
+        </w:tc>
+        <w:tc>
+          <w:tcPr>
+            <w:tcW w:type="dxa" w:w="1680"/>
+            <w:vAlign w:val="center"/>
+          </w:tcPr>
+          <w:p>
+            <w:r>
+              <w:rPr>
+                <w:sz w:val="16"/>
+              </w:rPr>
+              <w:t>19</w:t>
+            </w:r>
+          </w:p>
+        </w:tc>
+        <w:tc>
+          <w:tcPr>
+            <w:tcW w:type="dxa" w:w="1680"/>
+            <w:vAlign w:val="center"/>
+          </w:tcPr>
+          <w:p>
+            <w:r>
+              <w:rPr>
+                <w:sz w:val="16"/>
+              </w:rPr>
+              <w:t>291</w:t>
+            </w:r>
+          </w:p>
+        </w:tc>
+        <w:tc>
+          <w:tcPr>
+            <w:tcW w:type="dxa" w:w="1680"/>
+            <w:vAlign w:val="center"/>
+          </w:tcPr>
+          <w:p>
+            <w:r>
+              <w:rPr>
+                <w:sz w:val="16"/>
+              </w:rPr>
+              <w:t>291</w:t>
+            </w:r>
+          </w:p>
+        </w:tc>
+      </w:tr>
+      <w:tr>
+        <w:tc>
+          <w:tcPr>
+            <w:tcW w:type="dxa" w:w="1680"/>
+            <w:vAlign w:val="center"/>
+          </w:tcPr>
+          <w:p>
+            <w:r>
+              <w:rPr>
+                <w:sz w:val="16"/>
+              </w:rPr>
+              <w:t>x86 4 KiB/2 MiB</w:t>
+            </w:r>
+          </w:p>
+        </w:tc>
+        <w:tc>
+          <w:tcPr>
+            <w:tcW w:type="dxa" w:w="1680"/>
+            <w:vAlign w:val="center"/>
+          </w:tcPr>
+          <w:p>
+            <w:r>
+              <w:rPr>
+                <w:sz w:val="16"/>
+              </w:rPr>
+              <w:t>1</w:t>
+            </w:r>
+          </w:p>
+        </w:tc>
+        <w:tc>
+          <w:tcPr>
+            <w:tcW w:type="dxa" w:w="1680"/>
+            <w:vAlign w:val="center"/>
+          </w:tcPr>
+          <w:p>
+            <w:r>
+              <w:rPr>
+                <w:sz w:val="16"/>
+              </w:rPr>
+              <w:t>21</w:t>
+            </w:r>
+          </w:p>
+        </w:tc>
+        <w:tc>
+          <w:tcPr>
+            <w:tcW w:type="dxa" w:w="1680"/>
+            <w:vAlign w:val="center"/>
+          </w:tcPr>
+          <w:p>
+            <w:r>
+              <w:rPr>
+                <w:sz w:val="16"/>
+              </w:rPr>
+              <w:t>0</w:t>
+            </w:r>
+          </w:p>
+        </w:tc>
+        <w:tc>
+          <w:tcPr>
+            <w:tcW w:type="dxa" w:w="1680"/>
+            <w:vAlign w:val="center"/>
+          </w:tcPr>
+          <w:p>
+            <w:r>
+              <w:rPr>
+                <w:sz w:val="16"/>
+              </w:rPr>
+              <w:t>10000</w:t>
+            </w:r>
+          </w:p>
+        </w:tc>
+        <w:tc>
+          <w:tcPr>
+            <w:tcW w:type="dxa" w:w="1680"/>
+            <w:vAlign w:val="center"/>
+          </w:tcPr>
+          <w:p>
+            <w:r>
+              <w:rPr>
+                <w:sz w:val="16"/>
+              </w:rPr>
+              <w:t>802</w:t>
+            </w:r>
+          </w:p>
+        </w:tc>
+      </w:tr>
+      <w:tr>
+        <w:tc>
+          <w:tcPr>
+            <w:tcW w:type="dxa" w:w="1680"/>
+            <w:vAlign w:val="center"/>
+          </w:tcPr>
+          <w:p>
+            <w:r>
+              <w:rPr>
+                <w:sz w:val="16"/>
+              </w:rPr>
+              <w:t>x86 4 KiB/2 MiB</w:t>
+            </w:r>
+          </w:p>
+        </w:tc>
+        <w:tc>
+          <w:tcPr>
+            <w:tcW w:type="dxa" w:w="1680"/>
+            <w:vAlign w:val="center"/>
+          </w:tcPr>
+          <w:p>
+            <w:r>
+              <w:rPr>
+                <w:sz w:val="16"/>
+              </w:rPr>
+              <w:t>64</w:t>
+            </w:r>
+          </w:p>
+        </w:tc>
+        <w:tc>
+          <w:tcPr>
+            <w:tcW w:type="dxa" w:w="1680"/>
+            <w:vAlign w:val="center"/>
+          </w:tcPr>
+          <w:p>
+            <w:r>
+              <w:rPr>
+                <w:sz w:val="16"/>
+              </w:rPr>
+              <w:t>21</w:t>
+            </w:r>
+          </w:p>
+        </w:tc>
+        <w:tc>
+          <w:tcPr>
+            <w:tcW w:type="dxa" w:w="1680"/>
+            <w:vAlign w:val="center"/>
+          </w:tcPr>
+          <w:p>
+            <w:r>
+              <w:rPr>
+                <w:sz w:val="16"/>
+              </w:rPr>
+              <w:t>0</w:t>
+            </w:r>
+          </w:p>
+        </w:tc>
+        <w:tc>
+          <w:tcPr>
+            <w:tcW w:type="dxa" w:w="1680"/>
+            <w:vAlign w:val="center"/>
+          </w:tcPr>
+          <w:p>
+            <w:r>
+              <w:rPr>
+                <w:sz w:val="16"/>
+              </w:rPr>
+              <w:t>10000</w:t>
+            </w:r>
+          </w:p>
+        </w:tc>
+        <w:tc>
+          <w:tcPr>
+            <w:tcW w:type="dxa" w:w="1680"/>
+            <w:vAlign w:val="center"/>
+          </w:tcPr>
+          <w:p>
+            <w:r>
+              <w:rPr>
+                <w:sz w:val="16"/>
+              </w:rPr>
+              <w:t>802</w:t>
+            </w:r>
+          </w:p>
+        </w:tc>
+      </w:tr>
+    </w:tbl>
+    <w:p>
+      <w:pPr>
+        <w:pStyle w:val="SmallNote"/>
+      </w:pPr>
+      <w:r>
+        <w:t>Note. Direct eligibility tests only allowed size and virtual alignment, not physical feasibility. Split-only keeps BAP boundaries and is not optimized. Retiling may change them. The all-powers-of-two profile is hypothetical.</w:t>
+      </w:r>
+    </w:p>
+    <w:p>
+      <w:pPr/>
+      <w:r>
+        <w:t>Interpretation. The apparent 21-versus-30 advantage in Table 7 is a logical representation comparison, not a native hardware paging advantage. Under the hypothetical all-powers-of-two profile, legal retiling at start page 1 needs the same 30 aligned leaves as the aligned multi-size baseline. Under the limited x86 4 KiB/2 MiB profile, it needs 802 legal leaves; the original 21 BAP chunks cannot serve as native page-table leaves. These findings do not rule out a newly designed region-relative translation mechanism, but such a mechanism must specify its region lookup, physical mapping, metadata costs, protection semantics, and TLB interface. No end-to-end speedup is implied.</w:t>
       </w:r>
     </w:p>
     <w:p>
@@ -4037,7 +4542,7 @@
     </w:p>
     <w:p>
       <w:r>
-        <w:t>The workload-aware simulation shows that reducing mappings is not enough. Large mappings can activate many pages that are not actually touched. The simulator measures this using fault amplification, defined as loaded pages divided by touched pages. Dense sequential access is omitted from the compact table because all evaluated schemes load exactly the touched region and therefore have amplification 1.0.</w:t>
+        <w:t>The workload-aware v3 simulation models a deliberate whole-chunk-activation rule: if a chunk is touched, all base pages in that chunk are counted as loaded until a split rule is applied. The ratio (modeled loaded pages)/(unique touched pages) is labeled 'fault amplification' in the original plots. It is not a measured OS page-fault rate, nor a necessary consequence of an abstract translation chunk. In this synthetic model, dense access gives a ratio of 1.0.</w:t>
       </w:r>
     </w:p>
     <w:p>
@@ -5018,13 +5523,7 @@
         <w:pStyle w:val="SmallNote"/>
       </w:pPr>
       <w:r>
-        <w:rPr>
-          <w:b/>
-        </w:rPr>
-        <w:t xml:space="preserve">Note. </w:t>
-      </w:r>
-      <w:r>
-        <w:t>The table compares fixed paging with limited and unbounded BAP. Amplification after split is optimistic because the simulator does not model runtime split cost.</w:t>
+        <w:t>Note. All loaded-page/amplification results are from the synthetic whole-chunk-activation assumption; split costs, actual allocation behavior, and TLB invalidations are not modeled.</w:t>
       </w:r>
     </w:p>
     <w:p/>
@@ -5133,7 +5632,7 @@
     <w:p/>
     <w:p>
       <w:r>
-        <w:t>For sparse random access, only 200 pages are touched in a 10,000-page region. Fixed paging loads 200 pages and has amplification 1.0. Large-mapping strategies load almost the whole region before splitting, producing amplification close to 50. For COW-like burst access, BAP limited loads 512 pages for 100 touched pages, giving amplification 5.12. Unbounded BAP can load 8,192 pages for the same 100 touched pages, giving amplification 81.92. These results show why BAP must include adaptive splitting rather than relying only on large chunks.</w:t>
+        <w:t>For the 10,000-page synthetic region, the sparse workload touches 200 distinct pages. The whole-chunk-activation model counts 9,984 pages before splitting for BAP limited, giving a modeled ratio of 49.92; the fixed-page model counts 200 pages (ratio 1.0). For the COW-like burst, the modeled BAP limited ratio is 5.12 and unbounded BAP is 81.92. These observations identify a sensitivity of the chosen activation policy to chunk size. They do not independently establish page-fault behavior or a special BAP advantage over conventional aligned multi-size mappings.</w:t>
       </w:r>
     </w:p>
     <w:p>
@@ -5249,7 +5748,7 @@
     <w:p/>
     <w:p>
       <w:r>
-        <w:t>Protection boundaries reduce the benefit of large chunks. In the 10,000-page mixed-permission scenario, BAP limited increases from 21 mappings to 62 after refinement, and unbounded BAP increases from 5 to 46. This is still far below fixed paging, but it shows that permission constraints cannot be ignored.</w:t>
+        <w:t>Under synthetic permission-boundary refinement, the 10,000-page example increases BAP limited from 21 to 62 logical segments and unbounded BAP from 5 to 46. This models segmentation pressure, not a validated hardware page-table construction; the resulting segments must still satisfy page-size, virtual/physical alignment, and protection requirements for native mappings.</w:t>
       </w:r>
     </w:p>
     <w:p>
@@ -5460,13 +5959,7 @@
         <w:pStyle w:val="SmallNote"/>
       </w:pPr>
       <w:r>
-        <w:rPr>
-          <w:b/>
-        </w:rPr>
-        <w:t xml:space="preserve">Note. </w:t>
-      </w:r>
-      <w:r>
-        <w:t>Increasing the maximum chunk size reduces metadata, but may increase risk under sparse access.</w:t>
+        <w:t>Note. Increasing the logical BAP cap reduces chunk count in this sweep; the comparator cap was not co-varied, so cross-strategy trends at different caps are not a controlled native-hardware comparison.</w:t>
       </w:r>
     </w:p>
     <w:p/>
@@ -5864,7 +6357,7 @@
     <w:p/>
     <w:p>
       <w:r>
-        <w:t>The sensitivity analysis confirms the main tradeoff. Increasing the maximum BAP chunk size reduces mapping count: for a 10,000-page region, BAP limited decreases from about 79 mappings at a 128-page cap to about 8 mappings at a 2,048-page cap. However, sparse random access still produces high fault amplification before split. The split-threshold experiment shows the opposite side of the tradeoff: aggressive splitting can reduce amplification to approximately 1.0, but it may add hundreds of mapping entries. Therefore, BAP requires policy decisions, not only a lookup mechanism.</w:t>
+        <w:t>Sensitivity runs show that increasing the logical BAP cap from 128 to 2,048 pages reduces its chunk count from about 79 to 8 for the 10,000-page region. More aggressive synthetic splitting can reduce the modeled whole-chunk-activation ratio, but at the expense of extra segments. These trends are within-model parameter effects; native leaf-size eligibility, physical backing, and runtime costs were not included. In particular, Figure 8 varies BAP's cap while the comparison baseline's cap is fixed, so it should not be read as a fair hardware mapping advantage.</w:t>
       </w:r>
     </w:p>
     <w:p>
@@ -5888,7 +6381,7 @@
         <w:pStyle w:val="ListBullet"/>
       </w:pPr>
       <w:r>
-        <w:t>BAP greatly reduces mapping count compared with fixed-size paging for suitable region sizes.</w:t>
+        <w:t>BAP's descending power-of-two region decomposition has a compact mathematical representation and an XOR/MSB rule for locating the containing logical chunk.</w:t>
       </w:r>
     </w:p>
     <w:p>
@@ -5896,7 +6389,7 @@
         <w:pStyle w:val="ListBullet"/>
       </w:pPr>
       <w:r>
-        <w:t>When restricted to the same maximum mapping size, BAP limited matches strong multi-size baselines rather than unfairly outperforming them.</w:t>
+        <w:t>For the aligned starts and shared maximum logical chunk size in v2, BAP limited matches the strong idealized multi-size baseline rather than reducing its logical count.</w:t>
       </w:r>
     </w:p>
     <w:p>
@@ -5904,7 +6397,7 @@
         <w:pStyle w:val="ListBullet"/>
       </w:pPr>
       <w:r>
-        <w:t>The region-relative model avoids alignment penalties that affect conventional alignment-constrained multi-size mappings in the simulator.</w:t>
+        <w:t>Virtual-alignment feasibility is not automatic: v5 shows that region-relative BAP chunks at unaligned starts cannot generally be inserted unchanged as native aligned leaves.</w:t>
       </w:r>
     </w:p>
     <w:p>
@@ -5912,8 +6405,7 @@
         <w:pStyle w:val="ListBullet"/>
       </w:pPr>
       <w:r>
-        <w:lastRenderedPageBreak/>
-        <w:t>Unbounded BAP provides a useful theoretical upper bound, but it depends on support for larger variable-size mappings.</w:t>
+        <w:t>Unbounded BAP provides a lower bound on *logical* chunk count, but is not an established implementation or TLB-reach upper bound on current hardware.</w:t>
       </w:r>
     </w:p>
     <w:p>
@@ -5921,7 +6413,7 @@
         <w:pStyle w:val="ListBullet"/>
       </w:pPr>
       <w:r>
-        <w:t>Adaptive splitting is necessary to control fault amplification in sparse and COW-like workloads.</w:t>
+        <w:t>Synthetic whole-chunk activation may induce a high loaded/touched ratio in sparse workloads; simplified splitting can reduce this ratio while adding entries.</w:t>
       </w:r>
     </w:p>
     <w:p>
@@ -5937,7 +6429,7 @@
         <w:pStyle w:val="ListBullet"/>
       </w:pPr>
       <w:r>
-        <w:t>The results do not prove that BAP is faster than existing paging systems on real hardware.</w:t>
+        <w:t>The reported 21 region-relative BAP chunks at unaligned starts are not 21 legal native translations in either v5 page-size profile; conventional leaf support cannot realize the claimed difference without changes or fallback retiling.</w:t>
       </w:r>
     </w:p>
     <w:p>
@@ -5945,7 +6437,7 @@
         <w:pStyle w:val="ListBullet"/>
       </w:pPr>
       <w:r>
-        <w:t>The simulator does not prove that unbounded chunks can be supported by current TLBs without hardware changes.</w:t>
+        <w:t>No experiment demonstrates that BAP reduces real TLB misses, page walks, translation latency, resident memory, or program runtime compared with existing hardware paging.</w:t>
       </w:r>
     </w:p>
     <w:p>
@@ -5953,7 +6445,7 @@
         <w:pStyle w:val="ListBullet"/>
       </w:pPr>
       <w:r>
-        <w:t>The adaptive split model is optimistic and does not include the runtime cost of page-table updates, TLB shootdowns, or OS bookkeeping.</w:t>
+        <w:t>The v3 split model does not include optimal legal buddy splitting, runtime split/merge costs, TLB shootdowns, allocator effects, or actual demand-paging/COW behavior.</w:t>
       </w:r>
     </w:p>
     <w:p>
@@ -5961,7 +6453,7 @@
         <w:pStyle w:val="ListBullet"/>
       </w:pPr>
       <w:r>
-        <w:t>The results do not show that BAP should replace conventional paging; they show that BAP is worth studying as an adaptive layer or alternative design point.</w:t>
+        <w:t>The feasibility audit checks necessary virtual eligibility only. It does not certify physical frame continuity, protection correctness, software integration, or novelty relative to other region/range translation designs.</w:t>
       </w:r>
     </w:p>
     <w:p>
@@ -5974,7 +6466,7 @@
     </w:p>
     <w:p>
       <w:r>
-        <w:t>The practical value of BAP depends on a policy layer. A simple static binary decomposition is not enough. A useful implementation would need to preserve large chunks for dense, uniform regions, split chunks for sparse or COW-heavy regions, and respect permission boundaries. The lookup rule makes the region organization compact, but OS policy decides whether the large chunks remain beneficial.</w:t>
+        <w:t>Before attributing practical benefits to BAP, the design must choose an implementation target: (A) a logical metadata/lookup layer on conventional hardware, evaluated through metadata bytes, region search and update overhead without claims about extra native TLB reach; or (B) a new region-relative hardware translation proposal, with explicit descriptors, physical mapping semantics, leaf construction, permission checks, TLB-fill rules and invalidation costs. The next stage should specify one of these paths and compare its total costs with appropriate range-translation and coalescing alternatives.</w:t>
       </w:r>
     </w:p>
     <w:p>
@@ -5990,7 +6482,7 @@
         <w:pStyle w:val="ListBullet"/>
       </w:pPr>
       <w:r>
-        <w:t>No kernel implementation: the evaluation is a simulator and does not measure real page-table walk latency or TLB miss rates.</w:t>
+        <w:t>No OS or hardware implementation: the reported mapping counts and lookup rule do not establish working virtual-to-physical address translation or actual TLB/page-walk performance.</w:t>
       </w:r>
     </w:p>
     <w:p>
@@ -5998,7 +6490,7 @@
         <w:pStyle w:val="ListBullet"/>
       </w:pPr>
       <w:r>
-        <w:t>Simplified TLB model: estimated TLB reach is computed from mapping sizes and does not model associativity, replacement, page-walk caches, or architecture-specific TLB structures.</w:t>
+        <w:t>Optimistic TLB proxy: summing the largest logical mappings is not a TLB miss-rate simulation and ignores replacement, associativity and native leaf eligibility.</w:t>
       </w:r>
     </w:p>
     <w:p>
@@ -6006,7 +6498,7 @@
         <w:pStyle w:val="ListBullet"/>
       </w:pPr>
       <w:r>
-        <w:t>Simplified physical memory: the simulator does not model physical contiguity failure, memory fragmentation, NUMA placement, or compaction.</w:t>
+        <w:t>Virtual vs physical constraints: v5 tests native size and absolute virtual alignment only; no physical contiguity/alignment, fragmentation, NUMA, or compaction is modeled.</w:t>
       </w:r>
     </w:p>
     <w:p>
@@ -6014,7 +6506,7 @@
         <w:pStyle w:val="ListBullet"/>
       </w:pPr>
       <w:r>
-        <w:t>Optimistic adaptive split: after splitting, the simulator often treats loaded pages as close to touched pages and does not model the cost of performing the split.</w:t>
+        <w:t>Synthetic activation and splitting: whole-chunk loading is an assumed policy, not a necessary property of conventional page translation; estimated splitting omits implementation cost and legal page-tree structure.</w:t>
       </w:r>
     </w:p>
     <w:p>
@@ -6022,7 +6514,7 @@
         <w:pStyle w:val="ListBullet"/>
       </w:pPr>
       <w:r>
-        <w:t>Synthetic workloads: the workloads are useful for stress testing but are not collected from real processes. A stronger future evaluation should use /proc maps, memory traces, or kernel instrumentation.</w:t>
+        <w:t>Synthetic traces and reproducibility: workloads record unique touched pages rather than full address-access sequences; v3 also mixes a randomized Python string hash into its RNG seed, which can affect cross-process reproducibility unless fixed.</w:t>
       </w:r>
     </w:p>
     <w:p>
@@ -6030,7 +6522,7 @@
         <w:pStyle w:val="ListBullet"/>
       </w:pPr>
       <w:r>
-        <w:t>Hardware assumptions: region-relative variable-size lookup may require hardware or page-table support beyond existing standard paging mechanisms.</w:t>
+        <w:t>Hardware and novelty: the region-relative lookup cannot be interpreted as a native huge-page mapping without new support or legal retiling. Costs of metadata, region discovery and translation must be compared against prior region/range-based methods.</w:t>
       </w:r>
     </w:p>
     <w:p>
@@ -6117,17 +6609,17 @@
     </w:p>
     <w:p>
       <w:r>
-        <w:t>This paper proposed Binary Adaptive Paging, a region-based virtual memory mapping scheme that decomposes regions into descending power-of-two chunks and identifies the containing logical chunk using an XOR/MSB lookup rule. The main contribution is not the claim that variable-size pages are new, but the combination of binary region decomposition, compact lookup, and adaptive split/merge-oriented evaluation.</w:t>
-      </w:r>
-    </w:p>
-    <w:p>
-      <w:r>
-        <w:t>Simulation results show that BAP limited greatly reduces mapping count compared with fixed paging and matches strong multi-size baselines under fair maximum-size constraints. BAP unbounded illustrates a theoretical upper bound when larger chunks are allowed. Alignment experiments show that the region-relative model avoids some alignment penalties in the simulator. Workload-aware experiments show the main practical danger: sparse access and COW-like writes can create high fault amplification unless adaptive splitting is used. Sensitivity analysis confirms that maximum chunk size and split threshold create a tunable tradeoff between metadata overhead and fault amplification.</w:t>
-      </w:r>
-    </w:p>
-    <w:p>
-      <w:r>
-        <w:t>The most reasonable conclusion is that BAP is not a replacement for conventional paging at this stage. It is an exploratory design point between fixed pages and large-page mechanisms. The next step is to implement a stronger simulator using real process memory maps and, eventually, to prototype a limited version in an educational operating system or kernel-level emulator.</w:t>
+        <w:t>This study introduced BAP as a logical region-relative representation with descending power-of-two decomposition and an XOR/MSB rule that identifies the containing chunk. The existing correctness argument covers logical chunk identification; it does not prove native address-translation feasibility.</w:t>
+      </w:r>
+    </w:p>
+    <w:p>
+      <w:r>
+        <w:t>Simulators v2–v4 show that BAP limited can greatly reduce *logical* chunk counts versus fixed-size pages and matches idealized multi-size schemes at aligned starts under a shared cap. The apparent benefit at unaligned starts depends on treating relative chunks as translation entries. The v5 virtual-alignment audit makes this dependence explicit: for a 10,000-page region starting at virtual page 1, none of the 21 original BAP limited chunks is a directly eligible native leaf in the tested profiles; aligned retiling produces 30 leaves in a hypothetical all-power-of-two profile and 802 in a 4 KiB/2 MiB profile. The workload and splitting figures remain synthetic, policy-dependent proxies.</w:t>
+      </w:r>
+    </w:p>
+    <w:p>
+      <w:r>
+        <w:t>Consequently, these results support further investigation of BAP's region representation and lookup method, not a demonstrated TLB speedup or kernel-ready alternative. The next research task is to specify a complete translation interface or restrict the claim to a metadata organization on existing hardware, then measure its incremental costs and benefits against established range-mapping methods.</w:t>
       </w:r>
     </w:p>
     <w:p>
@@ -6218,13 +6710,7 @@
     </w:p>
     <w:p>
       <w:r>
-        <w:rPr>
-          <w:b/>
-        </w:rPr>
-        <w:t xml:space="preserve">[8] </w:t>
-      </w:r>
-      <w:r>
-        <w:t>The simulator artifacts used for this draft include simulator_v2.py, simulator_v3_workloads.py, sensitivity_v4.py, and the generated CSV/plot outputs prepared during the project.</w:t>
+        <w:t>[8] BAP simulation artifacts, project repository: https://github.com/abdojat/binary-adaptive-paging (simulator_v2.py, simulator_v3_workloads.py, sensitivity_v4.py and archived result tables). The v5 feasibility script and summary are a separate supplementary artifact pending repository integration.</w:t>
       </w:r>
     </w:p>
     <w:p>
@@ -6237,7 +6723,7 @@
     </w:p>
     <w:p>
       <w:r>
-        <w:t>The experimental results in this draft were produced using Python simulation scripts. The main commands were:</w:t>
+        <w:t>The original v2–v4 results can be regenerated using the commands below. The supplementary v5 structural audit uses Python's standard library only and produces 72 cases in results_v5/feasibility_summary_v5.csv; its code and outputs should be committed with a fixed revision before submission.</w:t>
       </w:r>
     </w:p>
     <w:tbl>
@@ -6256,35 +6742,14 @@
             <w:shd w:val="clear" w:color="auto" w:fill="F2F2F2"/>
           </w:tcPr>
           <w:p>
-            <w:pPr>
-              <w:jc w:val="left"/>
-            </w:pPr>
-            <w:r>
-              <w:rPr>
-                <w:rFonts w:eastAsia="Consolas"/>
-              </w:rPr>
+            <w:r>
               <w:t>python simulator_v2.py --validate --tlb-entries 64</w:t>
-            </w:r>
-            <w:r>
               <w:br/>
-            </w:r>
-            <w:r>
-              <w:rPr>
-                <w:rFonts w:eastAsia="Consolas"/>
-              </w:rPr>
               <w:t>python simulator_v3_workloads.py --validate --tlb-entries 64</w:t>
-            </w:r>
-            <w:r>
               <w:br/>
-            </w:r>
-            <w:r>
-              <w:rPr>
-                <w:rFonts w:eastAsia="Consolas"/>
-              </w:rPr>
               <w:t>python sensitivity_v4.py --simulator-path simulator_v3_workloads.py</w:t>
-            </w:r>
-            <w:r>
               <w:br/>
+              <w:t>python feasibility_v5.py --validate --out results_v5/feasibility_summary_v5.csv</w:t>
             </w:r>
           </w:p>
         </w:tc>
@@ -6386,7 +6851,7 @@
     </w:p>
     <w:p>
       <w:r>
-        <w:t>A future version should publish the simulator code and exact input/output files in a small repository so that the results can be reproduced by the instructor or reviewers.</w:t>
+        <w:t>The public repository currently contains the earlier simulator versions and their results. The v5 feasibility script, report, and CSV are supplied separately with this revision and should be added to the public repository before scientific submission. After fixing the v3 Python hash-based seed, rerun and record exact commands, Python/dependency versions, code revision, and output checksums.</w:t>
       </w:r>
     </w:p>
     <w:p/>

</xml_diff>

<commit_message>
Add translation semantics model and results for BAP v6
- Introduced `translation_v6.py` to implement the end-to-end software-model translation correctness gate.
- Added functionality to sample regions, build translation models (BAP, generic, x86), and verify translations.
- Created `translation_semantics_v6.csv` to store results from various translation scenarios.
- Implemented self-testing to ensure correctness of translation models across different workloads and configurations.
</commit_message>
<xml_diff>
--- a/Binary Adaptive Paging.docx
+++ b/Binary Adaptive Paging.docx
@@ -82,23 +82,12 @@
     </w:p>
     <w:p>
       <w:r>
-        <w:t xml:space="preserve">Fixed-size paging provides a simple and reliable foundation for virtual memory, but it may </w:t>
-      </w:r>
-      <w:r>
-        <w:t>require</w:t>
-      </w:r>
-      <w:r>
-        <w:t xml:space="preserve"> many translation entries for large memory regions and can limit effective TLB reach. Huge pages and superpages reduce translation overhead by mapping larger memory ranges, but they introduce practical difficulties related to alignment, fragmentation, protection boundaries, copy-on-write behavior, and sparse access. This paper proposes Binary Adaptive Paging (BAP), an exploratory region-based virtual memory mapping scheme that decomposes each memory region into descending power-of-two chunks. The central idea is that, for an address offset a inside a region of size S, the containing logical chunk can be identified using the most significant set bit of a XOR S. This creates a compact lookup rule for binary-decomposed regions while preserving compatibility with base-page units.</w:t>
-      </w:r>
-    </w:p>
-    <w:p>
-      <w:r>
-        <w:t>The paper establishes the BAP logical region model and the XOR/MSB chunk-identification rule, then evaluates structural chunk counts, synthetic workload effects, and sensitivity to chunk-size and split thresholds. Under equal maximum logical chunk sizes, BAP limited matches the idealized multi-size baseline for aligned starts. Earlier alignment experiments suggested fewer region-relative chunks for unaligned starts, but these logical counts are not equivalent to hardware-native translation entries. A supplementary v5 virtual-alignment audit evaluates two explicit page-size profiles: a hypothetical profile supporting every power-of-two size through 512 base pages and a 4 KiB/2 MiB x86 leaf-page profile. For a 10,000-page region starting at virtual page 1, the 21 original BAP limited chunks are not directly eligible native leaves in either profile. Aligned retiling requires 30 leaves in the hypothetical profile and 802 in the 4 KiB/2 MiB profile. These are structural, virtual-alignment counts, not measurements of physical feasibility, TLB misses, or runtime performance. BAP therefore remains a logical organization and address-lookup proposal whose practical translation path must be specified and evaluated before claiming hardware-level benefits.</w:t>
-      </w:r>
-    </w:p>
-    <w:p>
-      <w:r>
-        <w:t>Keywords: virtual memory, binary region decomposition, XOR/MSB lookup, virtual alignment, translation feasibility, large pages, simulation</w:t>
+        <w:t>Binary Adaptive Paging (BAP) organizes a virtual-memory region into descending power-of-two logical chunks and locates the chunk for offset a within a region of S pages using MSB(a XOR S). Earlier simulations (v2–v4) studied logical chunk counts and synthetic splitting effects, while the v5 audit demonstrated that region-relative chunks are not automatically legal native page-table leaves. The new v6 software-model correctness gate evaluates byte-address virtual-to-physical translations and read/write/execute protection for BAP, capped and unbounded generic ranges, and x86-like 4 KiB/2 MiB leaves using identical physical frames in 45 deterministic scenarios. For a 10,000-page region starting at virtual page 1, contiguous backing requires 21 BAP physical/permission subrecords versus 20 capped range records or one unbounded range. Breaking physical continuity every 32 pages raises both BAP and generic range counts to 313. An x86-like model requires 10,000 leaves when virtual and physical alignment phases differ, compared with 802 under matched phases. All tested address and permission checks passed, but the counts are structural and do not measure TLB misses, metadata bytes, or runtime. BAP therefore remains an exploratory organization whose lookup and storage costs require evaluation against strong range-based alternatives.</w:t>
+      </w:r>
+    </w:p>
+    <w:p>
+      <w:r>
+        <w:t>Keywords: virtual memory, binary region decomposition, XOR/MSB lookup, physical mapping, permissions, range translation, page alignment, translation correctness</w:t>
       </w:r>
     </w:p>
     <w:p>
@@ -248,6 +237,12 @@
       </w:r>
     </w:p>
     <w:p>
+      <w:pPr/>
+      <w:r>
+        <w:t>The v6 extension completes virtual-to-physical address semantics in a controlled software model using explicit page-frame and permission metadata. It does not implement BAP in Linux, modify a hardware page walker, or measure TLB performance. The central open question is whether structured XOR/MSB parent lookup outweighs the descriptor, subrecord, and update costs of a generic range representation.</w:t>
+      </w:r>
+    </w:p>
+    <w:p>
       <w:pPr>
         <w:pStyle w:val="Heading2"/>
       </w:pPr>
@@ -293,6 +288,12 @@
       </w:pPr>
       <w:r>
         <w:t>A parameter sensitivity study and a v5 audit of virtual alignment and native leaf-page eligibility that identify conditions under which logical BAP chunks cannot be treated as conventional hardware translations.</w:t>
+      </w:r>
+    </w:p>
+    <w:p>
+      <w:pPr/>
+      <w:r>
+        <w:t>6. A v6 software-model correctness check for physical-frame translation and protection, with explicit generic-range and native page-leaf comparators across fragmentation and alignment scenarios.</w:t>
       </w:r>
     </w:p>
     <w:p>
@@ -899,18 +900,31 @@
         <w:gridCol w:w="10070"/>
       </w:tblGrid>
       <w:tr>
+        <w:trPr>
+          <w:cantSplit/>
+        </w:trPr>
         <w:tc>
           <w:tcPr>
             <w:tcW w:w="10080" w:type="dxa"/>
             <w:shd w:val="clear" w:color="auto" w:fill="F2F2F2"/>
           </w:tcPr>
           <w:p>
-            <w:r>
+            <w:pPr>
+              <w:spacing w:before="0" w:after="0"/>
+              <w:jc w:val="left"/>
+            </w:pPr>
+            <w:r>
+              <w:rPr>
+                <w:rFonts w:ascii="Consolas" w:hAnsi="Consolas"/>
+                <w:sz w:val="16"/>
+              </w:rPr>
               <w:t>locate_logical_chunk(A, region, max_chunk):</w:t>
               <w:br/>
-              <w:t xml:space="preserve">    B, S = region.base, region.size    # all quantities in base-page units</w:t>
+              <w:t xml:space="preserve">    B, S = region.base, region.size  # base-page units</w:t>
               <w:br/>
-              <w:t xml:space="preserve">    if A &lt; B or A &gt;= B + S: raise RegionMiss</w:t>
+              <w:t xml:space="preserve">    if A &lt; B or A &gt;= B + S:</w:t>
+              <w:br/>
+              <w:t xml:space="preserve">        raise RegionMiss</w:t>
               <w:br/>
               <w:t xml:space="preserve">    a = A - B</w:t>
               <w:br/>
@@ -932,11 +946,9 @@
               <w:br/>
               <w:t xml:space="preserve">        chunk_size = max_chunk</w:t>
               <w:br/>
-              <w:t xml:space="preserve">    return (chunk_base, chunk_size, a - chunk_base)</w:t>
+              <w:t xml:space="preserve">    return chunk_base, chunk_size, a - chunk_base</w:t>
               <w:br/>
-              <w:t># This identifies a LOGICAL chunk only.</w:t>
-              <w:br/>
-              <w:t># Physical frame lookup, eligibility, permissions and TLB fill are unspecified.</w:t>
+              <w:t># Logical chunk only; physical mapping handled separately.</w:t>
             </w:r>
           </w:p>
         </w:tc>
@@ -947,6 +959,27 @@
       <w:pPr/>
       <w:r>
         <w:t>The algorithm above locates a logical chunk and an intra-chunk offset; it is not a complete virtual-to-physical translation algorithm. Such a translation additionally needs a region-discovery mechanism, a mapping from each eligible chunk or base page to physical backing, appropriate permissions, and a defined TLB/page-walker interface. Section 7.3.1 tests the necessary virtual prerequisites under selected page-size profiles, while physical prerequisites remain open.</w:t>
+      </w:r>
+    </w:p>
+    <w:p>
+      <w:pPr>
+        <w:pStyle w:val="Heading2"/>
+        <w:keepNext/>
+      </w:pPr>
+      <w:r>
+        <w:t>4.5 Physical-frame and permission semantics (v6)</w:t>
+      </w:r>
+    </w:p>
+    <w:p>
+      <w:pPr/>
+      <w:r>
+        <w:t>A virtual-to-physical translation requires more than the XOR/MSB parent index. In v6, a region descriptor provides its virtual start and length; a reference map associates each base page with a physical frame number (PFN) and read/write/execute rights. The BAP model first finds the 512-page-capped logical parent using XOR/MSB. Within that parent, it searches subrecords that contain physically consecutive frames and uniform permissions. A selected record yields physical address PA = (start_PFN + (VPN - record_start_VPN)) × 4096 + byte_offset, subject to bounds and permission checks.</w:t>
+      </w:r>
+    </w:p>
+    <w:p>
+      <w:pPr/>
+      <w:r>
+        <w:t>The comparator range models encode identical physical and permission runs without BAP parent boundaries: one limits each descriptor to 512 pages and the other allows arbitrary run lengths. An x86-like leaf model permits 4 KiB leaves or 2 MiB leaves only when the starting virtual page and PFN are both multiples of 512, all 512 PFNs are consecutive, and their permissions agree. This construction validates software-model translation semantics; it assumes a hypothetical region-aware lookup path for BAP and generic ranges. It does not establish native hardware support or a TLB-fill mechanism.</w:t>
       </w:r>
     </w:p>
     <w:p>
@@ -1810,6 +1843,27 @@
     <w:p>
       <w:r>
         <w:t>Unless stated otherwise, one base page is the simulation unit and the principal cap is 512 base pages. The v2–v4 experiments use a 64-slot optimistic largest-chunk coverage proxy (not a TLB simulator); structural region sizes include 1–10,000 pages, and workload-aware runs focus on 1,000, 4,096, and 10,000 pages. Sensitivity runs vary BAP's cap among 128, 256, 512, 1,024, and 2,048 pages and the density threshold among 0.05, 0.10, 0.25, and 0.50, over five seeds. In v5, the cap is 512 pages, region sizes are 13, 19, 513, 1,000, 4,096, and 10,000, and starts are 0, 1, 7, 13, 64, and 255, for two leaf-size profiles (72 cases). v5 tests only virtual alignment and page-size membership, not physical backing or actual TLB behavior.</w:t>
+      </w:r>
+    </w:p>
+    <w:p>
+      <w:pPr>
+        <w:pStyle w:val="Heading2"/>
+        <w:keepNext/>
+      </w:pPr>
+      <w:r>
+        <w:t>6.6 v6 translation-correctness protocol</w:t>
+      </w:r>
+    </w:p>
+    <w:p>
+      <w:pPr/>
+      <w:r>
+        <w:t>The v6 experiment uses a 4 KiB base page and considers three region sizes (1,000, 4,096, and 10,000 pages), three starting VPNs (0, 1, and 7), and five deterministic backing layouts: contiguous, contiguous_phase_matched, fragmented_32, mixed_permissions, and fragmented_permissions. The Cartesian product contains 45 cases. Each strategy receives the same page-to-PFN map and permissions. Every base page is checked at byte offsets 0, 17, and 4,095 for read, write, and execute access, including expected protection faults; out-of-region accesses are also rejected by validation. The code reports structural parent, subrecord, range, and x86-like leaf counts, not allocation costs or runtime metrics.</w:t>
+      </w:r>
+    </w:p>
+    <w:p>
+      <w:pPr/>
+      <w:r>
+        <w:t>In the contiguous layout, physical frames begin at an aligned PFN independently of the region start, which can mismatch the virtual 2 MiB alignment phase. The contiguous_phase_matched layout aligns the virtual and physical phases; fragmented_32 adds a deterministic discontinuity every 32 pages. Mixed-permission cases divide the region into RX, R, and RW thirds. Validation was reproduced using python translation_v6.py --validate, with 45 rows identical to the supplied v6 CSV. The numerical comparison refers exclusively to the specified software model and its assumptions.</w:t>
       </w:r>
     </w:p>
     <w:p>
@@ -4529,6 +4583,793 @@
       <w:pPr/>
       <w:r>
         <w:t>Interpretation. The apparent 21-versus-30 advantage in Table 7 is a logical representation comparison, not a native hardware paging advantage. Under the hypothetical all-powers-of-two profile, legal retiling at start page 1 needs the same 30 aligned leaves as the aligned multi-size baseline. Under the limited x86 4 KiB/2 MiB profile, it needs 802 legal leaves; the original 21 BAP chunks cannot serve as native page-table leaves. These findings do not rule out a newly designed region-relative translation mechanism, but such a mechanism must specify its region lookup, physical mapping, metadata costs, protection semantics, and TLB interface. No end-to-end speedup is implied.</w:t>
+      </w:r>
+    </w:p>
+    <w:p>
+      <w:pPr>
+        <w:pStyle w:val="Heading3"/>
+        <w:keepNext/>
+      </w:pPr>
+      <w:r>
+        <w:t>7.3.2 End-to-end translation semantics and physical-layout checks (v6)</w:t>
+      </w:r>
+    </w:p>
+    <w:p>
+      <w:pPr/>
+      <w:r>
+        <w:t>Unlike v5, which checked necessary virtual leaf prerequisites, v6 builds byte-address translations from specific physical frame sequences and permission maps. BAP uses a two-stage software lookup: a region-relative XOR/MSB parent plus a search among contiguous, permission-uniform child subrecords. Two generic range representations and an x86-like page-leaf construction act as comparators. All four models must return the same physical address for permitted accesses and reject disallowed accesses. A region-aware hardware translation interface for BAP is assumed, not demonstrated.</w:t>
+      </w:r>
+    </w:p>
+    <w:p>
+      <w:pPr>
+        <w:pStyle w:val="Caption"/>
+      </w:pPr>
+      <w:r>
+        <w:t>Table 7b. Structural translation representation counts under five backing layouts (v6; region S = 10,000 pages, starting VPN = 1).</w:t>
+      </w:r>
+    </w:p>
+    <w:tbl>
+      <w:tblPr>
+        <w:tblStyle w:val="TableGrid"/>
+        <w:tblW w:type="auto" w:w="0"/>
+        <w:jc w:val="center"/>
+        <w:tblLayout w:type="fixed"/>
+        <w:tblLook w:firstColumn="1" w:firstRow="1" w:lastColumn="0" w:lastRow="0" w:noHBand="0" w:noVBand="1" w:val="04A0"/>
+      </w:tblPr>
+      <w:tblGrid>
+        <w:gridCol w:w="1680"/>
+        <w:gridCol w:w="1680"/>
+        <w:gridCol w:w="1680"/>
+        <w:gridCol w:w="1680"/>
+        <w:gridCol w:w="1680"/>
+        <w:gridCol w:w="1680"/>
+      </w:tblGrid>
+      <w:tr>
+        <w:trPr>
+          <w:cantSplit/>
+          <w:tblHeader w:val="true"/>
+        </w:trPr>
+        <w:tc>
+          <w:tcPr>
+            <w:tcW w:type="dxa" w:w="2477"/>
+            <w:vAlign w:val="center"/>
+            <w:shd w:fill="E7F0F7"/>
+          </w:tcPr>
+          <w:p>
+            <w:pPr>
+              <w:spacing w:before="20" w:after="20" w:line="252" w:lineRule="auto"/>
+              <w:jc w:val="left"/>
+            </w:pPr>
+            <w:r>
+              <w:rPr>
+                <w:rFonts w:ascii="Times New Roman" w:hAnsi="Times New Roman"/>
+                <w:b/>
+                <w:sz w:val="16"/>
+              </w:rPr>
+              <w:t>Physical backing</w:t>
+            </w:r>
+          </w:p>
+        </w:tc>
+        <w:tc>
+          <w:tcPr>
+            <w:tcW w:type="dxa" w:w="1267"/>
+            <w:vAlign w:val="center"/>
+            <w:shd w:fill="E7F0F7"/>
+          </w:tcPr>
+          <w:p>
+            <w:pPr>
+              <w:spacing w:before="20" w:after="20" w:line="252" w:lineRule="auto"/>
+              <w:jc w:val="center"/>
+            </w:pPr>
+            <w:r>
+              <w:rPr>
+                <w:rFonts w:ascii="Times New Roman" w:hAnsi="Times New Roman"/>
+                <w:b/>
+                <w:sz w:val="16"/>
+              </w:rPr>
+              <w:t>BAP parents</w:t>
+            </w:r>
+          </w:p>
+        </w:tc>
+        <w:tc>
+          <w:tcPr>
+            <w:tcW w:type="dxa" w:w="1440"/>
+            <w:vAlign w:val="center"/>
+            <w:shd w:fill="E7F0F7"/>
+          </w:tcPr>
+          <w:p>
+            <w:pPr>
+              <w:spacing w:before="20" w:after="20" w:line="252" w:lineRule="auto"/>
+              <w:jc w:val="center"/>
+            </w:pPr>
+            <w:r>
+              <w:rPr>
+                <w:rFonts w:ascii="Times New Roman" w:hAnsi="Times New Roman"/>
+                <w:b/>
+                <w:sz w:val="16"/>
+              </w:rPr>
+              <w:t>BAP subrecords</w:t>
+            </w:r>
+          </w:p>
+        </w:tc>
+        <w:tc>
+          <w:tcPr>
+            <w:tcW w:type="dxa" w:w="1555"/>
+            <w:vAlign w:val="center"/>
+            <w:shd w:fill="E7F0F7"/>
+          </w:tcPr>
+          <w:p>
+            <w:pPr>
+              <w:spacing w:before="20" w:after="20" w:line="252" w:lineRule="auto"/>
+              <w:jc w:val="center"/>
+            </w:pPr>
+            <w:r>
+              <w:rPr>
+                <w:rFonts w:ascii="Times New Roman" w:hAnsi="Times New Roman"/>
+                <w:b/>
+                <w:sz w:val="16"/>
+              </w:rPr>
+              <w:t>Generic range ≤512</w:t>
+            </w:r>
+          </w:p>
+        </w:tc>
+        <w:tc>
+          <w:tcPr>
+            <w:tcW w:type="dxa" w:w="1757"/>
+            <w:vAlign w:val="center"/>
+            <w:shd w:fill="E7F0F7"/>
+          </w:tcPr>
+          <w:p>
+            <w:pPr>
+              <w:spacing w:before="20" w:after="20" w:line="252" w:lineRule="auto"/>
+              <w:jc w:val="center"/>
+            </w:pPr>
+            <w:r>
+              <w:rPr>
+                <w:rFonts w:ascii="Times New Roman" w:hAnsi="Times New Roman"/>
+                <w:b/>
+                <w:sz w:val="16"/>
+              </w:rPr>
+              <w:t>Generic range unlimited</w:t>
+            </w:r>
+          </w:p>
+        </w:tc>
+        <w:tc>
+          <w:tcPr>
+            <w:tcW w:type="dxa" w:w="1584"/>
+            <w:vAlign w:val="center"/>
+            <w:shd w:fill="E7F0F7"/>
+          </w:tcPr>
+          <w:p>
+            <w:pPr>
+              <w:spacing w:before="20" w:after="20" w:line="252" w:lineRule="auto"/>
+              <w:jc w:val="center"/>
+            </w:pPr>
+            <w:r>
+              <w:rPr>
+                <w:rFonts w:ascii="Times New Roman" w:hAnsi="Times New Roman"/>
+                <w:b/>
+                <w:sz w:val="16"/>
+              </w:rPr>
+              <w:t>x86-like leaves</w:t>
+            </w:r>
+          </w:p>
+        </w:tc>
+      </w:tr>
+      <w:tr>
+        <w:trPr>
+          <w:cantSplit/>
+        </w:trPr>
+        <w:tc>
+          <w:tcPr>
+            <w:tcW w:type="dxa" w:w="2477"/>
+            <w:vAlign w:val="center"/>
+          </w:tcPr>
+          <w:p>
+            <w:pPr>
+              <w:spacing w:before="20" w:after="20" w:line="252" w:lineRule="auto"/>
+              <w:jc w:val="left"/>
+            </w:pPr>
+            <w:r>
+              <w:rPr>
+                <w:rFonts w:ascii="Times New Roman" w:hAnsi="Times New Roman"/>
+                <w:sz w:val="16"/>
+              </w:rPr>
+              <w:t>Contiguous; phase differs</w:t>
+            </w:r>
+          </w:p>
+        </w:tc>
+        <w:tc>
+          <w:tcPr>
+            <w:tcW w:type="dxa" w:w="1267"/>
+            <w:vAlign w:val="center"/>
+          </w:tcPr>
+          <w:p>
+            <w:pPr>
+              <w:spacing w:before="20" w:after="20" w:line="252" w:lineRule="auto"/>
+              <w:jc w:val="center"/>
+            </w:pPr>
+            <w:r>
+              <w:rPr>
+                <w:rFonts w:ascii="Times New Roman" w:hAnsi="Times New Roman"/>
+                <w:sz w:val="16"/>
+              </w:rPr>
+              <w:t>21</w:t>
+            </w:r>
+          </w:p>
+        </w:tc>
+        <w:tc>
+          <w:tcPr>
+            <w:tcW w:type="dxa" w:w="1440"/>
+            <w:vAlign w:val="center"/>
+          </w:tcPr>
+          <w:p>
+            <w:pPr>
+              <w:spacing w:before="20" w:after="20" w:line="252" w:lineRule="auto"/>
+              <w:jc w:val="center"/>
+            </w:pPr>
+            <w:r>
+              <w:rPr>
+                <w:rFonts w:ascii="Times New Roman" w:hAnsi="Times New Roman"/>
+                <w:sz w:val="16"/>
+              </w:rPr>
+              <w:t>21</w:t>
+            </w:r>
+          </w:p>
+        </w:tc>
+        <w:tc>
+          <w:tcPr>
+            <w:tcW w:type="dxa" w:w="1555"/>
+            <w:vAlign w:val="center"/>
+          </w:tcPr>
+          <w:p>
+            <w:pPr>
+              <w:spacing w:before="20" w:after="20" w:line="252" w:lineRule="auto"/>
+              <w:jc w:val="center"/>
+            </w:pPr>
+            <w:r>
+              <w:rPr>
+                <w:rFonts w:ascii="Times New Roman" w:hAnsi="Times New Roman"/>
+                <w:sz w:val="16"/>
+              </w:rPr>
+              <w:t>20</w:t>
+            </w:r>
+          </w:p>
+        </w:tc>
+        <w:tc>
+          <w:tcPr>
+            <w:tcW w:type="dxa" w:w="1757"/>
+            <w:vAlign w:val="center"/>
+          </w:tcPr>
+          <w:p>
+            <w:pPr>
+              <w:spacing w:before="20" w:after="20" w:line="252" w:lineRule="auto"/>
+              <w:jc w:val="center"/>
+            </w:pPr>
+            <w:r>
+              <w:rPr>
+                <w:rFonts w:ascii="Times New Roman" w:hAnsi="Times New Roman"/>
+                <w:sz w:val="16"/>
+              </w:rPr>
+              <w:t>1</w:t>
+            </w:r>
+          </w:p>
+        </w:tc>
+        <w:tc>
+          <w:tcPr>
+            <w:tcW w:type="dxa" w:w="1584"/>
+            <w:vAlign w:val="center"/>
+          </w:tcPr>
+          <w:p>
+            <w:pPr>
+              <w:spacing w:before="20" w:after="20" w:line="252" w:lineRule="auto"/>
+              <w:jc w:val="center"/>
+            </w:pPr>
+            <w:r>
+              <w:rPr>
+                <w:rFonts w:ascii="Times New Roman" w:hAnsi="Times New Roman"/>
+                <w:sz w:val="16"/>
+              </w:rPr>
+              <w:t>10000</w:t>
+            </w:r>
+          </w:p>
+        </w:tc>
+      </w:tr>
+      <w:tr>
+        <w:trPr>
+          <w:cantSplit/>
+        </w:trPr>
+        <w:tc>
+          <w:tcPr>
+            <w:tcW w:type="dxa" w:w="2477"/>
+            <w:vAlign w:val="center"/>
+          </w:tcPr>
+          <w:p>
+            <w:pPr>
+              <w:spacing w:before="20" w:after="20" w:line="252" w:lineRule="auto"/>
+              <w:jc w:val="left"/>
+            </w:pPr>
+            <w:r>
+              <w:rPr>
+                <w:rFonts w:ascii="Times New Roman" w:hAnsi="Times New Roman"/>
+                <w:sz w:val="16"/>
+              </w:rPr>
+              <w:t>Contiguous; phase matched</w:t>
+            </w:r>
+          </w:p>
+        </w:tc>
+        <w:tc>
+          <w:tcPr>
+            <w:tcW w:type="dxa" w:w="1267"/>
+            <w:vAlign w:val="center"/>
+          </w:tcPr>
+          <w:p>
+            <w:pPr>
+              <w:spacing w:before="20" w:after="20" w:line="252" w:lineRule="auto"/>
+              <w:jc w:val="center"/>
+            </w:pPr>
+            <w:r>
+              <w:rPr>
+                <w:rFonts w:ascii="Times New Roman" w:hAnsi="Times New Roman"/>
+                <w:sz w:val="16"/>
+              </w:rPr>
+              <w:t>21</w:t>
+            </w:r>
+          </w:p>
+        </w:tc>
+        <w:tc>
+          <w:tcPr>
+            <w:tcW w:type="dxa" w:w="1440"/>
+            <w:vAlign w:val="center"/>
+          </w:tcPr>
+          <w:p>
+            <w:pPr>
+              <w:spacing w:before="20" w:after="20" w:line="252" w:lineRule="auto"/>
+              <w:jc w:val="center"/>
+            </w:pPr>
+            <w:r>
+              <w:rPr>
+                <w:rFonts w:ascii="Times New Roman" w:hAnsi="Times New Roman"/>
+                <w:sz w:val="16"/>
+              </w:rPr>
+              <w:t>21</w:t>
+            </w:r>
+          </w:p>
+        </w:tc>
+        <w:tc>
+          <w:tcPr>
+            <w:tcW w:type="dxa" w:w="1555"/>
+            <w:vAlign w:val="center"/>
+          </w:tcPr>
+          <w:p>
+            <w:pPr>
+              <w:spacing w:before="20" w:after="20" w:line="252" w:lineRule="auto"/>
+              <w:jc w:val="center"/>
+            </w:pPr>
+            <w:r>
+              <w:rPr>
+                <w:rFonts w:ascii="Times New Roman" w:hAnsi="Times New Roman"/>
+                <w:sz w:val="16"/>
+              </w:rPr>
+              <w:t>20</w:t>
+            </w:r>
+          </w:p>
+        </w:tc>
+        <w:tc>
+          <w:tcPr>
+            <w:tcW w:type="dxa" w:w="1757"/>
+            <w:vAlign w:val="center"/>
+          </w:tcPr>
+          <w:p>
+            <w:pPr>
+              <w:spacing w:before="20" w:after="20" w:line="252" w:lineRule="auto"/>
+              <w:jc w:val="center"/>
+            </w:pPr>
+            <w:r>
+              <w:rPr>
+                <w:rFonts w:ascii="Times New Roman" w:hAnsi="Times New Roman"/>
+                <w:sz w:val="16"/>
+              </w:rPr>
+              <w:t>1</w:t>
+            </w:r>
+          </w:p>
+        </w:tc>
+        <w:tc>
+          <w:tcPr>
+            <w:tcW w:type="dxa" w:w="1584"/>
+            <w:vAlign w:val="center"/>
+          </w:tcPr>
+          <w:p>
+            <w:pPr>
+              <w:spacing w:before="20" w:after="20" w:line="252" w:lineRule="auto"/>
+              <w:jc w:val="center"/>
+            </w:pPr>
+            <w:r>
+              <w:rPr>
+                <w:rFonts w:ascii="Times New Roman" w:hAnsi="Times New Roman"/>
+                <w:sz w:val="16"/>
+              </w:rPr>
+              <w:t>802</w:t>
+            </w:r>
+          </w:p>
+        </w:tc>
+      </w:tr>
+      <w:tr>
+        <w:trPr>
+          <w:cantSplit/>
+        </w:trPr>
+        <w:tc>
+          <w:tcPr>
+            <w:tcW w:type="dxa" w:w="2477"/>
+            <w:vAlign w:val="center"/>
+          </w:tcPr>
+          <w:p>
+            <w:pPr>
+              <w:spacing w:before="20" w:after="20" w:line="252" w:lineRule="auto"/>
+              <w:jc w:val="left"/>
+            </w:pPr>
+            <w:r>
+              <w:rPr>
+                <w:rFonts w:ascii="Times New Roman" w:hAnsi="Times New Roman"/>
+                <w:sz w:val="16"/>
+              </w:rPr>
+              <w:t>Fragmented every 32 pages</w:t>
+            </w:r>
+          </w:p>
+        </w:tc>
+        <w:tc>
+          <w:tcPr>
+            <w:tcW w:type="dxa" w:w="1267"/>
+            <w:vAlign w:val="center"/>
+          </w:tcPr>
+          <w:p>
+            <w:pPr>
+              <w:spacing w:before="20" w:after="20" w:line="252" w:lineRule="auto"/>
+              <w:jc w:val="center"/>
+            </w:pPr>
+            <w:r>
+              <w:rPr>
+                <w:rFonts w:ascii="Times New Roman" w:hAnsi="Times New Roman"/>
+                <w:sz w:val="16"/>
+              </w:rPr>
+              <w:t>21</w:t>
+            </w:r>
+          </w:p>
+        </w:tc>
+        <w:tc>
+          <w:tcPr>
+            <w:tcW w:type="dxa" w:w="1440"/>
+            <w:vAlign w:val="center"/>
+          </w:tcPr>
+          <w:p>
+            <w:pPr>
+              <w:spacing w:before="20" w:after="20" w:line="252" w:lineRule="auto"/>
+              <w:jc w:val="center"/>
+            </w:pPr>
+            <w:r>
+              <w:rPr>
+                <w:rFonts w:ascii="Times New Roman" w:hAnsi="Times New Roman"/>
+                <w:sz w:val="16"/>
+              </w:rPr>
+              <w:t>313</w:t>
+            </w:r>
+          </w:p>
+        </w:tc>
+        <w:tc>
+          <w:tcPr>
+            <w:tcW w:type="dxa" w:w="1555"/>
+            <w:vAlign w:val="center"/>
+          </w:tcPr>
+          <w:p>
+            <w:pPr>
+              <w:spacing w:before="20" w:after="20" w:line="252" w:lineRule="auto"/>
+              <w:jc w:val="center"/>
+            </w:pPr>
+            <w:r>
+              <w:rPr>
+                <w:rFonts w:ascii="Times New Roman" w:hAnsi="Times New Roman"/>
+                <w:sz w:val="16"/>
+              </w:rPr>
+              <w:t>313</w:t>
+            </w:r>
+          </w:p>
+        </w:tc>
+        <w:tc>
+          <w:tcPr>
+            <w:tcW w:type="dxa" w:w="1757"/>
+            <w:vAlign w:val="center"/>
+          </w:tcPr>
+          <w:p>
+            <w:pPr>
+              <w:spacing w:before="20" w:after="20" w:line="252" w:lineRule="auto"/>
+              <w:jc w:val="center"/>
+            </w:pPr>
+            <w:r>
+              <w:rPr>
+                <w:rFonts w:ascii="Times New Roman" w:hAnsi="Times New Roman"/>
+                <w:sz w:val="16"/>
+              </w:rPr>
+              <w:t>313</w:t>
+            </w:r>
+          </w:p>
+        </w:tc>
+        <w:tc>
+          <w:tcPr>
+            <w:tcW w:type="dxa" w:w="1584"/>
+            <w:vAlign w:val="center"/>
+          </w:tcPr>
+          <w:p>
+            <w:pPr>
+              <w:spacing w:before="20" w:after="20" w:line="252" w:lineRule="auto"/>
+              <w:jc w:val="center"/>
+            </w:pPr>
+            <w:r>
+              <w:rPr>
+                <w:rFonts w:ascii="Times New Roman" w:hAnsi="Times New Roman"/>
+                <w:sz w:val="16"/>
+              </w:rPr>
+              <w:t>10000</w:t>
+            </w:r>
+          </w:p>
+        </w:tc>
+      </w:tr>
+      <w:tr>
+        <w:trPr>
+          <w:cantSplit/>
+        </w:trPr>
+        <w:tc>
+          <w:tcPr>
+            <w:tcW w:type="dxa" w:w="2477"/>
+            <w:vAlign w:val="center"/>
+          </w:tcPr>
+          <w:p>
+            <w:pPr>
+              <w:spacing w:before="20" w:after="20" w:line="252" w:lineRule="auto"/>
+              <w:jc w:val="left"/>
+            </w:pPr>
+            <w:r>
+              <w:rPr>
+                <w:rFonts w:ascii="Times New Roman" w:hAnsi="Times New Roman"/>
+                <w:sz w:val="16"/>
+              </w:rPr>
+              <w:t>Three permission zones</w:t>
+            </w:r>
+          </w:p>
+        </w:tc>
+        <w:tc>
+          <w:tcPr>
+            <w:tcW w:type="dxa" w:w="1267"/>
+            <w:vAlign w:val="center"/>
+          </w:tcPr>
+          <w:p>
+            <w:pPr>
+              <w:spacing w:before="20" w:after="20" w:line="252" w:lineRule="auto"/>
+              <w:jc w:val="center"/>
+            </w:pPr>
+            <w:r>
+              <w:rPr>
+                <w:rFonts w:ascii="Times New Roman" w:hAnsi="Times New Roman"/>
+                <w:sz w:val="16"/>
+              </w:rPr>
+              <w:t>21</w:t>
+            </w:r>
+          </w:p>
+        </w:tc>
+        <w:tc>
+          <w:tcPr>
+            <w:tcW w:type="dxa" w:w="1440"/>
+            <w:vAlign w:val="center"/>
+          </w:tcPr>
+          <w:p>
+            <w:pPr>
+              <w:spacing w:before="20" w:after="20" w:line="252" w:lineRule="auto"/>
+              <w:jc w:val="center"/>
+            </w:pPr>
+            <w:r>
+              <w:rPr>
+                <w:rFonts w:ascii="Times New Roman" w:hAnsi="Times New Roman"/>
+                <w:sz w:val="16"/>
+              </w:rPr>
+              <w:t>23</w:t>
+            </w:r>
+          </w:p>
+        </w:tc>
+        <w:tc>
+          <w:tcPr>
+            <w:tcW w:type="dxa" w:w="1555"/>
+            <w:vAlign w:val="center"/>
+          </w:tcPr>
+          <w:p>
+            <w:pPr>
+              <w:spacing w:before="20" w:after="20" w:line="252" w:lineRule="auto"/>
+              <w:jc w:val="center"/>
+            </w:pPr>
+            <w:r>
+              <w:rPr>
+                <w:rFonts w:ascii="Times New Roman" w:hAnsi="Times New Roman"/>
+                <w:sz w:val="16"/>
+              </w:rPr>
+              <w:t>21</w:t>
+            </w:r>
+          </w:p>
+        </w:tc>
+        <w:tc>
+          <w:tcPr>
+            <w:tcW w:type="dxa" w:w="1757"/>
+            <w:vAlign w:val="center"/>
+          </w:tcPr>
+          <w:p>
+            <w:pPr>
+              <w:spacing w:before="20" w:after="20" w:line="252" w:lineRule="auto"/>
+              <w:jc w:val="center"/>
+            </w:pPr>
+            <w:r>
+              <w:rPr>
+                <w:rFonts w:ascii="Times New Roman" w:hAnsi="Times New Roman"/>
+                <w:sz w:val="16"/>
+              </w:rPr>
+              <w:t>3</w:t>
+            </w:r>
+          </w:p>
+        </w:tc>
+        <w:tc>
+          <w:tcPr>
+            <w:tcW w:type="dxa" w:w="1584"/>
+            <w:vAlign w:val="center"/>
+          </w:tcPr>
+          <w:p>
+            <w:pPr>
+              <w:spacing w:before="20" w:after="20" w:line="252" w:lineRule="auto"/>
+              <w:jc w:val="center"/>
+            </w:pPr>
+            <w:r>
+              <w:rPr>
+                <w:rFonts w:ascii="Times New Roman" w:hAnsi="Times New Roman"/>
+                <w:sz w:val="16"/>
+              </w:rPr>
+              <w:t>10000</w:t>
+            </w:r>
+          </w:p>
+        </w:tc>
+      </w:tr>
+      <w:tr>
+        <w:trPr>
+          <w:cantSplit/>
+        </w:trPr>
+        <w:tc>
+          <w:tcPr>
+            <w:tcW w:type="dxa" w:w="2477"/>
+            <w:vAlign w:val="center"/>
+          </w:tcPr>
+          <w:p>
+            <w:pPr>
+              <w:spacing w:before="20" w:after="20" w:line="252" w:lineRule="auto"/>
+              <w:jc w:val="left"/>
+            </w:pPr>
+            <w:r>
+              <w:rPr>
+                <w:rFonts w:ascii="Times New Roman" w:hAnsi="Times New Roman"/>
+                <w:sz w:val="16"/>
+              </w:rPr>
+              <w:t>Fragmented + permissions</w:t>
+            </w:r>
+          </w:p>
+        </w:tc>
+        <w:tc>
+          <w:tcPr>
+            <w:tcW w:type="dxa" w:w="1267"/>
+            <w:vAlign w:val="center"/>
+          </w:tcPr>
+          <w:p>
+            <w:pPr>
+              <w:spacing w:before="20" w:after="20" w:line="252" w:lineRule="auto"/>
+              <w:jc w:val="center"/>
+            </w:pPr>
+            <w:r>
+              <w:rPr>
+                <w:rFonts w:ascii="Times New Roman" w:hAnsi="Times New Roman"/>
+                <w:sz w:val="16"/>
+              </w:rPr>
+              <w:t>21</w:t>
+            </w:r>
+          </w:p>
+        </w:tc>
+        <w:tc>
+          <w:tcPr>
+            <w:tcW w:type="dxa" w:w="1440"/>
+            <w:vAlign w:val="center"/>
+          </w:tcPr>
+          <w:p>
+            <w:pPr>
+              <w:spacing w:before="20" w:after="20" w:line="252" w:lineRule="auto"/>
+              <w:jc w:val="center"/>
+            </w:pPr>
+            <w:r>
+              <w:rPr>
+                <w:rFonts w:ascii="Times New Roman" w:hAnsi="Times New Roman"/>
+                <w:sz w:val="16"/>
+              </w:rPr>
+              <w:t>315</w:t>
+            </w:r>
+          </w:p>
+        </w:tc>
+        <w:tc>
+          <w:tcPr>
+            <w:tcW w:type="dxa" w:w="1555"/>
+            <w:vAlign w:val="center"/>
+          </w:tcPr>
+          <w:p>
+            <w:pPr>
+              <w:spacing w:before="20" w:after="20" w:line="252" w:lineRule="auto"/>
+              <w:jc w:val="center"/>
+            </w:pPr>
+            <w:r>
+              <w:rPr>
+                <w:rFonts w:ascii="Times New Roman" w:hAnsi="Times New Roman"/>
+                <w:sz w:val="16"/>
+              </w:rPr>
+              <w:t>315</w:t>
+            </w:r>
+          </w:p>
+        </w:tc>
+        <w:tc>
+          <w:tcPr>
+            <w:tcW w:type="dxa" w:w="1757"/>
+            <w:vAlign w:val="center"/>
+          </w:tcPr>
+          <w:p>
+            <w:pPr>
+              <w:spacing w:before="20" w:after="20" w:line="252" w:lineRule="auto"/>
+              <w:jc w:val="center"/>
+            </w:pPr>
+            <w:r>
+              <w:rPr>
+                <w:rFonts w:ascii="Times New Roman" w:hAnsi="Times New Roman"/>
+                <w:sz w:val="16"/>
+              </w:rPr>
+              <w:t>315</w:t>
+            </w:r>
+          </w:p>
+        </w:tc>
+        <w:tc>
+          <w:tcPr>
+            <w:tcW w:type="dxa" w:w="1584"/>
+            <w:vAlign w:val="center"/>
+          </w:tcPr>
+          <w:p>
+            <w:pPr>
+              <w:spacing w:before="20" w:after="20" w:line="252" w:lineRule="auto"/>
+              <w:jc w:val="center"/>
+            </w:pPr>
+            <w:r>
+              <w:rPr>
+                <w:rFonts w:ascii="Times New Roman" w:hAnsi="Times New Roman"/>
+                <w:sz w:val="16"/>
+              </w:rPr>
+              <w:t>10000</w:t>
+            </w:r>
+          </w:p>
+        </w:tc>
+      </w:tr>
+    </w:tbl>
+    <w:p>
+      <w:pPr>
+        <w:pStyle w:val="SmallNote"/>
+      </w:pPr>
+      <w:r>
+        <w:t>Note. BAP subrecords exclude parent-index and region-descriptor storage; range records are not TLB entries. The x86-like leaf count reflects eligibility under virtual/physical alignment and uniform-permission constraints only. Generic ranges and BAP use hypothetical lookup support. No memory-byte or time cost is measured.</w:t>
+      </w:r>
+    </w:p>
+    <w:p>
+      <w:pPr/>
+      <w:r>
+        <w:t>With contiguous uniform backing, 21 BAP parent chunks correspond to 21 physical/permission subrecords, while a capped generic-range partition needs 20 records and an unbounded range needs only one. Therefore, the structural results do not show that BAP is inherently more compact than generic range metadata. When physical continuity is broken every 32 pages, both BAP and generic range representations require 313 subrecords or records. Under three protection zones, BAP needs 23 subrecords versus 21 capped or 3 unbounded generic-range records. The parent boundaries do not eliminate extra fragmentation and protection metadata.</w:t>
+      </w:r>
+    </w:p>
+    <w:p>
+      <w:pPr/>
+      <w:r>
+        <w:t>The x86-like outcome depends sharply on *both* virtual and physical alignment. At starting VPN 1, contiguous frames beginning at a 2 MiB-aligned PFN have a different phase from the virtual start; no 2 MiB leaf is eligible, so the model needs 10,000 base-page leaves. When phases are matched, 18 2 MiB leaves become eligible and the total falls to 802 leaves. The latter matches the best-case virtual-alignment count from v5, but only under the added physical assumptions. Across all 45 scenarios, translation and permission validation succeeded in the local reference-model rerun; no TLB latency, metadata byte budget, allocation dynamics, or operating-system integration was evaluated.</w:t>
       </w:r>
     </w:p>
     <w:p>
@@ -6418,6 +7259,22 @@
     </w:p>
     <w:p>
       <w:pPr>
+        <w:pStyle w:val="ListBullet"/>
+      </w:pPr>
+      <w:r>
+        <w:t>v6 defines and checks consistent byte-address translations across four software representation models while respecting page permissions and explicit PFN layouts; correctness is conditional on its reference region descriptors and idealized access path.</w:t>
+      </w:r>
+    </w:p>
+    <w:p>
+      <w:pPr>
+        <w:pStyle w:val="ListBullet"/>
+      </w:pPr>
+      <w:r>
+        <w:t>Generic range baselines can equal or beat BAP in record count for contiguous regions, so XOR/MSB-based parent partitioning is not yet shown to improve total metadata space or lookup work.</w:t>
+      </w:r>
+    </w:p>
+    <w:p>
+      <w:pPr>
         <w:pStyle w:val="Heading2"/>
       </w:pPr>
       <w:r>
@@ -6458,6 +7315,14 @@
     </w:p>
     <w:p>
       <w:pPr>
+        <w:pStyle w:val="ListBullet"/>
+      </w:pPr>
+      <w:r>
+        <w:t>v6 does not establish hardware realizability, lower page-walk or TLB costs, compact total metadata, efficient invalidation, or a runtime speedup, despite passing software-model translation tests.</w:t>
+      </w:r>
+    </w:p>
+    <w:p>
+      <w:pPr>
         <w:pStyle w:val="Heading2"/>
       </w:pPr>
       <w:r>
@@ -6466,7 +7331,7 @@
     </w:p>
     <w:p>
       <w:r>
-        <w:t>Before attributing practical benefits to BAP, the design must choose an implementation target: (A) a logical metadata/lookup layer on conventional hardware, evaluated through metadata bytes, region search and update overhead without claims about extra native TLB reach; or (B) a new region-relative hardware translation proposal, with explicit descriptors, physical mapping semantics, leaf construction, permission checks, TLB-fill rules and invalidation costs. The next stage should specify one of these paths and compare its total costs with appropriate range-translation and coalescing alternatives.</w:t>
+        <w:t>The v6 reference semantics provide a consistent physical-frame and permission lookup but intentionally do not choose a production integration target. The next stage must select (A) a software-only metadata layer on conventional hardware, without claimed native TLB-reach improvements, or (B) an explicitly co-designed region-aware translation mechanism. For either path, compare total bytes (region descriptors, parents, child subrecords and indexes), region-search and lookup operations, split/merge/update work, and protection/invalidation costs against strong capped and unbounded range representations. A trace-driven TLB study is warranted only after this architectural budget is defined.</w:t>
       </w:r>
     </w:p>
     <w:p>
@@ -6482,7 +7347,7 @@
         <w:pStyle w:val="ListBullet"/>
       </w:pPr>
       <w:r>
-        <w:t>No OS or hardware implementation: the reported mapping counts and lookup rule do not establish working virtual-to-physical address translation or actual TLB/page-walk performance.</w:t>
+        <w:t>No OS or hardware implementation: v6 constructs and validates virtual-to-physical translations inside a software reference model, but it does not modify kernel paging, install BAP leaves in commodity hardware, or measure a page walker or TLB.</w:t>
       </w:r>
     </w:p>
     <w:p>
@@ -6498,7 +7363,7 @@
         <w:pStyle w:val="ListBullet"/>
       </w:pPr>
       <w:r>
-        <w:t>Virtual vs physical constraints: v5 tests native size and absolute virtual alignment only; no physical contiguity/alignment, fragmentation, NUMA, or compaction is modeled.</w:t>
+        <w:t>Virtual vs physical constraints: v5 audits virtual eligibility; v6 additionally tests fixed, synthetic PFN continuity, alignment phases and permission patterns, but not physical allocator behavior, NUMA, compaction, migration or aliasing.</w:t>
       </w:r>
     </w:p>
     <w:p>
@@ -6523,6 +7388,14 @@
       </w:pPr>
       <w:r>
         <w:t>Hardware and novelty: the region-relative lookup cannot be interpreted as a native huge-page mapping without new support or legal retiling. Costs of metadata, region discovery and translation must be compared against prior region/range-based methods.</w:t>
+      </w:r>
+    </w:p>
+    <w:p>
+      <w:pPr>
+        <w:pStyle w:val="ListBullet"/>
+      </w:pPr>
+      <w:r>
+        <w:t>Representation and cost comparability: parent chunks, range records and native page-table leaves are not the same architectural objects. v6 counts omit descriptor and index bytes, cache locality, region discovery cost, update frequency and actual ISA/hardware integration.</w:t>
       </w:r>
     </w:p>
     <w:p>
@@ -6589,9 +7462,24 @@
     <w:p>
       <w:pPr>
         <w:pStyle w:val="Heading2"/>
-      </w:pPr>
-      <w:r>
-        <w:t>10.5 Buddy allocation</w:t>
+        <w:keepNext/>
+      </w:pPr>
+      <w:r>
+        <w:t>10.5 Generic range representations as strong baselines</w:t>
+      </w:r>
+    </w:p>
+    <w:p>
+      <w:pPr/>
+      <w:r>
+        <w:t>The v6 capped and unlimited generic range models encode contiguous, permission-uniform VA-to-PA runs without imposing BAP binary parent boundaries. They are deliberately abstract comparators: neither is presented as an implementation of an existing range-TLB architecture, Direct Segments [4], or the coalescing mechanisms discussed in [6]. The comparison indicates that BAP needs an explicit lookup/metadata-cost argument rather than an inference from parent-chunk count alone. Direct quantitative comparisons against published hardware range-translation methods remain future work.</w:t>
+      </w:r>
+    </w:p>
+    <w:p>
+      <w:pPr>
+        <w:pStyle w:val="Heading2"/>
+      </w:pPr>
+      <w:r>
+        <w:t>10.6 Buddy allocation</w:t>
       </w:r>
     </w:p>
     <w:p>
@@ -6609,17 +7497,17 @@
     </w:p>
     <w:p>
       <w:r>
-        <w:t>This study introduced BAP as a logical region-relative representation with descending power-of-two decomposition and an XOR/MSB rule that identifies the containing chunk. The existing correctness argument covers logical chunk identification; it does not prove native address-translation feasibility.</w:t>
-      </w:r>
-    </w:p>
-    <w:p>
-      <w:r>
-        <w:t>Simulators v2–v4 show that BAP limited can greatly reduce *logical* chunk counts versus fixed-size pages and matches idealized multi-size schemes at aligned starts under a shared cap. The apparent benefit at unaligned starts depends on treating relative chunks as translation entries. The v5 virtual-alignment audit makes this dependence explicit: for a 10,000-page region starting at virtual page 1, none of the 21 original BAP limited chunks is a directly eligible native leaf in the tested profiles; aligned retiling produces 30 leaves in a hypothetical all-power-of-two profile and 802 in a 4 KiB/2 MiB profile. The workload and splitting figures remain synthetic, policy-dependent proxies.</w:t>
-      </w:r>
-    </w:p>
-    <w:p>
-      <w:r>
-        <w:t>Consequently, these results support further investigation of BAP's region representation and lookup method, not a demonstrated TLB speedup or kernel-ready alternative. The next research task is to specify a complete translation interface or restrict the claim to a metadata organization on existing hardware, then measure its incremental costs and benefits against established range-mapping methods.</w:t>
+        <w:t>This study introduced BAP as a logical region-relative representation based on descending power-of-two decomposition and an XOR/MSB rule for identifying the containing chunk. The logical lookup theorem does not alone establish a native virtual-memory translation mechanism.</w:t>
+      </w:r>
+    </w:p>
+    <w:p>
+      <w:r>
+        <w:t>Simulators v2–v4 show reduced logical chunk counts relative to fixed pages, while matching strong idealized multi-size baselines under equal aligned-size constraints. The v5 audit establishes that original region-relative chunks may fail native size and alignment conditions. The new v6 software model adds per-base-page physical frames and protection semantics, testing BAP against capped/unbounded generic ranges and 4 KiB/2 MiB page leaves in 45 deterministic scenarios. Its reference translations and access checks pass, but a 10,000-page uniform region beginning at VPN 1 uses 21 BAP subrecords versus 20 capped or one unbounded generic range record. Fragmentation every 32 pages grows the BAP and generic-range counts to 313. The x86-like model needs 10,000 leaves when physical and virtual phases differ, or 802 with matched phases. These counts are structural and architecture-dependent.</w:t>
+      </w:r>
+    </w:p>
+    <w:p>
+      <w:r>
+        <w:t>These findings support BAP as an experimentally testable organization and lookup proposal, not a demonstrated hardware-level improvement. The immediate next work is an explicit metadata-byte, region-lookup and update-cost analysis against strong generic range representations, followed by architecture-appropriate TLB experiments only if a credible integration path is specified.</w:t>
       </w:r>
     </w:p>
     <w:p>
@@ -6710,7 +7598,13 @@
     </w:p>
     <w:p>
       <w:r>
-        <w:t>[8] BAP simulation artifacts, project repository: https://github.com/abdojat/binary-adaptive-paging (simulator_v2.py, simulator_v3_workloads.py, sensitivity_v4.py and archived result tables). The v5 feasibility script and summary are a separate supplementary artifact pending repository integration.</w:t>
+        <w:t>[8] Binary Adaptive Paging project repository, including simulators v2–v4, feasibility_v5.py and results_v5/feasibility_summary_v5.csv: https://github.com/abdojat/binary-adaptive-paging (repository state accessed 16 October 2026).</w:t>
+      </w:r>
+    </w:p>
+    <w:p>
+      <w:pPr/>
+      <w:r>
+        <w:t>[9] BAP v6 supplementary experiment artifacts for this manuscript: translation_v6.py and results_v6/translation_semantics_v6.csv (software-model validation; to be versioned in the repository before scientific submission).</w:t>
       </w:r>
     </w:p>
     <w:p>
@@ -6723,7 +7617,7 @@
     </w:p>
     <w:p>
       <w:r>
-        <w:t>The original v2–v4 results can be regenerated using the commands below. The supplementary v5 structural audit uses Python's standard library only and produces 72 cases in results_v5/feasibility_summary_v5.csv; its code and outputs should be committed with a fixed revision before submission.</w:t>
+        <w:t>The archived v2–v4 results can be regenerated with the commands below. v5 uses standard-library-only Python and produces 72 cases; v6 imports feasibility_v5.py, requires Python 3.10+ and the standard library, and produces 45 deterministic physical-layout/permission cases. The v6 rerun reproduced the supplied CSV exactly. Preserve the commands, input layout definitions, source commit, Python version and file checksums for submission. v3 hash-based workload seeds should be repaired and those older stochastic results rerun before they are treated as reproducible.</w:t>
       </w:r>
     </w:p>
     <w:tbl>
@@ -6742,7 +7636,14 @@
             <w:shd w:val="clear" w:color="auto" w:fill="F2F2F2"/>
           </w:tcPr>
           <w:p>
-            <w:r>
+            <w:pPr>
+              <w:jc w:val="left"/>
+            </w:pPr>
+            <w:r>
+              <w:rPr>
+                <w:rFonts w:ascii="Consolas" w:hAnsi="Consolas"/>
+                <w:sz w:val="17"/>
+              </w:rPr>
               <w:t>python simulator_v2.py --validate --tlb-entries 64</w:t>
               <w:br/>
               <w:t>python simulator_v3_workloads.py --validate --tlb-entries 64</w:t>
@@ -6750,6 +7651,8 @@
               <w:t>python sensitivity_v4.py --simulator-path simulator_v3_workloads.py</w:t>
               <w:br/>
               <w:t>python feasibility_v5.py --validate --out results_v5/feasibility_summary_v5.csv</w:t>
+              <w:br/>
+              <w:t>python translation_v6.py --validate --out results_v6/translation_semantics_v6.csv</w:t>
             </w:r>
           </w:p>
         </w:tc>
@@ -6850,8 +7753,32 @@
       </w:r>
     </w:p>
     <w:p>
-      <w:r>
-        <w:t>The public repository currently contains the earlier simulator versions and their results. The v5 feasibility script, report, and CSV are supplied separately with this revision and should be added to the public repository before scientific submission. After fixing the v3 Python hash-based seed, rerun and record exact commands, Python/dependency versions, code revision, and output checksums.</w:t>
+      <w:pPr>
+        <w:pStyle w:val="ListBullet"/>
+      </w:pPr>
+      <w:r>
+        <w:t>feasibility_summary_v5.csv</w:t>
+      </w:r>
+    </w:p>
+    <w:p>
+      <w:pPr>
+        <w:pStyle w:val="ListBullet"/>
+      </w:pPr>
+      <w:r>
+        <w:t>translation_v6.py</w:t>
+      </w:r>
+    </w:p>
+    <w:p>
+      <w:pPr>
+        <w:pStyle w:val="ListBullet"/>
+      </w:pPr>
+      <w:r>
+        <w:t>translation_semantics_v6.csv</w:t>
+      </w:r>
+    </w:p>
+    <w:p>
+      <w:r>
+        <w:t>The repository contains the v5 feasibility script and summary as of the checked October 2026 revision. The supplied v6 script and CSV are supplementary files and should be added to the repository at a fixed commit before paper submission. Re-run verification and record exact commands, runtime versions and checksums. No hardware results are included in these artifacts.</w:t>
       </w:r>
     </w:p>
     <w:p/>

</xml_diff>

<commit_message>
Refactor Binary Adaptive Paging (BAP) documentation and update performance evaluation
- Revised abstract to clarify BAP's methodology and performance comparisons with capped and unbounded ranges.
- Added details on the v8 C++20 software-lookup microbenchmark, including execution results and performance metrics.
- Enhanced sections on contributions, background, and design overview for better clarity and coherence.
- Updated tables and figures to reflect new findings and ensure consistency in terminology and formatting.
- Included discussions on limitations, threats to validity, and reproducibility notes to provide comprehensive context for the research.
</commit_message>
<xml_diff>
--- a/Binary Adaptive Paging.docx
+++ b/Binary Adaptive Paging.docx
@@ -82,12 +82,12 @@
     </w:p>
     <w:p>
       <w:r>
-        <w:t>Binary Adaptive Paging (BAP) divides a virtual-memory region into descending power-of-two logical chunks and locates a chunk using MSB(a XOR S), where a is an offset and S is the region size in base pages. Earlier evaluations (v2–v4) examined logical chunk counts and synthetic access/splitting effects; v5 identified virtual-alignment and page-size eligibility constraints; and v6 validated software-model virtual-to-physical translations and protection under 45 deterministic layouts. The new v7 study compares BAP against capped and unbounded generic contiguous-range representations using an explicitly assumed compact metadata layout and instrumented binary-search key comparisons. Across 540 synthetic scenario/trace rows, BAP uses no fewer modeled metadata bytes than either generic-range comparator. For a 10,000-page contiguous region it requires 704 bytes, versus 512 bytes for capped ranges and 56 bytes for unbounded ranges; under 32-page fragmentation the corresponding amounts are 7,712 and 7,544 bytes for both range baselines. BAP reduces child-list search-key comparisons in fragmented cases (4.039 vs. 8.377 on average for uniform-random accesses), but the count excludes XOR/MSB, parent indexing, memory accesses, and cache effects. These are model-derived storage and search-shape results, not hardware memory footprints or translation-time measurements. The findings support BAP as a correct logical organization with an unproven systems-performance advantage.</w:t>
-      </w:r>
-    </w:p>
-    <w:p>
-      <w:r>
-        <w:t>Keywords: virtual memory, binary decomposition, XOR/MSB lookup, range translation, metadata overhead, binary search, software model, translation correctness</w:t>
+        <w:t>Binary Adaptive Paging (BAP) decomposes virtual-memory regions into descending power-of-two logical chunks, with a compact XOR/MSB rule for identifying the chunk containing an address. Prior simulations (v2-v4) study structural decomposition and synthetic workloads; v5 audits native page-size and virtual-alignment eligibility; v6 verifies software-model physical-frame translation and permissions; and v7 accounts for hypothetical metadata bytes and binary-search comparisons. We extend the evaluation with v8, a C++20 software-lookup microbenchmark comparing BAP with globally searched capped and unbounded contiguous ranges and a stronger directly indexed capped-range baseline. Two independent pilot executions each produced 540 synthetic scenario/trace measurements. For a 10,000-page region with uniform-random accesses, BAP was slower than indexed ranges under contiguous backing (3.36 vs. 2.33 ns/lookup) but faster with deterministic 32-page physical fragmentation (27.66 vs. 31.53 ns/lookup). Under combined fragmentation and permission changes, the medians were nearly equal. The sampled machine was virtualized and inter-run variation was material, so these results are exploratory, not stable performance claims. A separate local execution passed correctness validation and generated 540 rows, but its CSV measurements were not supplied for aggregation. BAP has no demonstrated universal metadata or translation-performance advantage; hardware-TLB evaluation remains future work.</w:t>
+      </w:r>
+    </w:p>
+    <w:p>
+      <w:r>
+        <w:t>Keywords: virtual memory, Binary Adaptive Paging, XOR/MSB lookup, region indexing, contiguous ranges, indexed range baseline, software microbenchmark, memory metadata, preliminary performance evaluation</w:t>
       </w:r>
     </w:p>
     <w:p>
@@ -249,6 +249,12 @@
       </w:r>
     </w:p>
     <w:p>
+      <w:pPr/>
+      <w:r>
+        <w:t>The v8 pilot now tests full native-code software lookup cost against an explicit indexed-range competitor. It complements, but does not replace, the v7 metadata-model results or establish a hardware paging improvement.</w:t>
+      </w:r>
+    </w:p>
+    <w:p>
       <w:pPr>
         <w:pStyle w:val="Heading2"/>
       </w:pPr>
@@ -306,6 +312,12 @@
       <w:pPr/>
       <w:r>
         <w:t>7. A v7 synthetic metadata-budget and instrumented lookup-comparison study, reporting both a negative storage result and the bounded interpretation of reduced child-list key comparisons.</w:t>
+      </w:r>
+    </w:p>
+    <w:p>
+      <w:pPr/>
+      <w:r>
+        <w:t>8. A C++20 exploratory lookup microbenchmark (v8) against three generic-range implementations, including a region-relative indexed baseline; it reports workload-dependent rankings and cross-run variability rather than a claim of universal performance superiority.</w:t>
       </w:r>
     </w:p>
     <w:p>
@@ -2209,6 +2221,392 @@
       </w:pPr>
       <w:r>
         <w:t>Note. The run record comprises start VPN (8 bytes), length (4), start PFN (8), permissions (1), and padding/reserved bytes (3). A parent slot uses two 4-byte indices. Byte totals are layout assumptions, not Python object sizes or real kernel allocations.</w:t>
+      </w:r>
+    </w:p>
+    <w:p>
+      <w:pPr>
+        <w:pStyle w:val="Heading2"/>
+        <w:keepNext/>
+      </w:pPr>
+      <w:r>
+        <w:t>6.8 Native-code software lookup microbenchmark protocol (v8)</w:t>
+      </w:r>
+    </w:p>
+    <w:p>
+      <w:pPr/>
+      <w:r>
+        <w:t>To test whether reduced child-list comparisons translate into lower software lookup time, v8 implements four translation-record search variants in a compiled C++20 microbenchmark: (1) BAP arithmetic parent selection plus a local binary search of child runs; (2) a global binary search of capped (512-page) contiguous-range records; (3) a global binary search of unbounded contiguous-range records; and (4) a stronger indexed-range scheme using the same capped-range records but an 8-byte directory entry per 512-page region-relative bucket, followed by a bucket-local binary search. Each method returns the same VPN-to-PFN and protection information. All cases undergo exhaustive page-wise semantic validation before timing; the timed path incorporates a translation-dependent checksum to discourage unused-result elimination.</w:t>
+      </w:r>
+    </w:p>
+    <w:p>
+      <w:pPr/>
+      <w:r>
+        <w:t>The test grid includes region sizes 1,000, 4,096 and 10,000 pages; initial VPNs 0, 1 and 7; five deterministic physical/permission layouts; four address-access patterns (uniform random, sequential, hot/cold and boundary stress); and trace seeds 1, 2 and 3, totaling 540 case/trace rows per program execution. Each row is timed using 4,096 lookups and five repeated measurement passes with rotated method order. The per-method median ns/lookup is recorded. Two separate executions of the supplied pilot on a virtualized x86_64 host yielded 540 rows each. Boundary-stress traces are deterministic and the nominal seeds are not independent samples for that pattern. These are *in-process software-record lookups*, not kernel page-table translation or TLB timing.</w:t>
+      </w:r>
+    </w:p>
+    <w:p>
+      <w:pPr/>
+      <w:r>
+        <w:t>The pilot host was a virtualized Intel Xeon Platinum 8573C system (KVM, five allocated vCPUs), using GCC 14.2.0 with -O3 -std=c++20. Metadata byte estimates retain v7 assumptions: a shared 32-byte region descriptor, 24 bytes per run record, and 8 bytes per BAP-parent or indexed-range directory slot. They exclude container/allocator overhead and region-discovery indexes. Timing excludes mapping creation and updates, OS page walks, TLB activity, shootdowns, and whole-application behavior. Microsecond and nanosecond-scale numbers from virtualized execution must not be generalized beyond this pilot.</w:t>
+      </w:r>
+    </w:p>
+    <w:p>
+      <w:pPr>
+        <w:pStyle w:val="Caption"/>
+      </w:pPr>
+      <w:r>
+        <w:t>Table 4b. Lookup schemes and what is actually timed (v8).</w:t>
+      </w:r>
+    </w:p>
+    <w:tbl>
+      <w:tblPr>
+        <w:tblStyle w:val="TableGrid"/>
+        <w:tblW w:type="auto" w:w="0"/>
+        <w:jc w:val="center"/>
+        <w:tblLayout w:type="autofit"/>
+        <w:tblLook w:firstColumn="1" w:firstRow="1" w:lastColumn="0" w:lastRow="0" w:noHBand="0" w:noVBand="1" w:val="04A0"/>
+      </w:tblPr>
+      <w:tblGrid>
+        <w:gridCol w:w="3360"/>
+        <w:gridCol w:w="3360"/>
+        <w:gridCol w:w="3360"/>
+      </w:tblGrid>
+      <w:tr>
+        <w:trPr>
+          <w:cantSplit/>
+          <w:tblHeader/>
+        </w:trPr>
+        <w:tc>
+          <w:tcPr>
+            <w:tcW w:type="dxa" w:w="3360"/>
+            <w:vAlign w:val="center"/>
+            <w:shd w:fill="DFEAF4"/>
+          </w:tcPr>
+          <w:p>
+            <w:pPr>
+              <w:spacing w:before="20" w:after="20" w:line="247" w:lineRule="auto"/>
+              <w:jc w:val="left"/>
+            </w:pPr>
+            <w:r>
+              <w:rPr>
+                <w:rFonts w:ascii="Times New Roman" w:hAnsi="Times New Roman"/>
+                <w:b/>
+                <w:sz w:val="16"/>
+              </w:rPr>
+              <w:t>Scheme</w:t>
+            </w:r>
+          </w:p>
+        </w:tc>
+        <w:tc>
+          <w:tcPr>
+            <w:tcW w:type="dxa" w:w="3360"/>
+            <w:vAlign w:val="center"/>
+            <w:shd w:fill="DFEAF4"/>
+          </w:tcPr>
+          <w:p>
+            <w:pPr>
+              <w:spacing w:before="20" w:after="20" w:line="247" w:lineRule="auto"/>
+              <w:jc w:val="center"/>
+            </w:pPr>
+            <w:r>
+              <w:rPr>
+                <w:rFonts w:ascii="Times New Roman" w:hAnsi="Times New Roman"/>
+                <w:b/>
+                <w:sz w:val="16"/>
+              </w:rPr>
+              <w:t>Search interface</w:t>
+            </w:r>
+          </w:p>
+        </w:tc>
+        <w:tc>
+          <w:tcPr>
+            <w:tcW w:type="dxa" w:w="3360"/>
+            <w:vAlign w:val="center"/>
+            <w:shd w:fill="DFEAF4"/>
+          </w:tcPr>
+          <w:p>
+            <w:pPr>
+              <w:spacing w:before="20" w:after="20" w:line="247" w:lineRule="auto"/>
+              <w:jc w:val="center"/>
+            </w:pPr>
+            <w:r>
+              <w:rPr>
+                <w:rFonts w:ascii="Times New Roman" w:hAnsi="Times New Roman"/>
+                <w:b/>
+                <w:sz w:val="16"/>
+              </w:rPr>
+              <w:t>Extra directory</w:t>
+            </w:r>
+          </w:p>
+        </w:tc>
+      </w:tr>
+      <w:tr>
+        <w:trPr>
+          <w:cantSplit/>
+        </w:trPr>
+        <w:tc>
+          <w:tcPr>
+            <w:tcW w:type="dxa" w:w="3360"/>
+            <w:vAlign w:val="center"/>
+          </w:tcPr>
+          <w:p>
+            <w:pPr>
+              <w:spacing w:before="20" w:after="20" w:line="247" w:lineRule="auto"/>
+              <w:jc w:val="left"/>
+            </w:pPr>
+            <w:r>
+              <w:rPr>
+                <w:rFonts w:ascii="Times New Roman" w:hAnsi="Times New Roman"/>
+                <w:b w:val="0"/>
+                <w:sz w:val="16"/>
+              </w:rPr>
+              <w:t>BAP</w:t>
+            </w:r>
+          </w:p>
+        </w:tc>
+        <w:tc>
+          <w:tcPr>
+            <w:tcW w:type="dxa" w:w="3360"/>
+            <w:vAlign w:val="center"/>
+          </w:tcPr>
+          <w:p>
+            <w:pPr>
+              <w:spacing w:before="20" w:after="20" w:line="247" w:lineRule="auto"/>
+              <w:jc w:val="center"/>
+            </w:pPr>
+            <w:r>
+              <w:rPr>
+                <w:rFonts w:ascii="Times New Roman" w:hAnsi="Times New Roman"/>
+                <w:b w:val="0"/>
+                <w:sz w:val="16"/>
+              </w:rPr>
+              <w:t>Parent arithmetic + parent-local binary search</w:t>
+            </w:r>
+          </w:p>
+        </w:tc>
+        <w:tc>
+          <w:tcPr>
+            <w:tcW w:type="dxa" w:w="3360"/>
+            <w:vAlign w:val="center"/>
+          </w:tcPr>
+          <w:p>
+            <w:pPr>
+              <w:spacing w:before="20" w:after="20" w:line="247" w:lineRule="auto"/>
+              <w:jc w:val="center"/>
+            </w:pPr>
+            <w:r>
+              <w:rPr>
+                <w:rFonts w:ascii="Times New Roman" w:hAnsi="Times New Roman"/>
+                <w:b w:val="0"/>
+                <w:sz w:val="16"/>
+              </w:rPr>
+              <w:t>8 B per BAP parent</w:t>
+            </w:r>
+          </w:p>
+        </w:tc>
+      </w:tr>
+      <w:tr>
+        <w:trPr>
+          <w:cantSplit/>
+        </w:trPr>
+        <w:tc>
+          <w:tcPr>
+            <w:tcW w:type="dxa" w:w="3360"/>
+            <w:vAlign w:val="center"/>
+          </w:tcPr>
+          <w:p>
+            <w:pPr>
+              <w:spacing w:before="20" w:after="20" w:line="247" w:lineRule="auto"/>
+              <w:jc w:val="left"/>
+            </w:pPr>
+            <w:r>
+              <w:rPr>
+                <w:rFonts w:ascii="Times New Roman" w:hAnsi="Times New Roman"/>
+                <w:b w:val="0"/>
+                <w:sz w:val="16"/>
+              </w:rPr>
+              <w:t>Range cap512</w:t>
+            </w:r>
+          </w:p>
+        </w:tc>
+        <w:tc>
+          <w:tcPr>
+            <w:tcW w:type="dxa" w:w="3360"/>
+            <w:vAlign w:val="center"/>
+          </w:tcPr>
+          <w:p>
+            <w:pPr>
+              <w:spacing w:before="20" w:after="20" w:line="247" w:lineRule="auto"/>
+              <w:jc w:val="center"/>
+            </w:pPr>
+            <w:r>
+              <w:rPr>
+                <w:rFonts w:ascii="Times New Roman" w:hAnsi="Times New Roman"/>
+                <w:b w:val="0"/>
+                <w:sz w:val="16"/>
+              </w:rPr>
+              <w:t>Global binary search in capped run list</w:t>
+            </w:r>
+          </w:p>
+        </w:tc>
+        <w:tc>
+          <w:tcPr>
+            <w:tcW w:type="dxa" w:w="3360"/>
+            <w:vAlign w:val="center"/>
+          </w:tcPr>
+          <w:p>
+            <w:pPr>
+              <w:spacing w:before="20" w:after="20" w:line="247" w:lineRule="auto"/>
+              <w:jc w:val="center"/>
+            </w:pPr>
+            <w:r>
+              <w:rPr>
+                <w:rFonts w:ascii="Times New Roman" w:hAnsi="Times New Roman"/>
+                <w:b w:val="0"/>
+                <w:sz w:val="16"/>
+              </w:rPr>
+              <w:t>None</w:t>
+            </w:r>
+          </w:p>
+        </w:tc>
+      </w:tr>
+      <w:tr>
+        <w:trPr>
+          <w:cantSplit/>
+        </w:trPr>
+        <w:tc>
+          <w:tcPr>
+            <w:tcW w:type="dxa" w:w="3360"/>
+            <w:vAlign w:val="center"/>
+          </w:tcPr>
+          <w:p>
+            <w:pPr>
+              <w:spacing w:before="20" w:after="20" w:line="247" w:lineRule="auto"/>
+              <w:jc w:val="left"/>
+            </w:pPr>
+            <w:r>
+              <w:rPr>
+                <w:rFonts w:ascii="Times New Roman" w:hAnsi="Times New Roman"/>
+                <w:b w:val="0"/>
+                <w:sz w:val="16"/>
+              </w:rPr>
+              <w:t>Range unbounded</w:t>
+            </w:r>
+          </w:p>
+        </w:tc>
+        <w:tc>
+          <w:tcPr>
+            <w:tcW w:type="dxa" w:w="3360"/>
+            <w:vAlign w:val="center"/>
+          </w:tcPr>
+          <w:p>
+            <w:pPr>
+              <w:spacing w:before="20" w:after="20" w:line="247" w:lineRule="auto"/>
+              <w:jc w:val="center"/>
+            </w:pPr>
+            <w:r>
+              <w:rPr>
+                <w:rFonts w:ascii="Times New Roman" w:hAnsi="Times New Roman"/>
+                <w:b w:val="0"/>
+                <w:sz w:val="16"/>
+              </w:rPr>
+              <w:t>Global binary search in unrestricted run list</w:t>
+            </w:r>
+          </w:p>
+        </w:tc>
+        <w:tc>
+          <w:tcPr>
+            <w:tcW w:type="dxa" w:w="3360"/>
+            <w:vAlign w:val="center"/>
+          </w:tcPr>
+          <w:p>
+            <w:pPr>
+              <w:spacing w:before="20" w:after="20" w:line="247" w:lineRule="auto"/>
+              <w:jc w:val="center"/>
+            </w:pPr>
+            <w:r>
+              <w:rPr>
+                <w:rFonts w:ascii="Times New Roman" w:hAnsi="Times New Roman"/>
+                <w:b w:val="0"/>
+                <w:sz w:val="16"/>
+              </w:rPr>
+              <w:t>None</w:t>
+            </w:r>
+          </w:p>
+        </w:tc>
+      </w:tr>
+      <w:tr>
+        <w:trPr>
+          <w:cantSplit/>
+        </w:trPr>
+        <w:tc>
+          <w:tcPr>
+            <w:tcW w:type="dxa" w:w="3360"/>
+            <w:vAlign w:val="center"/>
+          </w:tcPr>
+          <w:p>
+            <w:pPr>
+              <w:spacing w:before="20" w:after="20" w:line="247" w:lineRule="auto"/>
+              <w:jc w:val="left"/>
+            </w:pPr>
+            <w:r>
+              <w:rPr>
+                <w:rFonts w:ascii="Times New Roman" w:hAnsi="Times New Roman"/>
+                <w:b w:val="0"/>
+                <w:sz w:val="16"/>
+              </w:rPr>
+              <w:t>Range indexed</w:t>
+            </w:r>
+          </w:p>
+        </w:tc>
+        <w:tc>
+          <w:tcPr>
+            <w:tcW w:type="dxa" w:w="3360"/>
+            <w:vAlign w:val="center"/>
+          </w:tcPr>
+          <w:p>
+            <w:pPr>
+              <w:spacing w:before="20" w:after="20" w:line="247" w:lineRule="auto"/>
+              <w:jc w:val="center"/>
+            </w:pPr>
+            <w:r>
+              <w:rPr>
+                <w:rFonts w:ascii="Times New Roman" w:hAnsi="Times New Roman"/>
+                <w:b w:val="0"/>
+                <w:sz w:val="16"/>
+              </w:rPr>
+              <w:t>512-page bucket directory + local binary search</w:t>
+            </w:r>
+          </w:p>
+        </w:tc>
+        <w:tc>
+          <w:tcPr>
+            <w:tcW w:type="dxa" w:w="3360"/>
+            <w:vAlign w:val="center"/>
+          </w:tcPr>
+          <w:p>
+            <w:pPr>
+              <w:spacing w:before="20" w:after="20" w:line="247" w:lineRule="auto"/>
+              <w:jc w:val="center"/>
+            </w:pPr>
+            <w:r>
+              <w:rPr>
+                <w:rFonts w:ascii="Times New Roman" w:hAnsi="Times New Roman"/>
+                <w:b w:val="0"/>
+                <w:sz w:val="16"/>
+              </w:rPr>
+              <w:t>8 B per bucket</w:t>
+            </w:r>
+          </w:p>
+        </w:tc>
+      </w:tr>
+    </w:tbl>
+    <w:p>
+      <w:pPr>
+        <w:pStyle w:val="SmallNote"/>
+      </w:pPr>
+      <w:r>
+        <w:t>Note. Every variant is a software metadata lookup over synthetic layouts, not a supported x86 leaf mapping. The common region descriptor is treated as already selected; discovery among many VMAs is excluded.</w:t>
       </w:r>
     </w:p>
     <w:p>
@@ -8484,6 +8882,1390 @@
     </w:p>
     <w:p>
       <w:pPr>
+        <w:pStyle w:val="Heading2"/>
+        <w:keepNext/>
+      </w:pPr>
+      <w:r>
+        <w:t>7.8 Exploratory software lookup latency and indexed-range baseline (v8)</w:t>
+      </w:r>
+    </w:p>
+    <w:p>
+      <w:pPr/>
+      <w:r>
+        <w:t>The following descriptive tables summarize the supplied v8 pilot results only. For each layout, S = 10,000 base pages, initial VPN = 1, and uniform-random access, the figures are medians across three trace seeds in each of two separate program executions (six case-level observations). The complete dataset consists of two 540-row CSV files. The table is not a latency claim for a production memory-management system.</w:t>
+      </w:r>
+    </w:p>
+    <w:p>
+      <w:pPr>
+        <w:pStyle w:val="Caption"/>
+      </w:pPr>
+      <w:r>
+        <w:t>Table 13. Pilot software lookup ns/access (S = 10,000; initial VPN = 1; uniform random; v8).</w:t>
+      </w:r>
+    </w:p>
+    <w:tbl>
+      <w:tblPr>
+        <w:tblStyle w:val="TableGrid"/>
+        <w:tblW w:type="auto" w:w="0"/>
+        <w:jc w:val="center"/>
+        <w:tblLayout w:type="autofit"/>
+        <w:tblLook w:firstColumn="1" w:firstRow="1" w:lastColumn="0" w:lastRow="0" w:noHBand="0" w:noVBand="1" w:val="04A0"/>
+      </w:tblPr>
+      <w:tblGrid>
+        <w:gridCol w:w="2016"/>
+        <w:gridCol w:w="2016"/>
+        <w:gridCol w:w="2016"/>
+        <w:gridCol w:w="2016"/>
+        <w:gridCol w:w="2016"/>
+      </w:tblGrid>
+      <w:tr>
+        <w:trPr>
+          <w:cantSplit/>
+          <w:tblHeader/>
+        </w:trPr>
+        <w:tc>
+          <w:tcPr>
+            <w:tcW w:type="dxa" w:w="2016"/>
+            <w:vAlign w:val="center"/>
+            <w:shd w:fill="DFEAF4"/>
+          </w:tcPr>
+          <w:p>
+            <w:pPr>
+              <w:spacing w:before="20" w:after="20" w:line="247" w:lineRule="auto"/>
+              <w:jc w:val="left"/>
+            </w:pPr>
+            <w:r>
+              <w:rPr>
+                <w:rFonts w:ascii="Times New Roman" w:hAnsi="Times New Roman"/>
+                <w:b/>
+                <w:sz w:val="15"/>
+              </w:rPr>
+              <w:t>Physical / permission layout</w:t>
+            </w:r>
+          </w:p>
+        </w:tc>
+        <w:tc>
+          <w:tcPr>
+            <w:tcW w:type="dxa" w:w="2016"/>
+            <w:vAlign w:val="center"/>
+            <w:shd w:fill="DFEAF4"/>
+          </w:tcPr>
+          <w:p>
+            <w:pPr>
+              <w:spacing w:before="20" w:after="20" w:line="247" w:lineRule="auto"/>
+              <w:jc w:val="center"/>
+            </w:pPr>
+            <w:r>
+              <w:rPr>
+                <w:rFonts w:ascii="Times New Roman" w:hAnsi="Times New Roman"/>
+                <w:b/>
+                <w:sz w:val="15"/>
+              </w:rPr>
+              <w:t>BAP</w:t>
+            </w:r>
+          </w:p>
+        </w:tc>
+        <w:tc>
+          <w:tcPr>
+            <w:tcW w:type="dxa" w:w="2016"/>
+            <w:vAlign w:val="center"/>
+            <w:shd w:fill="DFEAF4"/>
+          </w:tcPr>
+          <w:p>
+            <w:pPr>
+              <w:spacing w:before="20" w:after="20" w:line="247" w:lineRule="auto"/>
+              <w:jc w:val="center"/>
+            </w:pPr>
+            <w:r>
+              <w:rPr>
+                <w:rFonts w:ascii="Times New Roman" w:hAnsi="Times New Roman"/>
+                <w:b/>
+                <w:sz w:val="15"/>
+              </w:rPr>
+              <w:t>Range cap512</w:t>
+            </w:r>
+          </w:p>
+        </w:tc>
+        <w:tc>
+          <w:tcPr>
+            <w:tcW w:type="dxa" w:w="2016"/>
+            <w:vAlign w:val="center"/>
+            <w:shd w:fill="DFEAF4"/>
+          </w:tcPr>
+          <w:p>
+            <w:pPr>
+              <w:spacing w:before="20" w:after="20" w:line="247" w:lineRule="auto"/>
+              <w:jc w:val="center"/>
+            </w:pPr>
+            <w:r>
+              <w:rPr>
+                <w:rFonts w:ascii="Times New Roman" w:hAnsi="Times New Roman"/>
+                <w:b/>
+                <w:sz w:val="15"/>
+              </w:rPr>
+              <w:t>Range unbounded</w:t>
+            </w:r>
+          </w:p>
+        </w:tc>
+        <w:tc>
+          <w:tcPr>
+            <w:tcW w:type="dxa" w:w="2016"/>
+            <w:vAlign w:val="center"/>
+            <w:shd w:fill="DFEAF4"/>
+          </w:tcPr>
+          <w:p>
+            <w:pPr>
+              <w:spacing w:before="20" w:after="20" w:line="247" w:lineRule="auto"/>
+              <w:jc w:val="center"/>
+            </w:pPr>
+            <w:r>
+              <w:rPr>
+                <w:rFonts w:ascii="Times New Roman" w:hAnsi="Times New Roman"/>
+                <w:b/>
+                <w:sz w:val="15"/>
+              </w:rPr>
+              <w:t>Range indexed</w:t>
+            </w:r>
+          </w:p>
+        </w:tc>
+      </w:tr>
+      <w:tr>
+        <w:trPr>
+          <w:cantSplit/>
+        </w:trPr>
+        <w:tc>
+          <w:tcPr>
+            <w:tcW w:type="dxa" w:w="2016"/>
+            <w:vAlign w:val="center"/>
+          </w:tcPr>
+          <w:p>
+            <w:pPr>
+              <w:spacing w:before="20" w:after="20" w:line="247" w:lineRule="auto"/>
+              <w:jc w:val="left"/>
+            </w:pPr>
+            <w:r>
+              <w:rPr>
+                <w:rFonts w:ascii="Times New Roman" w:hAnsi="Times New Roman"/>
+                <w:b w:val="0"/>
+                <w:sz w:val="15"/>
+              </w:rPr>
+              <w:t>Contiguous</w:t>
+            </w:r>
+          </w:p>
+        </w:tc>
+        <w:tc>
+          <w:tcPr>
+            <w:tcW w:type="dxa" w:w="2016"/>
+            <w:vAlign w:val="center"/>
+          </w:tcPr>
+          <w:p>
+            <w:pPr>
+              <w:spacing w:before="20" w:after="20" w:line="247" w:lineRule="auto"/>
+              <w:jc w:val="center"/>
+            </w:pPr>
+            <w:r>
+              <w:rPr>
+                <w:rFonts w:ascii="Times New Roman" w:hAnsi="Times New Roman"/>
+                <w:b w:val="0"/>
+                <w:sz w:val="15"/>
+              </w:rPr>
+              <w:t>3.36</w:t>
+            </w:r>
+          </w:p>
+        </w:tc>
+        <w:tc>
+          <w:tcPr>
+            <w:tcW w:type="dxa" w:w="2016"/>
+            <w:vAlign w:val="center"/>
+          </w:tcPr>
+          <w:p>
+            <w:pPr>
+              <w:spacing w:before="20" w:after="20" w:line="247" w:lineRule="auto"/>
+              <w:jc w:val="center"/>
+            </w:pPr>
+            <w:r>
+              <w:rPr>
+                <w:rFonts w:ascii="Times New Roman" w:hAnsi="Times New Roman"/>
+                <w:b w:val="0"/>
+                <w:sz w:val="15"/>
+              </w:rPr>
+              <w:t>24.43</w:t>
+            </w:r>
+          </w:p>
+        </w:tc>
+        <w:tc>
+          <w:tcPr>
+            <w:tcW w:type="dxa" w:w="2016"/>
+            <w:vAlign w:val="center"/>
+          </w:tcPr>
+          <w:p>
+            <w:pPr>
+              <w:spacing w:before="20" w:after="20" w:line="247" w:lineRule="auto"/>
+              <w:jc w:val="center"/>
+            </w:pPr>
+            <w:r>
+              <w:rPr>
+                <w:rFonts w:ascii="Times New Roman" w:hAnsi="Times New Roman"/>
+                <w:b w:val="0"/>
+                <w:sz w:val="15"/>
+              </w:rPr>
+              <w:t>3.50</w:t>
+            </w:r>
+          </w:p>
+        </w:tc>
+        <w:tc>
+          <w:tcPr>
+            <w:tcW w:type="dxa" w:w="2016"/>
+            <w:vAlign w:val="center"/>
+          </w:tcPr>
+          <w:p>
+            <w:pPr>
+              <w:spacing w:before="20" w:after="20" w:line="247" w:lineRule="auto"/>
+              <w:jc w:val="center"/>
+            </w:pPr>
+            <w:r>
+              <w:rPr>
+                <w:rFonts w:ascii="Times New Roman" w:hAnsi="Times New Roman"/>
+                <w:b w:val="0"/>
+                <w:sz w:val="15"/>
+              </w:rPr>
+              <w:t>2.33</w:t>
+            </w:r>
+          </w:p>
+        </w:tc>
+      </w:tr>
+      <w:tr>
+        <w:trPr>
+          <w:cantSplit/>
+        </w:trPr>
+        <w:tc>
+          <w:tcPr>
+            <w:tcW w:type="dxa" w:w="2016"/>
+            <w:vAlign w:val="center"/>
+          </w:tcPr>
+          <w:p>
+            <w:pPr>
+              <w:spacing w:before="20" w:after="20" w:line="247" w:lineRule="auto"/>
+              <w:jc w:val="left"/>
+            </w:pPr>
+            <w:r>
+              <w:rPr>
+                <w:rFonts w:ascii="Times New Roman" w:hAnsi="Times New Roman"/>
+                <w:b w:val="0"/>
+                <w:sz w:val="15"/>
+              </w:rPr>
+              <w:t>Contiguous, phase matched</w:t>
+            </w:r>
+          </w:p>
+        </w:tc>
+        <w:tc>
+          <w:tcPr>
+            <w:tcW w:type="dxa" w:w="2016"/>
+            <w:vAlign w:val="center"/>
+          </w:tcPr>
+          <w:p>
+            <w:pPr>
+              <w:spacing w:before="20" w:after="20" w:line="247" w:lineRule="auto"/>
+              <w:jc w:val="center"/>
+            </w:pPr>
+            <w:r>
+              <w:rPr>
+                <w:rFonts w:ascii="Times New Roman" w:hAnsi="Times New Roman"/>
+                <w:b w:val="0"/>
+                <w:sz w:val="15"/>
+              </w:rPr>
+              <w:t>3.36</w:t>
+            </w:r>
+          </w:p>
+        </w:tc>
+        <w:tc>
+          <w:tcPr>
+            <w:tcW w:type="dxa" w:w="2016"/>
+            <w:vAlign w:val="center"/>
+          </w:tcPr>
+          <w:p>
+            <w:pPr>
+              <w:spacing w:before="20" w:after="20" w:line="247" w:lineRule="auto"/>
+              <w:jc w:val="center"/>
+            </w:pPr>
+            <w:r>
+              <w:rPr>
+                <w:rFonts w:ascii="Times New Roman" w:hAnsi="Times New Roman"/>
+                <w:b w:val="0"/>
+                <w:sz w:val="15"/>
+              </w:rPr>
+              <w:t>24.42</w:t>
+            </w:r>
+          </w:p>
+        </w:tc>
+        <w:tc>
+          <w:tcPr>
+            <w:tcW w:type="dxa" w:w="2016"/>
+            <w:vAlign w:val="center"/>
+          </w:tcPr>
+          <w:p>
+            <w:pPr>
+              <w:spacing w:before="20" w:after="20" w:line="247" w:lineRule="auto"/>
+              <w:jc w:val="center"/>
+            </w:pPr>
+            <w:r>
+              <w:rPr>
+                <w:rFonts w:ascii="Times New Roman" w:hAnsi="Times New Roman"/>
+                <w:b w:val="0"/>
+                <w:sz w:val="15"/>
+              </w:rPr>
+              <w:t>3.36</w:t>
+            </w:r>
+          </w:p>
+        </w:tc>
+        <w:tc>
+          <w:tcPr>
+            <w:tcW w:type="dxa" w:w="2016"/>
+            <w:vAlign w:val="center"/>
+          </w:tcPr>
+          <w:p>
+            <w:pPr>
+              <w:spacing w:before="20" w:after="20" w:line="247" w:lineRule="auto"/>
+              <w:jc w:val="center"/>
+            </w:pPr>
+            <w:r>
+              <w:rPr>
+                <w:rFonts w:ascii="Times New Roman" w:hAnsi="Times New Roman"/>
+                <w:b w:val="0"/>
+                <w:sz w:val="15"/>
+              </w:rPr>
+              <w:t>2.33</w:t>
+            </w:r>
+          </w:p>
+        </w:tc>
+      </w:tr>
+      <w:tr>
+        <w:trPr>
+          <w:cantSplit/>
+        </w:trPr>
+        <w:tc>
+          <w:tcPr>
+            <w:tcW w:type="dxa" w:w="2016"/>
+            <w:vAlign w:val="center"/>
+          </w:tcPr>
+          <w:p>
+            <w:pPr>
+              <w:spacing w:before="20" w:after="20" w:line="247" w:lineRule="auto"/>
+              <w:jc w:val="left"/>
+            </w:pPr>
+            <w:r>
+              <w:rPr>
+                <w:rFonts w:ascii="Times New Roman" w:hAnsi="Times New Roman"/>
+                <w:b w:val="0"/>
+                <w:sz w:val="15"/>
+              </w:rPr>
+              <w:t>Fragmented every 32 pages</w:t>
+            </w:r>
+          </w:p>
+        </w:tc>
+        <w:tc>
+          <w:tcPr>
+            <w:tcW w:type="dxa" w:w="2016"/>
+            <w:vAlign w:val="center"/>
+          </w:tcPr>
+          <w:p>
+            <w:pPr>
+              <w:spacing w:before="20" w:after="20" w:line="247" w:lineRule="auto"/>
+              <w:jc w:val="center"/>
+            </w:pPr>
+            <w:r>
+              <w:rPr>
+                <w:rFonts w:ascii="Times New Roman" w:hAnsi="Times New Roman"/>
+                <w:b w:val="0"/>
+                <w:sz w:val="15"/>
+              </w:rPr>
+              <w:t>27.66</w:t>
+            </w:r>
+          </w:p>
+        </w:tc>
+        <w:tc>
+          <w:tcPr>
+            <w:tcW w:type="dxa" w:w="2016"/>
+            <w:vAlign w:val="center"/>
+          </w:tcPr>
+          <w:p>
+            <w:pPr>
+              <w:spacing w:before="20" w:after="20" w:line="247" w:lineRule="auto"/>
+              <w:jc w:val="center"/>
+            </w:pPr>
+            <w:r>
+              <w:rPr>
+                <w:rFonts w:ascii="Times New Roman" w:hAnsi="Times New Roman"/>
+                <w:b w:val="0"/>
+                <w:sz w:val="15"/>
+              </w:rPr>
+              <w:t>51.50</w:t>
+            </w:r>
+          </w:p>
+        </w:tc>
+        <w:tc>
+          <w:tcPr>
+            <w:tcW w:type="dxa" w:w="2016"/>
+            <w:vAlign w:val="center"/>
+          </w:tcPr>
+          <w:p>
+            <w:pPr>
+              <w:spacing w:before="20" w:after="20" w:line="247" w:lineRule="auto"/>
+              <w:jc w:val="center"/>
+            </w:pPr>
+            <w:r>
+              <w:rPr>
+                <w:rFonts w:ascii="Times New Roman" w:hAnsi="Times New Roman"/>
+                <w:b w:val="0"/>
+                <w:sz w:val="15"/>
+              </w:rPr>
+              <w:t>56.45</w:t>
+            </w:r>
+          </w:p>
+        </w:tc>
+        <w:tc>
+          <w:tcPr>
+            <w:tcW w:type="dxa" w:w="2016"/>
+            <w:vAlign w:val="center"/>
+          </w:tcPr>
+          <w:p>
+            <w:pPr>
+              <w:spacing w:before="20" w:after="20" w:line="247" w:lineRule="auto"/>
+              <w:jc w:val="center"/>
+            </w:pPr>
+            <w:r>
+              <w:rPr>
+                <w:rFonts w:ascii="Times New Roman" w:hAnsi="Times New Roman"/>
+                <w:b w:val="0"/>
+                <w:sz w:val="15"/>
+              </w:rPr>
+              <w:t>31.53</w:t>
+            </w:r>
+          </w:p>
+        </w:tc>
+      </w:tr>
+      <w:tr>
+        <w:trPr>
+          <w:cantSplit/>
+        </w:trPr>
+        <w:tc>
+          <w:tcPr>
+            <w:tcW w:type="dxa" w:w="2016"/>
+            <w:vAlign w:val="center"/>
+          </w:tcPr>
+          <w:p>
+            <w:pPr>
+              <w:spacing w:before="20" w:after="20" w:line="247" w:lineRule="auto"/>
+              <w:jc w:val="left"/>
+            </w:pPr>
+            <w:r>
+              <w:rPr>
+                <w:rFonts w:ascii="Times New Roman" w:hAnsi="Times New Roman"/>
+                <w:b w:val="0"/>
+                <w:sz w:val="15"/>
+              </w:rPr>
+              <w:t>Fragmented + permissions</w:t>
+            </w:r>
+          </w:p>
+        </w:tc>
+        <w:tc>
+          <w:tcPr>
+            <w:tcW w:type="dxa" w:w="2016"/>
+            <w:vAlign w:val="center"/>
+          </w:tcPr>
+          <w:p>
+            <w:pPr>
+              <w:spacing w:before="20" w:after="20" w:line="247" w:lineRule="auto"/>
+              <w:jc w:val="center"/>
+            </w:pPr>
+            <w:r>
+              <w:rPr>
+                <w:rFonts w:ascii="Times New Roman" w:hAnsi="Times New Roman"/>
+                <w:b w:val="0"/>
+                <w:sz w:val="15"/>
+              </w:rPr>
+              <w:t>29.35</w:t>
+            </w:r>
+          </w:p>
+        </w:tc>
+        <w:tc>
+          <w:tcPr>
+            <w:tcW w:type="dxa" w:w="2016"/>
+            <w:vAlign w:val="center"/>
+          </w:tcPr>
+          <w:p>
+            <w:pPr>
+              <w:spacing w:before="20" w:after="20" w:line="247" w:lineRule="auto"/>
+              <w:jc w:val="center"/>
+            </w:pPr>
+            <w:r>
+              <w:rPr>
+                <w:rFonts w:ascii="Times New Roman" w:hAnsi="Times New Roman"/>
+                <w:b w:val="0"/>
+                <w:sz w:val="15"/>
+              </w:rPr>
+              <w:t>50.76</w:t>
+            </w:r>
+          </w:p>
+        </w:tc>
+        <w:tc>
+          <w:tcPr>
+            <w:tcW w:type="dxa" w:w="2016"/>
+            <w:vAlign w:val="center"/>
+          </w:tcPr>
+          <w:p>
+            <w:pPr>
+              <w:spacing w:before="20" w:after="20" w:line="247" w:lineRule="auto"/>
+              <w:jc w:val="center"/>
+            </w:pPr>
+            <w:r>
+              <w:rPr>
+                <w:rFonts w:ascii="Times New Roman" w:hAnsi="Times New Roman"/>
+                <w:b w:val="0"/>
+                <w:sz w:val="15"/>
+              </w:rPr>
+              <w:t>57.32</w:t>
+            </w:r>
+          </w:p>
+        </w:tc>
+        <w:tc>
+          <w:tcPr>
+            <w:tcW w:type="dxa" w:w="2016"/>
+            <w:vAlign w:val="center"/>
+          </w:tcPr>
+          <w:p>
+            <w:pPr>
+              <w:spacing w:before="20" w:after="20" w:line="247" w:lineRule="auto"/>
+              <w:jc w:val="center"/>
+            </w:pPr>
+            <w:r>
+              <w:rPr>
+                <w:rFonts w:ascii="Times New Roman" w:hAnsi="Times New Roman"/>
+                <w:b w:val="0"/>
+                <w:sz w:val="15"/>
+              </w:rPr>
+              <w:t>29.28</w:t>
+            </w:r>
+          </w:p>
+        </w:tc>
+      </w:tr>
+      <w:tr>
+        <w:trPr>
+          <w:cantSplit/>
+        </w:trPr>
+        <w:tc>
+          <w:tcPr>
+            <w:tcW w:type="dxa" w:w="2016"/>
+            <w:vAlign w:val="center"/>
+          </w:tcPr>
+          <w:p>
+            <w:pPr>
+              <w:spacing w:before="20" w:after="20" w:line="247" w:lineRule="auto"/>
+              <w:jc w:val="left"/>
+            </w:pPr>
+            <w:r>
+              <w:rPr>
+                <w:rFonts w:ascii="Times New Roman" w:hAnsi="Times New Roman"/>
+                <w:b w:val="0"/>
+                <w:sz w:val="15"/>
+              </w:rPr>
+              <w:t>Mixed permissions</w:t>
+            </w:r>
+          </w:p>
+        </w:tc>
+        <w:tc>
+          <w:tcPr>
+            <w:tcW w:type="dxa" w:w="2016"/>
+            <w:vAlign w:val="center"/>
+          </w:tcPr>
+          <w:p>
+            <w:pPr>
+              <w:spacing w:before="20" w:after="20" w:line="247" w:lineRule="auto"/>
+              <w:jc w:val="center"/>
+            </w:pPr>
+            <w:r>
+              <w:rPr>
+                <w:rFonts w:ascii="Times New Roman" w:hAnsi="Times New Roman"/>
+                <w:b w:val="0"/>
+                <w:sz w:val="15"/>
+              </w:rPr>
+              <w:t>3.76</w:t>
+            </w:r>
+          </w:p>
+        </w:tc>
+        <w:tc>
+          <w:tcPr>
+            <w:tcW w:type="dxa" w:w="2016"/>
+            <w:vAlign w:val="center"/>
+          </w:tcPr>
+          <w:p>
+            <w:pPr>
+              <w:spacing w:before="20" w:after="20" w:line="247" w:lineRule="auto"/>
+              <w:jc w:val="center"/>
+            </w:pPr>
+            <w:r>
+              <w:rPr>
+                <w:rFonts w:ascii="Times New Roman" w:hAnsi="Times New Roman"/>
+                <w:b w:val="0"/>
+                <w:sz w:val="15"/>
+              </w:rPr>
+              <w:t>24.85</w:t>
+            </w:r>
+          </w:p>
+        </w:tc>
+        <w:tc>
+          <w:tcPr>
+            <w:tcW w:type="dxa" w:w="2016"/>
+            <w:vAlign w:val="center"/>
+          </w:tcPr>
+          <w:p>
+            <w:pPr>
+              <w:spacing w:before="20" w:after="20" w:line="247" w:lineRule="auto"/>
+              <w:jc w:val="center"/>
+            </w:pPr>
+            <w:r>
+              <w:rPr>
+                <w:rFonts w:ascii="Times New Roman" w:hAnsi="Times New Roman"/>
+                <w:b w:val="0"/>
+                <w:sz w:val="15"/>
+              </w:rPr>
+              <w:t>10.30</w:t>
+            </w:r>
+          </w:p>
+        </w:tc>
+        <w:tc>
+          <w:tcPr>
+            <w:tcW w:type="dxa" w:w="2016"/>
+            <w:vAlign w:val="center"/>
+          </w:tcPr>
+          <w:p>
+            <w:pPr>
+              <w:spacing w:before="20" w:after="20" w:line="247" w:lineRule="auto"/>
+              <w:jc w:val="center"/>
+            </w:pPr>
+            <w:r>
+              <w:rPr>
+                <w:rFonts w:ascii="Times New Roman" w:hAnsi="Times New Roman"/>
+                <w:b w:val="0"/>
+                <w:sz w:val="15"/>
+              </w:rPr>
+              <w:t>5.46</w:t>
+            </w:r>
+          </w:p>
+        </w:tc>
+      </w:tr>
+    </w:tbl>
+    <w:p>
+      <w:pPr>
+        <w:pStyle w:val="SmallNote"/>
+      </w:pPr>
+      <w:r>
+        <w:t>Note. Values are descriptive case medians from two independent pilot program executions on a virtualized host. They are not confidence bounds, p-values, hardware translation latencies, or measurements from the user's local CSV.</w:t>
+      </w:r>
+    </w:p>
+    <w:p>
+      <w:pPr/>
+      <w:r>
+        <w:t>The ranked outcome changes by layout. Indexed ranges were faster with contiguous backing (2.33 vs. 3.36 ns/access for BAP); BAP had a lower reported pilot median under 32-page fragmentation (27.66 vs. 31.53 ns/access); and the two were close under combined fragmentation and permission changes (29.35 vs. 29.28 ns/access). BAP generally outpaced a naive global binary search of many records, but such a comparison alone is not adequate evidence of novelty or overall superiority. The indexed-range control is essential because it can exploit the same locality used by BAP parent search.</w:t>
+      </w:r>
+    </w:p>
+    <w:p>
+      <w:pPr>
+        <w:pStyle w:val="Caption"/>
+      </w:pPr>
+      <w:r>
+        <w:t>Table 14. Hypothetical model metadata bytes for v8 compared schemes (same scenario subset).</w:t>
+      </w:r>
+    </w:p>
+    <w:tbl>
+      <w:tblPr>
+        <w:tblStyle w:val="TableGrid"/>
+        <w:tblW w:type="auto" w:w="0"/>
+        <w:jc w:val="center"/>
+        <w:tblLayout w:type="autofit"/>
+        <w:tblLook w:firstColumn="1" w:firstRow="1" w:lastColumn="0" w:lastRow="0" w:noHBand="0" w:noVBand="1" w:val="04A0"/>
+      </w:tblPr>
+      <w:tblGrid>
+        <w:gridCol w:w="2016"/>
+        <w:gridCol w:w="2016"/>
+        <w:gridCol w:w="2016"/>
+        <w:gridCol w:w="2016"/>
+        <w:gridCol w:w="2016"/>
+      </w:tblGrid>
+      <w:tr>
+        <w:trPr>
+          <w:cantSplit/>
+          <w:tblHeader/>
+        </w:trPr>
+        <w:tc>
+          <w:tcPr>
+            <w:tcW w:type="dxa" w:w="2016"/>
+            <w:vAlign w:val="center"/>
+            <w:shd w:fill="DFEAF4"/>
+          </w:tcPr>
+          <w:p>
+            <w:pPr>
+              <w:spacing w:before="20" w:after="20" w:line="247" w:lineRule="auto"/>
+              <w:jc w:val="left"/>
+            </w:pPr>
+            <w:r>
+              <w:rPr>
+                <w:rFonts w:ascii="Times New Roman" w:hAnsi="Times New Roman"/>
+                <w:b/>
+                <w:sz w:val="15"/>
+              </w:rPr>
+              <w:t>Physical / permission layout</w:t>
+            </w:r>
+          </w:p>
+        </w:tc>
+        <w:tc>
+          <w:tcPr>
+            <w:tcW w:type="dxa" w:w="2016"/>
+            <w:vAlign w:val="center"/>
+            <w:shd w:fill="DFEAF4"/>
+          </w:tcPr>
+          <w:p>
+            <w:pPr>
+              <w:spacing w:before="20" w:after="20" w:line="247" w:lineRule="auto"/>
+              <w:jc w:val="center"/>
+            </w:pPr>
+            <w:r>
+              <w:rPr>
+                <w:rFonts w:ascii="Times New Roman" w:hAnsi="Times New Roman"/>
+                <w:b/>
+                <w:sz w:val="15"/>
+              </w:rPr>
+              <w:t>BAP (B)</w:t>
+            </w:r>
+          </w:p>
+        </w:tc>
+        <w:tc>
+          <w:tcPr>
+            <w:tcW w:type="dxa" w:w="2016"/>
+            <w:vAlign w:val="center"/>
+            <w:shd w:fill="DFEAF4"/>
+          </w:tcPr>
+          <w:p>
+            <w:pPr>
+              <w:spacing w:before="20" w:after="20" w:line="247" w:lineRule="auto"/>
+              <w:jc w:val="center"/>
+            </w:pPr>
+            <w:r>
+              <w:rPr>
+                <w:rFonts w:ascii="Times New Roman" w:hAnsi="Times New Roman"/>
+                <w:b/>
+                <w:sz w:val="15"/>
+              </w:rPr>
+              <w:t>Range cap512 (B)</w:t>
+            </w:r>
+          </w:p>
+        </w:tc>
+        <w:tc>
+          <w:tcPr>
+            <w:tcW w:type="dxa" w:w="2016"/>
+            <w:vAlign w:val="center"/>
+            <w:shd w:fill="DFEAF4"/>
+          </w:tcPr>
+          <w:p>
+            <w:pPr>
+              <w:spacing w:before="20" w:after="20" w:line="247" w:lineRule="auto"/>
+              <w:jc w:val="center"/>
+            </w:pPr>
+            <w:r>
+              <w:rPr>
+                <w:rFonts w:ascii="Times New Roman" w:hAnsi="Times New Roman"/>
+                <w:b/>
+                <w:sz w:val="15"/>
+              </w:rPr>
+              <w:t>Range unbounded (B)</w:t>
+            </w:r>
+          </w:p>
+        </w:tc>
+        <w:tc>
+          <w:tcPr>
+            <w:tcW w:type="dxa" w:w="2016"/>
+            <w:vAlign w:val="center"/>
+            <w:shd w:fill="DFEAF4"/>
+          </w:tcPr>
+          <w:p>
+            <w:pPr>
+              <w:spacing w:before="20" w:after="20" w:line="247" w:lineRule="auto"/>
+              <w:jc w:val="center"/>
+            </w:pPr>
+            <w:r>
+              <w:rPr>
+                <w:rFonts w:ascii="Times New Roman" w:hAnsi="Times New Roman"/>
+                <w:b/>
+                <w:sz w:val="15"/>
+              </w:rPr>
+              <w:t>Range indexed (B)</w:t>
+            </w:r>
+          </w:p>
+        </w:tc>
+      </w:tr>
+      <w:tr>
+        <w:trPr>
+          <w:cantSplit/>
+        </w:trPr>
+        <w:tc>
+          <w:tcPr>
+            <w:tcW w:type="dxa" w:w="2016"/>
+            <w:vAlign w:val="center"/>
+          </w:tcPr>
+          <w:p>
+            <w:pPr>
+              <w:spacing w:before="20" w:after="20" w:line="247" w:lineRule="auto"/>
+              <w:jc w:val="left"/>
+            </w:pPr>
+            <w:r>
+              <w:rPr>
+                <w:rFonts w:ascii="Times New Roman" w:hAnsi="Times New Roman"/>
+                <w:b w:val="0"/>
+                <w:sz w:val="15"/>
+              </w:rPr>
+              <w:t>Contiguous</w:t>
+            </w:r>
+          </w:p>
+        </w:tc>
+        <w:tc>
+          <w:tcPr>
+            <w:tcW w:type="dxa" w:w="2016"/>
+            <w:vAlign w:val="center"/>
+          </w:tcPr>
+          <w:p>
+            <w:pPr>
+              <w:spacing w:before="20" w:after="20" w:line="247" w:lineRule="auto"/>
+              <w:jc w:val="center"/>
+            </w:pPr>
+            <w:r>
+              <w:rPr>
+                <w:rFonts w:ascii="Times New Roman" w:hAnsi="Times New Roman"/>
+                <w:b w:val="0"/>
+                <w:sz w:val="15"/>
+              </w:rPr>
+              <w:t>704</w:t>
+            </w:r>
+          </w:p>
+        </w:tc>
+        <w:tc>
+          <w:tcPr>
+            <w:tcW w:type="dxa" w:w="2016"/>
+            <w:vAlign w:val="center"/>
+          </w:tcPr>
+          <w:p>
+            <w:pPr>
+              <w:spacing w:before="20" w:after="20" w:line="247" w:lineRule="auto"/>
+              <w:jc w:val="center"/>
+            </w:pPr>
+            <w:r>
+              <w:rPr>
+                <w:rFonts w:ascii="Times New Roman" w:hAnsi="Times New Roman"/>
+                <w:b w:val="0"/>
+                <w:sz w:val="15"/>
+              </w:rPr>
+              <w:t>512</w:t>
+            </w:r>
+          </w:p>
+        </w:tc>
+        <w:tc>
+          <w:tcPr>
+            <w:tcW w:type="dxa" w:w="2016"/>
+            <w:vAlign w:val="center"/>
+          </w:tcPr>
+          <w:p>
+            <w:pPr>
+              <w:spacing w:before="20" w:after="20" w:line="247" w:lineRule="auto"/>
+              <w:jc w:val="center"/>
+            </w:pPr>
+            <w:r>
+              <w:rPr>
+                <w:rFonts w:ascii="Times New Roman" w:hAnsi="Times New Roman"/>
+                <w:b w:val="0"/>
+                <w:sz w:val="15"/>
+              </w:rPr>
+              <w:t>56</w:t>
+            </w:r>
+          </w:p>
+        </w:tc>
+        <w:tc>
+          <w:tcPr>
+            <w:tcW w:type="dxa" w:w="2016"/>
+            <w:vAlign w:val="center"/>
+          </w:tcPr>
+          <w:p>
+            <w:pPr>
+              <w:spacing w:before="20" w:after="20" w:line="247" w:lineRule="auto"/>
+              <w:jc w:val="center"/>
+            </w:pPr>
+            <w:r>
+              <w:rPr>
+                <w:rFonts w:ascii="Times New Roman" w:hAnsi="Times New Roman"/>
+                <w:b w:val="0"/>
+                <w:sz w:val="15"/>
+              </w:rPr>
+              <w:t>672</w:t>
+            </w:r>
+          </w:p>
+        </w:tc>
+      </w:tr>
+      <w:tr>
+        <w:trPr>
+          <w:cantSplit/>
+        </w:trPr>
+        <w:tc>
+          <w:tcPr>
+            <w:tcW w:type="dxa" w:w="2016"/>
+            <w:vAlign w:val="center"/>
+          </w:tcPr>
+          <w:p>
+            <w:pPr>
+              <w:spacing w:before="20" w:after="20" w:line="247" w:lineRule="auto"/>
+              <w:jc w:val="left"/>
+            </w:pPr>
+            <w:r>
+              <w:rPr>
+                <w:rFonts w:ascii="Times New Roman" w:hAnsi="Times New Roman"/>
+                <w:b w:val="0"/>
+                <w:sz w:val="15"/>
+              </w:rPr>
+              <w:t>Contiguous, phase matched</w:t>
+            </w:r>
+          </w:p>
+        </w:tc>
+        <w:tc>
+          <w:tcPr>
+            <w:tcW w:type="dxa" w:w="2016"/>
+            <w:vAlign w:val="center"/>
+          </w:tcPr>
+          <w:p>
+            <w:pPr>
+              <w:spacing w:before="20" w:after="20" w:line="247" w:lineRule="auto"/>
+              <w:jc w:val="center"/>
+            </w:pPr>
+            <w:r>
+              <w:rPr>
+                <w:rFonts w:ascii="Times New Roman" w:hAnsi="Times New Roman"/>
+                <w:b w:val="0"/>
+                <w:sz w:val="15"/>
+              </w:rPr>
+              <w:t>704</w:t>
+            </w:r>
+          </w:p>
+        </w:tc>
+        <w:tc>
+          <w:tcPr>
+            <w:tcW w:type="dxa" w:w="2016"/>
+            <w:vAlign w:val="center"/>
+          </w:tcPr>
+          <w:p>
+            <w:pPr>
+              <w:spacing w:before="20" w:after="20" w:line="247" w:lineRule="auto"/>
+              <w:jc w:val="center"/>
+            </w:pPr>
+            <w:r>
+              <w:rPr>
+                <w:rFonts w:ascii="Times New Roman" w:hAnsi="Times New Roman"/>
+                <w:b w:val="0"/>
+                <w:sz w:val="15"/>
+              </w:rPr>
+              <w:t>512</w:t>
+            </w:r>
+          </w:p>
+        </w:tc>
+        <w:tc>
+          <w:tcPr>
+            <w:tcW w:type="dxa" w:w="2016"/>
+            <w:vAlign w:val="center"/>
+          </w:tcPr>
+          <w:p>
+            <w:pPr>
+              <w:spacing w:before="20" w:after="20" w:line="247" w:lineRule="auto"/>
+              <w:jc w:val="center"/>
+            </w:pPr>
+            <w:r>
+              <w:rPr>
+                <w:rFonts w:ascii="Times New Roman" w:hAnsi="Times New Roman"/>
+                <w:b w:val="0"/>
+                <w:sz w:val="15"/>
+              </w:rPr>
+              <w:t>56</w:t>
+            </w:r>
+          </w:p>
+        </w:tc>
+        <w:tc>
+          <w:tcPr>
+            <w:tcW w:type="dxa" w:w="2016"/>
+            <w:vAlign w:val="center"/>
+          </w:tcPr>
+          <w:p>
+            <w:pPr>
+              <w:spacing w:before="20" w:after="20" w:line="247" w:lineRule="auto"/>
+              <w:jc w:val="center"/>
+            </w:pPr>
+            <w:r>
+              <w:rPr>
+                <w:rFonts w:ascii="Times New Roman" w:hAnsi="Times New Roman"/>
+                <w:b w:val="0"/>
+                <w:sz w:val="15"/>
+              </w:rPr>
+              <w:t>672</w:t>
+            </w:r>
+          </w:p>
+        </w:tc>
+      </w:tr>
+      <w:tr>
+        <w:trPr>
+          <w:cantSplit/>
+        </w:trPr>
+        <w:tc>
+          <w:tcPr>
+            <w:tcW w:type="dxa" w:w="2016"/>
+            <w:vAlign w:val="center"/>
+          </w:tcPr>
+          <w:p>
+            <w:pPr>
+              <w:spacing w:before="20" w:after="20" w:line="247" w:lineRule="auto"/>
+              <w:jc w:val="left"/>
+            </w:pPr>
+            <w:r>
+              <w:rPr>
+                <w:rFonts w:ascii="Times New Roman" w:hAnsi="Times New Roman"/>
+                <w:b w:val="0"/>
+                <w:sz w:val="15"/>
+              </w:rPr>
+              <w:t>Fragmented every 32 pages</w:t>
+            </w:r>
+          </w:p>
+        </w:tc>
+        <w:tc>
+          <w:tcPr>
+            <w:tcW w:type="dxa" w:w="2016"/>
+            <w:vAlign w:val="center"/>
+          </w:tcPr>
+          <w:p>
+            <w:pPr>
+              <w:spacing w:before="20" w:after="20" w:line="247" w:lineRule="auto"/>
+              <w:jc w:val="center"/>
+            </w:pPr>
+            <w:r>
+              <w:rPr>
+                <w:rFonts w:ascii="Times New Roman" w:hAnsi="Times New Roman"/>
+                <w:b w:val="0"/>
+                <w:sz w:val="15"/>
+              </w:rPr>
+              <w:t>7,712</w:t>
+            </w:r>
+          </w:p>
+        </w:tc>
+        <w:tc>
+          <w:tcPr>
+            <w:tcW w:type="dxa" w:w="2016"/>
+            <w:vAlign w:val="center"/>
+          </w:tcPr>
+          <w:p>
+            <w:pPr>
+              <w:spacing w:before="20" w:after="20" w:line="247" w:lineRule="auto"/>
+              <w:jc w:val="center"/>
+            </w:pPr>
+            <w:r>
+              <w:rPr>
+                <w:rFonts w:ascii="Times New Roman" w:hAnsi="Times New Roman"/>
+                <w:b w:val="0"/>
+                <w:sz w:val="15"/>
+              </w:rPr>
+              <w:t>7,544</w:t>
+            </w:r>
+          </w:p>
+        </w:tc>
+        <w:tc>
+          <w:tcPr>
+            <w:tcW w:type="dxa" w:w="2016"/>
+            <w:vAlign w:val="center"/>
+          </w:tcPr>
+          <w:p>
+            <w:pPr>
+              <w:spacing w:before="20" w:after="20" w:line="247" w:lineRule="auto"/>
+              <w:jc w:val="center"/>
+            </w:pPr>
+            <w:r>
+              <w:rPr>
+                <w:rFonts w:ascii="Times New Roman" w:hAnsi="Times New Roman"/>
+                <w:b w:val="0"/>
+                <w:sz w:val="15"/>
+              </w:rPr>
+              <w:t>7,544</w:t>
+            </w:r>
+          </w:p>
+        </w:tc>
+        <w:tc>
+          <w:tcPr>
+            <w:tcW w:type="dxa" w:w="2016"/>
+            <w:vAlign w:val="center"/>
+          </w:tcPr>
+          <w:p>
+            <w:pPr>
+              <w:spacing w:before="20" w:after="20" w:line="247" w:lineRule="auto"/>
+              <w:jc w:val="center"/>
+            </w:pPr>
+            <w:r>
+              <w:rPr>
+                <w:rFonts w:ascii="Times New Roman" w:hAnsi="Times New Roman"/>
+                <w:b w:val="0"/>
+                <w:sz w:val="15"/>
+              </w:rPr>
+              <w:t>7,704</w:t>
+            </w:r>
+          </w:p>
+        </w:tc>
+      </w:tr>
+      <w:tr>
+        <w:trPr>
+          <w:cantSplit/>
+        </w:trPr>
+        <w:tc>
+          <w:tcPr>
+            <w:tcW w:type="dxa" w:w="2016"/>
+            <w:vAlign w:val="center"/>
+          </w:tcPr>
+          <w:p>
+            <w:pPr>
+              <w:spacing w:before="20" w:after="20" w:line="247" w:lineRule="auto"/>
+              <w:jc w:val="left"/>
+            </w:pPr>
+            <w:r>
+              <w:rPr>
+                <w:rFonts w:ascii="Times New Roman" w:hAnsi="Times New Roman"/>
+                <w:b w:val="0"/>
+                <w:sz w:val="15"/>
+              </w:rPr>
+              <w:t>Fragmented + permissions</w:t>
+            </w:r>
+          </w:p>
+        </w:tc>
+        <w:tc>
+          <w:tcPr>
+            <w:tcW w:type="dxa" w:w="2016"/>
+            <w:vAlign w:val="center"/>
+          </w:tcPr>
+          <w:p>
+            <w:pPr>
+              <w:spacing w:before="20" w:after="20" w:line="247" w:lineRule="auto"/>
+              <w:jc w:val="center"/>
+            </w:pPr>
+            <w:r>
+              <w:rPr>
+                <w:rFonts w:ascii="Times New Roman" w:hAnsi="Times New Roman"/>
+                <w:b w:val="0"/>
+                <w:sz w:val="15"/>
+              </w:rPr>
+              <w:t>7,760</w:t>
+            </w:r>
+          </w:p>
+        </w:tc>
+        <w:tc>
+          <w:tcPr>
+            <w:tcW w:type="dxa" w:w="2016"/>
+            <w:vAlign w:val="center"/>
+          </w:tcPr>
+          <w:p>
+            <w:pPr>
+              <w:spacing w:before="20" w:after="20" w:line="247" w:lineRule="auto"/>
+              <w:jc w:val="center"/>
+            </w:pPr>
+            <w:r>
+              <w:rPr>
+                <w:rFonts w:ascii="Times New Roman" w:hAnsi="Times New Roman"/>
+                <w:b w:val="0"/>
+                <w:sz w:val="15"/>
+              </w:rPr>
+              <w:t>7,592</w:t>
+            </w:r>
+          </w:p>
+        </w:tc>
+        <w:tc>
+          <w:tcPr>
+            <w:tcW w:type="dxa" w:w="2016"/>
+            <w:vAlign w:val="center"/>
+          </w:tcPr>
+          <w:p>
+            <w:pPr>
+              <w:spacing w:before="20" w:after="20" w:line="247" w:lineRule="auto"/>
+              <w:jc w:val="center"/>
+            </w:pPr>
+            <w:r>
+              <w:rPr>
+                <w:rFonts w:ascii="Times New Roman" w:hAnsi="Times New Roman"/>
+                <w:b w:val="0"/>
+                <w:sz w:val="15"/>
+              </w:rPr>
+              <w:t>7,592</w:t>
+            </w:r>
+          </w:p>
+        </w:tc>
+        <w:tc>
+          <w:tcPr>
+            <w:tcW w:type="dxa" w:w="2016"/>
+            <w:vAlign w:val="center"/>
+          </w:tcPr>
+          <w:p>
+            <w:pPr>
+              <w:spacing w:before="20" w:after="20" w:line="247" w:lineRule="auto"/>
+              <w:jc w:val="center"/>
+            </w:pPr>
+            <w:r>
+              <w:rPr>
+                <w:rFonts w:ascii="Times New Roman" w:hAnsi="Times New Roman"/>
+                <w:b w:val="0"/>
+                <w:sz w:val="15"/>
+              </w:rPr>
+              <w:t>7,752</w:t>
+            </w:r>
+          </w:p>
+        </w:tc>
+      </w:tr>
+      <w:tr>
+        <w:trPr>
+          <w:cantSplit/>
+        </w:trPr>
+        <w:tc>
+          <w:tcPr>
+            <w:tcW w:type="dxa" w:w="2016"/>
+            <w:vAlign w:val="center"/>
+          </w:tcPr>
+          <w:p>
+            <w:pPr>
+              <w:spacing w:before="20" w:after="20" w:line="247" w:lineRule="auto"/>
+              <w:jc w:val="left"/>
+            </w:pPr>
+            <w:r>
+              <w:rPr>
+                <w:rFonts w:ascii="Times New Roman" w:hAnsi="Times New Roman"/>
+                <w:b w:val="0"/>
+                <w:sz w:val="15"/>
+              </w:rPr>
+              <w:t>Mixed permissions</w:t>
+            </w:r>
+          </w:p>
+        </w:tc>
+        <w:tc>
+          <w:tcPr>
+            <w:tcW w:type="dxa" w:w="2016"/>
+            <w:vAlign w:val="center"/>
+          </w:tcPr>
+          <w:p>
+            <w:pPr>
+              <w:spacing w:before="20" w:after="20" w:line="247" w:lineRule="auto"/>
+              <w:jc w:val="center"/>
+            </w:pPr>
+            <w:r>
+              <w:rPr>
+                <w:rFonts w:ascii="Times New Roman" w:hAnsi="Times New Roman"/>
+                <w:b w:val="0"/>
+                <w:sz w:val="15"/>
+              </w:rPr>
+              <w:t>752</w:t>
+            </w:r>
+          </w:p>
+        </w:tc>
+        <w:tc>
+          <w:tcPr>
+            <w:tcW w:type="dxa" w:w="2016"/>
+            <w:vAlign w:val="center"/>
+          </w:tcPr>
+          <w:p>
+            <w:pPr>
+              <w:spacing w:before="20" w:after="20" w:line="247" w:lineRule="auto"/>
+              <w:jc w:val="center"/>
+            </w:pPr>
+            <w:r>
+              <w:rPr>
+                <w:rFonts w:ascii="Times New Roman" w:hAnsi="Times New Roman"/>
+                <w:b w:val="0"/>
+                <w:sz w:val="15"/>
+              </w:rPr>
+              <w:t>536</w:t>
+            </w:r>
+          </w:p>
+        </w:tc>
+        <w:tc>
+          <w:tcPr>
+            <w:tcW w:type="dxa" w:w="2016"/>
+            <w:vAlign w:val="center"/>
+          </w:tcPr>
+          <w:p>
+            <w:pPr>
+              <w:spacing w:before="20" w:after="20" w:line="247" w:lineRule="auto"/>
+              <w:jc w:val="center"/>
+            </w:pPr>
+            <w:r>
+              <w:rPr>
+                <w:rFonts w:ascii="Times New Roman" w:hAnsi="Times New Roman"/>
+                <w:b w:val="0"/>
+                <w:sz w:val="15"/>
+              </w:rPr>
+              <w:t>104</w:t>
+            </w:r>
+          </w:p>
+        </w:tc>
+        <w:tc>
+          <w:tcPr>
+            <w:tcW w:type="dxa" w:w="2016"/>
+            <w:vAlign w:val="center"/>
+          </w:tcPr>
+          <w:p>
+            <w:pPr>
+              <w:spacing w:before="20" w:after="20" w:line="247" w:lineRule="auto"/>
+              <w:jc w:val="center"/>
+            </w:pPr>
+            <w:r>
+              <w:rPr>
+                <w:rFonts w:ascii="Times New Roman" w:hAnsi="Times New Roman"/>
+                <w:b w:val="0"/>
+                <w:sz w:val="15"/>
+              </w:rPr>
+              <w:t>696</w:t>
+            </w:r>
+          </w:p>
+        </w:tc>
+      </w:tr>
+    </w:tbl>
+    <w:p>
+      <w:pPr>
+        <w:pStyle w:val="SmallNote"/>
+      </w:pPr>
+      <w:r>
+        <w:t>Note. Bytes are assumed packed representation sizes, not measured process RSS, allocator footprint, CPU-cache traffic, or actual page-table memory. The indexed control adds an 8-byte slot per 512-page bucket.</w:t>
+      </w:r>
+    </w:p>
+    <w:p>
+      <w:pPr/>
+      <w:r>
+        <w:t>The modeled storage cost does not favor BAP in this illustrative subset. For contiguous backing it requires 704 bytes against 672 for indexed ranges, 512 for globally searched capped ranges and 56 for unbounded ranges; with 32-page fragmentation the BAP/indexed totals are 7,712/7,704 bytes. The pilot therefore offers no evidence that BAP is more compact than a comparable indexed contiguous-range organization.</w:t>
+      </w:r>
+    </w:p>
+    <w:p>
+      <w:pPr/>
+      <w:r>
+        <w:t>Repeatability is not yet adequate for publication-grade performance claims. The research note reports a roughly 24% 95th-percentile absolute relative change across the two pilot runs for BAP and indexed ranges. No hardware counters or confidence intervals from controlled independent physical-host trials were collected. Results should be kept explicitly exploratory until replicated under pinned-CPU conditions and compared using multiple independent processes and traces.</w:t>
+      </w:r>
+    </w:p>
+    <w:p>
+      <w:pPr>
+        <w:pStyle w:val="Heading2"/>
+        <w:keepNext/>
+      </w:pPr>
+      <w:r>
+        <w:t>7.8.1 Independent local validation status</w:t>
+      </w:r>
+    </w:p>
+    <w:p>
+      <w:pPr/>
+      <w:r>
+        <w:t>A separate user-executed build of lookup_benchmark_v8 completed with the exact console summary "PASS: validated every address and permission for all layouts. 540 timing rows; checksum=176" when run with --out results_v8/local_run.csv --queries 4096 --repeats 5. This establishes that the local run completed its implemented validation and wrote the expected number of timing rows. The checksum is a program diagnostic rather than a cryptographic output signature. Because the local_run.csv file, full machine details and repeated execution results have not been supplied for inspection, no local latency estimate, reproducibility statistic or comparison to the pilot host is asserted here.</w:t>
+      </w:r>
+    </w:p>
+    <w:p>
+      <w:pPr>
         <w:pStyle w:val="Heading1"/>
       </w:pPr>
       <w:r>
@@ -8564,6 +10346,14 @@
     </w:p>
     <w:p>
       <w:pPr>
+        <w:pStyle w:val="ListBullet"/>
+      </w:pPr>
+      <w:r>
+        <w:t>The v8 C++ pilot measures software-record lookup time and supplies a competitive indexed generic-range control. Its rankings differ by layout, and its modeled storage bytes remain no better for BAP in the examples reported; this is not a universal speedup or storage benefit.</w:t>
+      </w:r>
+    </w:p>
+    <w:p>
+      <w:pPr>
         <w:pStyle w:val="Heading2"/>
       </w:pPr>
       <w:r>
@@ -8620,6 +10410,14 @@
     </w:p>
     <w:p>
       <w:pPr>
+        <w:pStyle w:val="ListBullet"/>
+      </w:pPr>
+      <w:r>
+        <w:t>v8 local command completion confirms the instrumented semantic and 540-row test gate but does not by itself establish a stable or statistically significant latency advantage; the local CSV has not been analyzed.</w:t>
+      </w:r>
+    </w:p>
+    <w:p>
+      <w:pPr>
         <w:pStyle w:val="Heading2"/>
       </w:pPr>
       <w:r>
@@ -8628,7 +10426,7 @@
     </w:p>
     <w:p>
       <w:r>
-        <w:t>The v6 reference semantics establish translation correctness, while v7 rules out a metadata-byte win under the declared compact layout and identifies a narrower potential benefit in child-list key comparisons. A defensible next experiment (v8) must define and measure the entire lookup interface for BAP and a competitive generic-range index: region search, parent/range directory bytes, dependent memory accesses, cache-line touches, split/merge updates and protection changes under identical traces. Any architectural TLB claim would further need a specified hardware integration and trace-driven TLB model. Alternatively, the work should be framed explicitly as a logical chunk-selection method.</w:t>
+        <w:t>v6 established translation semantics in a controlled model, v7 found no metadata-space benefit under its packed layout, and the v8 native-code pilot revealed workload-dependent software lookup rankings once an indexed-range comparator was included. The most defensible next stage is a controlled non-virtualized replication that captures independent process runs, compiler/CPU configuration and confidence intervals, followed by update/invalidation costs and genuine access traces. Only after the software-level cost balance is established should a hardware/TLB integration proposal be evaluated. If BAP cannot exceed a comparably indexed range representation, the contribution should be narrowed to its mathematical chunk-selection rule and its specific operational tradeoffs.</w:t>
       </w:r>
     </w:p>
     <w:p>
@@ -8701,6 +10499,22 @@
       </w:pPr>
       <w:r>
         <w:t>v7 byte layout is hypothetical: fixed 32/24/8-byte records omit real pointer and allocator costs, global region indexes, address-width constraints and cache placement. Comparisons do not measure CPU cycles, page walks, or TLB operations; v7 does not include a kernel page-table byte baseline.</w:t>
+      </w:r>
+    </w:p>
+    <w:p>
+      <w:pPr>
+        <w:pStyle w:val="ListBullet"/>
+      </w:pPr>
+      <w:r>
+        <w:t>v8 is a preliminary C++20 software metadata-search microbenchmark. Host virtualization and CPU frequency, cache state, allocation layout, compiler optimizations, and process scheduling may influence nanosecond-scale timings; neither CPU performance counters nor stable non-virtualized runs have yet been reported. The pilot excludes region discovery, dynamic map/protect/unmap/split/merge operations, TLB and page walks.</w:t>
+      </w:r>
+    </w:p>
+    <w:p>
+      <w:pPr>
+        <w:pStyle w:val="ListBullet"/>
+      </w:pPr>
+      <w:r>
+        <w:t>The user-provided local execution screen shows successful semantic validation and 540 rows, but does not contain per-case measurements or full host configuration. Its results cannot be combined with the supplied virtualized pilot or used to assert cross-machine reproducibility until its output CSV is inspected.</w:t>
       </w:r>
     </w:p>
     <w:p>
@@ -8787,6 +10601,21 @@
     </w:p>
     <w:p>
       <w:pPr>
+        <w:pStyle w:val="Heading3"/>
+        <w:keepNext/>
+      </w:pPr>
+      <w:r>
+        <w:t>10.5.1 Relationship to indexed-range and range-translation work</w:t>
+      </w:r>
+    </w:p>
+    <w:p>
+      <w:pPr/>
+      <w:r>
+        <w:t>v8 adds an indexed generic-range baseline to avoid attributing a speed benefit solely to BAP when bucketing can also reduce a global binary-search workload. This is a comparison with a modeled software representation, not an implementation or replication of published Range TLB or Redundant Memory Mappings (RMM) hardware. A rigorous originality assessment must compare full mechanism and costs against such prior range-translation schemes as well as against native paging.</w:t>
+      </w:r>
+    </w:p>
+    <w:p>
+      <w:pPr>
         <w:pStyle w:val="Heading2"/>
       </w:pPr>
       <w:r>
@@ -8813,12 +10642,12 @@
     </w:p>
     <w:p>
       <w:r>
-        <w:t>Simulators v2–v4 reported logical mapping counts and synthetic chunk-activation tradeoffs. The v5 audit exposed native leaf-size and alignment prerequisites. The v6 reference model verified PFN translation and protection across 45 deterministic scenarios, but generic ranges often needed fewer records. v7 then quantified an assumed compact metadata layout and binary-search keys across 540 scenario/trace rows. BAP used no fewer modeled bytes than generic ranges: for a 10,000-page contiguous region, 704 bytes compared with 512 and 56. On a fragmented region BAP required fewer child-list key comparisons (4.039 versus 8.377), but the comparison excludes its additional parent lookup, arithmetic and memory operations.</w:t>
-      </w:r>
-    </w:p>
-    <w:p>
-      <w:r>
-        <w:t>Therefore, the evidence supports BAP as a correct logical organization and a candidate search scheme, not a demonstrated reduction in metadata memory or translation time. The next stage should compare complete, equally specified lookup implementations, including update and cache costs, before proposing TLB or runtime gains. If that work finds no advantage, the contribution should remain limited to theoretical decomposition and lookup correctness.</w:t>
+        <w:t>Versions v2-v4 characterized logical chunk counts and synthetic chunk activation. v5 exposed native leaf-size and alignment prerequisites, v6 verified reference physical-frame translation and protection across 45 layouts, and v7 recorded 540 modeled-byte and search-key comparison rows. In v7, BAP used no fewer estimated metadata bytes than generic ranges. The v8 C++20 pilot moves from comparison counts to software lookup timing with an explicit indexed-range control. On the virtualized pilot host, BAP traded places with indexed ranges depending on physical fragmentation and permissions, while generally retaining a slightly larger modeled metadata footprint. An independent user run passed address/protection checks and produced 540 rows, but its actual measurement CSV was not examined.</w:t>
+      </w:r>
+    </w:p>
+    <w:p>
+      <w:r>
+        <w:t>Taken together, the experiments support a correct logical chunk-selection and software translation model with an exploratory, workload-dependent lookup tradeoff. They do not establish a robust speedup, TLB advantage, lower kernel-memory footprint or hardware deployability. Publication-grade evaluation requires a physically controlled replication with uncertainty estimates, realistic access/update traces, fair cache/index costs and a clear comparison to existing range-translation designs.</w:t>
       </w:r>
     </w:p>
     <w:p>
@@ -8925,6 +10754,12 @@
       </w:r>
     </w:p>
     <w:p>
+      <w:pPr/>
+      <w:r>
+        <w:t>[11] BAP v8 pilot artifacts: lookup_benchmark_v8.cpp, results_v8/lookup_latency_v8.csv, results_v8/replication_b.csv, results_v8/summary_s10000_start1_v8.csv and BAP_v8_Pilot_Research_Note.md (pilot native-code software metadata-lookup timing, not journal-ready data).</w:t>
+      </w:r>
+    </w:p>
+    <w:p>
       <w:pPr>
         <w:pStyle w:val="Heading1"/>
       </w:pPr>
@@ -8934,7 +10769,7 @@
     </w:p>
     <w:p>
       <w:r>
-        <w:t>The archived v2–v4 simulation results are reproduced by their original scripts; v5 has 72 virtual-eligibility cases, v6 has 45 physical-layout/permission cases, and v7 has 540 synthetic scenario/trace rows (1,024 address lookups per row, seeds 1–3). v7 requires metadata_lookup_v7.py beside translation_v6.py and feasibility_v5.py and uses Python 3.10+ and the standard library. The BAP parent-index arithmetic was also checked against explicit parent lists over limited-size regions. Preserve the exact scripts, parameter flags, hashes, revision, interpreter version, and generated CSV checksums for review. The older v3 workload-hash seed issue must be fixed and rerun before treating those results as cross-process reproducible.</w:t>
+        <w:t>The archived v2-v4 experiments use their original scripts. v5 documents 72 virtual-eligibility cases; v6 verifies 45 translation cases; v7 reports 540 modeled-byte and key-comparison cases with 1,024 queries per row. v8 adds 540 C++20 software lookup timing cases per program execution under its default 4,096 queries and five repeated passes, across three seeds; two separate pilot executions are archived. The v3 Python process-randomized hash seed remains a reproducibility limitation. The user ran v8 locally and obtained the PASS message and 540-row summary, but the per-case CSV is not available in this manuscript revision. Preserve original compiler flags, full hardware configuration, exact result CSVs and code revision before publication.</w:t>
       </w:r>
     </w:p>
     <w:tbl>
@@ -8959,7 +10794,7 @@
             <w:r>
               <w:rPr>
                 <w:rFonts w:ascii="Consolas" w:hAnsi="Consolas"/>
-                <w:sz w:val="17"/>
+                <w:sz w:val="15"/>
               </w:rPr>
               <w:t>python simulator_v2.py --validate --tlb-entries 64</w:t>
               <w:br/>
@@ -8972,6 +10807,10 @@
               <w:t>python translation_v6.py --validate --out results_v6/translation_semantics_v6.csv</w:t>
               <w:br/>
               <w:t>python metadata_lookup_v7.py --validate --out results_v7/metadata_lookup_v7.csv</w:t>
+              <w:br/>
+              <w:t>g++ -O3 -std=c++20 -Wall -Wextra -pedantic lookup_benchmark_v8.cpp -o lookup_benchmark_v8</w:t>
+              <w:br/>
+              <w:t>./lookup_benchmark_v8 --out results_v8/local_run.csv --queries 4096 --repeats 5</w:t>
             </w:r>
           </w:p>
         </w:tc>
@@ -9112,8 +10951,48 @@
       </w:r>
     </w:p>
     <w:p>
-      <w:r>
-        <w:t>The v5 and v6 code and associated CSV outputs have been incorporated into the project workflow. The v7 code and CSV should be committed at a fixed revision before submission; refer to the repository only for files that are actually available there. Reproduce the results with matching Python versions, deterministic seeds and output checksums. None of these artifacts provides measurements on a hardware TLB or page walker.</w:t>
+      <w:pPr>
+        <w:pStyle w:val="ListBullet"/>
+      </w:pPr>
+      <w:r>
+        <w:t>lookup_benchmark_v8.cpp</w:t>
+      </w:r>
+    </w:p>
+    <w:p>
+      <w:pPr>
+        <w:pStyle w:val="ListBullet"/>
+      </w:pPr>
+      <w:r>
+        <w:t>results_v8/lookup_latency_v8.csv</w:t>
+      </w:r>
+    </w:p>
+    <w:p>
+      <w:pPr>
+        <w:pStyle w:val="ListBullet"/>
+      </w:pPr>
+      <w:r>
+        <w:t>results_v8/replication_b.csv</w:t>
+      </w:r>
+    </w:p>
+    <w:p>
+      <w:pPr>
+        <w:pStyle w:val="ListBullet"/>
+      </w:pPr>
+      <w:r>
+        <w:t>results_v8/summary_s10000_start1_v8.csv</w:t>
+      </w:r>
+    </w:p>
+    <w:p>
+      <w:pPr>
+        <w:pStyle w:val="ListBullet"/>
+      </w:pPr>
+      <w:r>
+        <w:t>results_v8/local_run.csv (generated locally; not supplied for analysis)</w:t>
+      </w:r>
+    </w:p>
+    <w:p>
+      <w:r>
+        <w:t>The project repository has v7 code/results and the v7 Word/PDF manuscript at the revision reviewed. The v8 source and pilot outputs should be committed under their actual filenames and code revision before citing a public archive; the local_run.csv must be retained and analyzed separately from the virtualized pilot. The PASS line by itself is a correctness/execution check, not performance evidence.</w:t>
       </w:r>
     </w:p>
     <w:sectPr>

</xml_diff>